<commit_message>
Rama 01 con gradle run en la guía de prerrequisitos y el README de main
La clase 1 ya no tiene pruebas JUnit: la prueba final de la guía usa gradle run en la
rama 01 con su salida real recortada, y el README explica qué comando usa cada rama.

Co-Authored-By: Claude Opus 5 (1M context) <noreply@anthropic.com>
Claude-Session: https://claude.ai/code/session_01L2JuF1iG72koPJkmuRWSzm
</commit_message>
<xml_diff>
--- a/material-de-apoyo/Prerrequisitos_Instalacion_Entorno_Windows.docx
+++ b/material-de-apoyo/Prerrequisitos_Instalacion_Entorno_Windows.docx
@@ -518,7 +518,7 @@
                 <w:b w:val="0"/>
                 <w:sz w:val="20"/>
               </w:rPr>
-              <w:t>Descarga las librerías del proyecto, compila y ejecuta las pruebas con un solo comando (</w:t>
+              <w:t>Compila y ejecuta los proyectos (</w:t>
             </w:r>
             <w:r>
               <w:rPr>
@@ -526,14 +526,14 @@
                 <w:color w:val="003D7A"/>
                 <w:sz w:val="20"/>
               </w:rPr>
-              <w:t>gradle test</w:t>
+              <w:t>gradle run</w:t>
             </w:r>
             <w:r>
               <w:rPr>
                 <w:b w:val="0"/>
                 <w:sz w:val="20"/>
               </w:rPr>
-              <w:t>).</w:t>
+              <w:t xml:space="preserve"> en la clase 1). Desde la clase 2 descarga Serenity, Cucumber, Playwright y JUnit.</w:t>
             </w:r>
           </w:p>
         </w:tc>
@@ -1855,14 +1855,14 @@
         <w:rPr>
           <w:b w:val="0"/>
         </w:rPr>
-        <w:t xml:space="preserve">Gradle es la herramienta que construye el proyecto: descarga las librerías que necesitamos (JUnit, Serenity, Cucumber, Playwright), compila el código y ejecuta las pruebas. En el semillero lo usamos instalado en tu equipo, así que siempre vas a escribir </w:t>
+        <w:t xml:space="preserve">Gradle es la herramienta que construye el proyecto: compila el código, lo ejecuta y, desde la clase 2, descarga las librerías que necesitamos (Serenity, Cucumber, Playwright, JUnit) y corre las pruebas. En el semillero lo usamos instalado en tu equipo, así que siempre vas a escribir </w:t>
       </w:r>
       <w:r>
         <w:rPr>
           <w:rFonts w:ascii="Consolas" w:hAnsi="Consolas" w:eastAsia="Consolas"/>
           <w:color w:val="003D7A"/>
         </w:rPr>
-        <w:t>gradle test</w:t>
+        <w:t>gradle run</w:t>
       </w:r>
       <w:r>
         <w:rPr>
@@ -1875,7 +1875,7 @@
           <w:rFonts w:ascii="Consolas" w:hAnsi="Consolas" w:eastAsia="Consolas"/>
           <w:color w:val="003D7A"/>
         </w:rPr>
-        <w:t>gradle run</w:t>
+        <w:t>gradle test</w:t>
       </w:r>
       <w:r>
         <w:rPr>
@@ -6028,7 +6028,7 @@
                 <w:color w:val="003D7A"/>
                 <w:sz w:val="20"/>
               </w:rPr>
-              <w:t>gradle test</w:t>
+              <w:t>gradle run</w:t>
             </w:r>
           </w:p>
         </w:tc>
@@ -6049,7 +6049,7 @@
                 <w:b w:val="0"/>
                 <w:sz w:val="20"/>
               </w:rPr>
-              <w:t>Una lista de pruebas con PASSED y al final BUILD SUCCESSFUL</w:t>
+              <w:t>Los títulos de las secciones de ejemplos y al final BUILD SUCCESSFUL</w:t>
             </w:r>
           </w:p>
         </w:tc>
@@ -6068,20 +6068,20 @@
         <w:rPr>
           <w:b w:val="0"/>
         </w:rPr>
-        <w:t xml:space="preserve">La primera vez que corres </w:t>
+        <w:t xml:space="preserve">La rama 01 es Java puro, sin pruebas automatizadas: </w:t>
       </w:r>
       <w:r>
         <w:rPr>
           <w:rFonts w:ascii="Consolas" w:hAnsi="Consolas" w:eastAsia="Consolas"/>
           <w:color w:val="003D7A"/>
         </w:rPr>
-        <w:t>gradle test</w:t>
+        <w:t>gradle run</w:t>
       </w:r>
       <w:r>
         <w:rPr>
           <w:b w:val="0"/>
         </w:rPr>
-        <w:t xml:space="preserve"> en la rama 01 tarda un poco más porque Gradle descarga JUnit. En nuestra prueba la salida terminó así:</w:t>
+        <w:t xml:space="preserve"> compila el proyecto y muestra en pantalla los ejemplos de la clase, cada uno con un título entre signos igual (del 1. Variables y tipos de datos al 6. Herencia y polimorfismo). No descarga librerías, así que tarda pocos segundos. En nuestra prueba terminó así (recortada):</w:t>
       </w:r>
     </w:p>
     <w:tbl>
@@ -6120,7 +6120,91 @@
                 <w:color w:val="1F2933"/>
                 <w:sz w:val="19"/>
               </w:rPr>
-              <w:t>CuentaBancariaTest &gt; Retirar con saldo suficiente descuenta el valor PASSED</w:t>
+              <w:t>&gt; Task :run</w:t>
+            </w:r>
+          </w:p>
+          <w:p>
+            <w:pPr>
+              <w:keepNext/>
+              <w:spacing w:after="0" w:line="240" w:lineRule="auto"/>
+            </w:pPr>
+            <w:r>
+              <w:rPr>
+                <w:rFonts w:ascii="Consolas" w:hAnsi="Consolas" w:eastAsia="Consolas"/>
+                <w:color w:val="1F2933"/>
+                <w:sz w:val="19"/>
+              </w:rPr>
+              <w:t>===== 1. Variables y tipos de datos =====</w:t>
+            </w:r>
+          </w:p>
+          <w:p>
+            <w:pPr>
+              <w:keepNext/>
+              <w:spacing w:after="0" w:line="240" w:lineRule="auto"/>
+            </w:pPr>
+            <w:r>
+              <w:rPr>
+                <w:rFonts w:ascii="Consolas" w:hAnsi="Consolas" w:eastAsia="Consolas"/>
+                <w:color w:val="1F2933"/>
+                <w:sz w:val="19"/>
+              </w:rPr>
+              <w:t>int (numero entero): 20</w:t>
+            </w:r>
+          </w:p>
+          <w:p>
+            <w:pPr>
+              <w:keepNext/>
+              <w:spacing w:after="0" w:line="240" w:lineRule="auto"/>
+            </w:pPr>
+            <w:r>
+              <w:rPr>
+                <w:rFonts w:ascii="Consolas" w:hAnsi="Consolas" w:eastAsia="Consolas"/>
+                <w:color w:val="1F2933"/>
+                <w:sz w:val="19"/>
+              </w:rPr>
+              <w:t>...</w:t>
+            </w:r>
+          </w:p>
+          <w:p>
+            <w:pPr>
+              <w:keepNext/>
+              <w:spacing w:after="0" w:line="240" w:lineRule="auto"/>
+            </w:pPr>
+            <w:r>
+              <w:rPr>
+                <w:rFonts w:ascii="Consolas" w:hAnsi="Consolas" w:eastAsia="Consolas"/>
+                <w:color w:val="1F2933"/>
+                <w:sz w:val="19"/>
+              </w:rPr>
+              <w:t>===== 6. Herencia y polimorfismo =====</w:t>
+            </w:r>
+          </w:p>
+          <w:p>
+            <w:pPr>
+              <w:keepNext/>
+              <w:spacing w:after="0" w:line="240" w:lineRule="auto"/>
+            </w:pPr>
+            <w:r>
+              <w:rPr>
+                <w:rFonts w:ascii="Consolas" w:hAnsi="Consolas" w:eastAsia="Consolas"/>
+                <w:color w:val="1F2933"/>
+                <w:sz w:val="19"/>
+              </w:rPr>
+              <w:t>Firulais dice Guau</w:t>
+            </w:r>
+          </w:p>
+          <w:p>
+            <w:pPr>
+              <w:keepNext/>
+              <w:spacing w:after="0" w:line="240" w:lineRule="auto"/>
+            </w:pPr>
+            <w:r>
+              <w:rPr>
+                <w:rFonts w:ascii="Consolas" w:hAnsi="Consolas" w:eastAsia="Consolas"/>
+                <w:color w:val="1F2933"/>
+                <w:sz w:val="19"/>
+              </w:rPr>
+              <w:t>Michi dice Miau</w:t>
             </w:r>
           </w:p>
           <w:p>
@@ -6148,49 +6232,7 @@
                 <w:color w:val="1F2933"/>
                 <w:sz w:val="19"/>
               </w:rPr>
-              <w:t>CuentaBancariaTest &gt; Una cuenta nueva empieza con saldo 0 PASSED</w:t>
-            </w:r>
-          </w:p>
-          <w:p>
-            <w:pPr>
-              <w:keepNext/>
-              <w:spacing w:after="0" w:line="240" w:lineRule="auto"/>
-            </w:pPr>
-            <w:r>
-              <w:rPr>
-                <w:rFonts w:ascii="Consolas" w:hAnsi="Consolas" w:eastAsia="Consolas"/>
-                <w:color w:val="1F2933"/>
-                <w:sz w:val="19"/>
-              </w:rPr>
-              <w:t xml:space="preserve"> </w:t>
-            </w:r>
-          </w:p>
-          <w:p>
-            <w:pPr>
-              <w:keepNext/>
-              <w:spacing w:after="0" w:line="240" w:lineRule="auto"/>
-            </w:pPr>
-            <w:r>
-              <w:rPr>
-                <w:rFonts w:ascii="Consolas" w:hAnsi="Consolas" w:eastAsia="Consolas"/>
-                <w:color w:val="1F2933"/>
-                <w:sz w:val="19"/>
-              </w:rPr>
-              <w:t>BUILD SUCCESSFUL in 952ms</w:t>
-            </w:r>
-          </w:p>
-          <w:p>
-            <w:pPr>
-              <w:keepNext/>
-              <w:spacing w:after="0" w:line="240" w:lineRule="auto"/>
-            </w:pPr>
-            <w:r>
-              <w:rPr>
-                <w:rFonts w:ascii="Consolas" w:hAnsi="Consolas" w:eastAsia="Consolas"/>
-                <w:color w:val="1F2933"/>
-                <w:sz w:val="19"/>
-              </w:rPr>
-              <w:t>3 actionable tasks: 3 executed</w:t>
+              <w:t>BUILD SUCCESSFUL in 1s</w:t>
             </w:r>
           </w:p>
         </w:tc>

</xml_diff>

<commit_message>
Actualizar guía de prerrequisitos: la rama 01 se comprueba con gradle run
Co-Authored-By: Claude Opus 5 (1M context) <noreply@anthropic.com>
Claude-Session: https://claude.ai/code/session_01L2JuF1iG72koPJkmuRWSzm
</commit_message>
<xml_diff>
--- a/material-de-apoyo/Prerrequisitos_Instalacion_Entorno_Windows.docx
+++ b/material-de-apoyo/Prerrequisitos_Instalacion_Entorno_Windows.docx
@@ -518,7 +518,7 @@
                 <w:b w:val="0"/>
                 <w:sz w:val="20"/>
               </w:rPr>
-              <w:t>Descarga las librerías del proyecto, compila y ejecuta las pruebas con un solo comando (</w:t>
+              <w:t>Compila y ejecuta los proyectos (</w:t>
             </w:r>
             <w:r>
               <w:rPr>
@@ -526,14 +526,14 @@
                 <w:color w:val="003D7A"/>
                 <w:sz w:val="20"/>
               </w:rPr>
-              <w:t>gradle test</w:t>
+              <w:t>gradle run</w:t>
             </w:r>
             <w:r>
               <w:rPr>
                 <w:b w:val="0"/>
                 <w:sz w:val="20"/>
               </w:rPr>
-              <w:t>).</w:t>
+              <w:t xml:space="preserve"> en la clase 1). Desde la clase 2 descarga Serenity, Cucumber, Playwright y JUnit.</w:t>
             </w:r>
           </w:p>
         </w:tc>
@@ -1855,14 +1855,14 @@
         <w:rPr>
           <w:b w:val="0"/>
         </w:rPr>
-        <w:t xml:space="preserve">Gradle es la herramienta que construye el proyecto: descarga las librerías que necesitamos (JUnit, Serenity, Cucumber, Playwright), compila el código y ejecuta las pruebas. En el semillero lo usamos instalado en tu equipo, así que siempre vas a escribir </w:t>
+        <w:t xml:space="preserve">Gradle es la herramienta que construye el proyecto: compila el código, lo ejecuta y, desde la clase 2, descarga las librerías que necesitamos (Serenity, Cucumber, Playwright, JUnit) y corre las pruebas. En el semillero lo usamos instalado en tu equipo, así que siempre vas a escribir </w:t>
       </w:r>
       <w:r>
         <w:rPr>
           <w:rFonts w:ascii="Consolas" w:hAnsi="Consolas" w:eastAsia="Consolas"/>
           <w:color w:val="003D7A"/>
         </w:rPr>
-        <w:t>gradle test</w:t>
+        <w:t>gradle run</w:t>
       </w:r>
       <w:r>
         <w:rPr>
@@ -1875,7 +1875,7 @@
           <w:rFonts w:ascii="Consolas" w:hAnsi="Consolas" w:eastAsia="Consolas"/>
           <w:color w:val="003D7A"/>
         </w:rPr>
-        <w:t>gradle run</w:t>
+        <w:t>gradle test</w:t>
       </w:r>
       <w:r>
         <w:rPr>
@@ -6028,7 +6028,7 @@
                 <w:color w:val="003D7A"/>
                 <w:sz w:val="20"/>
               </w:rPr>
-              <w:t>gradle test</w:t>
+              <w:t>gradle run</w:t>
             </w:r>
           </w:p>
         </w:tc>
@@ -6049,7 +6049,7 @@
                 <w:b w:val="0"/>
                 <w:sz w:val="20"/>
               </w:rPr>
-              <w:t>Una lista de pruebas con PASSED y al final BUILD SUCCESSFUL</w:t>
+              <w:t>Los títulos de las secciones de ejemplos y al final BUILD SUCCESSFUL</w:t>
             </w:r>
           </w:p>
         </w:tc>
@@ -6068,20 +6068,20 @@
         <w:rPr>
           <w:b w:val="0"/>
         </w:rPr>
-        <w:t xml:space="preserve">La primera vez que corres </w:t>
+        <w:t xml:space="preserve">La rama 01 es Java puro, sin pruebas automatizadas: </w:t>
       </w:r>
       <w:r>
         <w:rPr>
           <w:rFonts w:ascii="Consolas" w:hAnsi="Consolas" w:eastAsia="Consolas"/>
           <w:color w:val="003D7A"/>
         </w:rPr>
-        <w:t>gradle test</w:t>
+        <w:t>gradle run</w:t>
       </w:r>
       <w:r>
         <w:rPr>
           <w:b w:val="0"/>
         </w:rPr>
-        <w:t xml:space="preserve"> en la rama 01 tarda un poco más porque Gradle descarga JUnit. En nuestra prueba la salida terminó así:</w:t>
+        <w:t xml:space="preserve"> compila el proyecto y muestra en pantalla los ejemplos de la clase, cada uno con un título entre signos igual (del 1. Variables y tipos de datos al 6. Herencia y polimorfismo). No descarga librerías, así que tarda pocos segundos. En nuestra prueba terminó así (recortada):</w:t>
       </w:r>
     </w:p>
     <w:tbl>
@@ -6120,7 +6120,91 @@
                 <w:color w:val="1F2933"/>
                 <w:sz w:val="19"/>
               </w:rPr>
-              <w:t>CuentaBancariaTest &gt; Retirar con saldo suficiente descuenta el valor PASSED</w:t>
+              <w:t>&gt; Task :run</w:t>
+            </w:r>
+          </w:p>
+          <w:p>
+            <w:pPr>
+              <w:keepNext/>
+              <w:spacing w:after="0" w:line="240" w:lineRule="auto"/>
+            </w:pPr>
+            <w:r>
+              <w:rPr>
+                <w:rFonts w:ascii="Consolas" w:hAnsi="Consolas" w:eastAsia="Consolas"/>
+                <w:color w:val="1F2933"/>
+                <w:sz w:val="19"/>
+              </w:rPr>
+              <w:t>===== 1. Variables y tipos de datos =====</w:t>
+            </w:r>
+          </w:p>
+          <w:p>
+            <w:pPr>
+              <w:keepNext/>
+              <w:spacing w:after="0" w:line="240" w:lineRule="auto"/>
+            </w:pPr>
+            <w:r>
+              <w:rPr>
+                <w:rFonts w:ascii="Consolas" w:hAnsi="Consolas" w:eastAsia="Consolas"/>
+                <w:color w:val="1F2933"/>
+                <w:sz w:val="19"/>
+              </w:rPr>
+              <w:t>int (numero entero): 20</w:t>
+            </w:r>
+          </w:p>
+          <w:p>
+            <w:pPr>
+              <w:keepNext/>
+              <w:spacing w:after="0" w:line="240" w:lineRule="auto"/>
+            </w:pPr>
+            <w:r>
+              <w:rPr>
+                <w:rFonts w:ascii="Consolas" w:hAnsi="Consolas" w:eastAsia="Consolas"/>
+                <w:color w:val="1F2933"/>
+                <w:sz w:val="19"/>
+              </w:rPr>
+              <w:t>...</w:t>
+            </w:r>
+          </w:p>
+          <w:p>
+            <w:pPr>
+              <w:keepNext/>
+              <w:spacing w:after="0" w:line="240" w:lineRule="auto"/>
+            </w:pPr>
+            <w:r>
+              <w:rPr>
+                <w:rFonts w:ascii="Consolas" w:hAnsi="Consolas" w:eastAsia="Consolas"/>
+                <w:color w:val="1F2933"/>
+                <w:sz w:val="19"/>
+              </w:rPr>
+              <w:t>===== 6. Herencia y polimorfismo =====</w:t>
+            </w:r>
+          </w:p>
+          <w:p>
+            <w:pPr>
+              <w:keepNext/>
+              <w:spacing w:after="0" w:line="240" w:lineRule="auto"/>
+            </w:pPr>
+            <w:r>
+              <w:rPr>
+                <w:rFonts w:ascii="Consolas" w:hAnsi="Consolas" w:eastAsia="Consolas"/>
+                <w:color w:val="1F2933"/>
+                <w:sz w:val="19"/>
+              </w:rPr>
+              <w:t>Firulais dice Guau</w:t>
+            </w:r>
+          </w:p>
+          <w:p>
+            <w:pPr>
+              <w:keepNext/>
+              <w:spacing w:after="0" w:line="240" w:lineRule="auto"/>
+            </w:pPr>
+            <w:r>
+              <w:rPr>
+                <w:rFonts w:ascii="Consolas" w:hAnsi="Consolas" w:eastAsia="Consolas"/>
+                <w:color w:val="1F2933"/>
+                <w:sz w:val="19"/>
+              </w:rPr>
+              <w:t>Michi dice Miau</w:t>
             </w:r>
           </w:p>
           <w:p>
@@ -6148,49 +6232,7 @@
                 <w:color w:val="1F2933"/>
                 <w:sz w:val="19"/>
               </w:rPr>
-              <w:t>CuentaBancariaTest &gt; Una cuenta nueva empieza con saldo 0 PASSED</w:t>
-            </w:r>
-          </w:p>
-          <w:p>
-            <w:pPr>
-              <w:keepNext/>
-              <w:spacing w:after="0" w:line="240" w:lineRule="auto"/>
-            </w:pPr>
-            <w:r>
-              <w:rPr>
-                <w:rFonts w:ascii="Consolas" w:hAnsi="Consolas" w:eastAsia="Consolas"/>
-                <w:color w:val="1F2933"/>
-                <w:sz w:val="19"/>
-              </w:rPr>
-              <w:t xml:space="preserve"> </w:t>
-            </w:r>
-          </w:p>
-          <w:p>
-            <w:pPr>
-              <w:keepNext/>
-              <w:spacing w:after="0" w:line="240" w:lineRule="auto"/>
-            </w:pPr>
-            <w:r>
-              <w:rPr>
-                <w:rFonts w:ascii="Consolas" w:hAnsi="Consolas" w:eastAsia="Consolas"/>
-                <w:color w:val="1F2933"/>
-                <w:sz w:val="19"/>
-              </w:rPr>
-              <w:t>BUILD SUCCESSFUL in 952ms</w:t>
-            </w:r>
-          </w:p>
-          <w:p>
-            <w:pPr>
-              <w:keepNext/>
-              <w:spacing w:after="0" w:line="240" w:lineRule="auto"/>
-            </w:pPr>
-            <w:r>
-              <w:rPr>
-                <w:rFonts w:ascii="Consolas" w:hAnsi="Consolas" w:eastAsia="Consolas"/>
-                <w:color w:val="1F2933"/>
-                <w:sz w:val="19"/>
-              </w:rPr>
-              <w:t>3 actionable tasks: 3 executed</w:t>
+              <w:t>BUILD SUCCESSFUL in 1s</w:t>
             </w:r>
           </w:p>
         </w:tc>

</xml_diff>

<commit_message>
Clase 4 en TypeScript: Node.js y VS Code en la guía de prerrequisitos y en el README
La guía agrega Node.js 24 LTS y Visual Studio Code con la extensión Playwright Test for
VSCode, con capturas reales de sus páginas de descarga, y reemplaza la instalación del
navegador por npm ci y npx playwright install chromium en la rama 04. El README de main
actualiza requisitos, comandos por rama y la estructura de la rama 04.

Co-Authored-By: Claude Opus 5 (1M context) <noreply@anthropic.com>
Claude-Session: https://claude.ai/code/session_01L2JuF1iG72koPJkmuRWSzm
</commit_message>
<xml_diff>
--- a/material-de-apoyo/Prerrequisitos_Instalacion_Entorno_Windows.docx
+++ b/material-de-apoyo/Prerrequisitos_Instalacion_Entorno_Windows.docx
@@ -44,11 +44,7 @@
         <w:t>Paso a paso para dejar listo tu equipo Windows antes de la primera clase</w:t>
       </w:r>
     </w:p>
-    <w:p>
-      <w:pPr>
-        <w:keepNext/>
-      </w:pPr>
-    </w:p>
+    <w:p/>
     <w:tbl>
       <w:tblPr>
         <w:tblW w:type="auto" w:w="0"/>
@@ -322,14 +318,11 @@
       </w:r>
     </w:p>
     <w:p>
-      <w:pPr>
-        <w:keepNext/>
-      </w:pPr>
-      <w:r>
-        <w:rPr>
-          <w:b w:val="0"/>
-        </w:rPr>
-        <w:t>Esta guía es para ti aunque nunca hayas instalado una herramienta de programación. Vas a instalar seis cosas, una detrás de otra, y después de cada una vas a comprobar que quedó bien con un comando. Si algo no sale como dice aquí, no sigas con la siguiente: revisa el apartado de esa herramienta o el capítulo de problemas frecuentes al final.</w:t>
+      <w:r>
+        <w:rPr>
+          <w:b w:val="0"/>
+        </w:rPr>
+        <w:t>Esta guía es para ti aunque nunca hayas instalado una herramienta de programación. Vas a instalar ocho cosas, una detrás de otra, y después de cada una vas a comprobar que quedó bien con un comando. Si algo no sale como dice aquí, no sigas con la siguiente: revisa el apartado de esa herramienta o el capítulo de problemas frecuentes al final.</w:t>
       </w:r>
     </w:p>
     <w:p>
@@ -518,7 +511,7 @@
                 <w:b w:val="0"/>
                 <w:sz w:val="20"/>
               </w:rPr>
-              <w:t>Compila y ejecuta los proyectos (</w:t>
+              <w:t>Compila y ejecuta los proyectos Java (</w:t>
             </w:r>
             <w:r>
               <w:rPr>
@@ -533,7 +526,7 @@
                 <w:b w:val="0"/>
                 <w:sz w:val="20"/>
               </w:rPr>
-              <w:t xml:space="preserve"> en la clase 1). Desde la clase 2 descarga Serenity, Cucumber, Playwright y JUnit.</w:t>
+              <w:t xml:space="preserve"> en la clase 1). En las clases 2 y 3 descarga Serenity, Cucumber y JUnit y corre las pruebas.</w:t>
             </w:r>
           </w:p>
         </w:tc>
@@ -637,7 +630,126 @@
                 <w:b w:val="0"/>
                 <w:sz w:val="20"/>
               </w:rPr>
-              <w:t>El editor donde lees y escribes el código. Es gratuito para lo que vamos a hacer.</w:t>
+              <w:t>El editor de las clases 1 a 3, donde lees y escribes el código Java. Es gratuito para lo que vamos a hacer.</w:t>
+            </w:r>
+          </w:p>
+        </w:tc>
+      </w:tr>
+      <w:tr>
+        <w:trPr>
+          <w:cantSplit/>
+        </w:trPr>
+        <w:tc>
+          <w:tcPr>
+            <w:tcW w:type="dxa" w:w="2835"/>
+            <w:tcBorders>
+              <w:top w:val="single" w:sz="6" w:color="D0D7DE"/>
+              <w:left w:val="single" w:sz="6" w:color="D0D7DE"/>
+              <w:bottom w:val="single" w:sz="6" w:color="D0D7DE"/>
+              <w:right w:val="single" w:sz="6" w:color="D0D7DE"/>
+            </w:tcBorders>
+          </w:tcPr>
+          <w:p>
+            <w:pPr>
+              <w:keepNext/>
+            </w:pPr>
+            <w:r>
+              <w:rPr>
+                <w:b w:val="0"/>
+                <w:sz w:val="20"/>
+              </w:rPr>
+              <w:t>Node.js 24 LTS</w:t>
+            </w:r>
+          </w:p>
+        </w:tc>
+        <w:tc>
+          <w:tcPr>
+            <w:tcW w:type="dxa" w:w="6803"/>
+            <w:tcBorders>
+              <w:top w:val="single" w:sz="6" w:color="D0D7DE"/>
+              <w:left w:val="single" w:sz="6" w:color="D0D7DE"/>
+              <w:bottom w:val="single" w:sz="6" w:color="D0D7DE"/>
+              <w:right w:val="single" w:sz="6" w:color="D0D7DE"/>
+            </w:tcBorders>
+          </w:tcPr>
+          <w:p>
+            <w:pPr>
+              <w:keepNext/>
+            </w:pPr>
+            <w:r>
+              <w:rPr>
+                <w:b w:val="0"/>
+                <w:sz w:val="20"/>
+              </w:rPr>
+              <w:t xml:space="preserve">Ejecuta Playwright con TypeScript en la clase 4. Trae </w:t>
+            </w:r>
+            <w:r>
+              <w:rPr>
+                <w:rFonts w:ascii="Consolas" w:hAnsi="Consolas" w:eastAsia="Consolas"/>
+                <w:color w:val="003D7A"/>
+                <w:sz w:val="20"/>
+              </w:rPr>
+              <w:t>npm</w:t>
+            </w:r>
+            <w:r>
+              <w:rPr>
+                <w:b w:val="0"/>
+                <w:sz w:val="20"/>
+              </w:rPr>
+              <w:t>, que descarga las librerías del proyecto.</w:t>
+            </w:r>
+          </w:p>
+        </w:tc>
+      </w:tr>
+      <w:tr>
+        <w:trPr>
+          <w:cantSplit/>
+        </w:trPr>
+        <w:tc>
+          <w:tcPr>
+            <w:tcW w:type="dxa" w:w="2835"/>
+            <w:shd w:val="clear" w:color="auto" w:fill="F2F5F9"/>
+            <w:tcBorders>
+              <w:top w:val="single" w:sz="6" w:color="D0D7DE"/>
+              <w:left w:val="single" w:sz="6" w:color="D0D7DE"/>
+              <w:bottom w:val="single" w:sz="6" w:color="D0D7DE"/>
+              <w:right w:val="single" w:sz="6" w:color="D0D7DE"/>
+            </w:tcBorders>
+          </w:tcPr>
+          <w:p>
+            <w:pPr>
+              <w:keepNext/>
+            </w:pPr>
+            <w:r>
+              <w:rPr>
+                <w:b w:val="0"/>
+                <w:sz w:val="20"/>
+              </w:rPr>
+              <w:t>Visual Studio Code</w:t>
+            </w:r>
+          </w:p>
+        </w:tc>
+        <w:tc>
+          <w:tcPr>
+            <w:tcW w:type="dxa" w:w="6803"/>
+            <w:shd w:val="clear" w:color="auto" w:fill="F2F5F9"/>
+            <w:tcBorders>
+              <w:top w:val="single" w:sz="6" w:color="D0D7DE"/>
+              <w:left w:val="single" w:sz="6" w:color="D0D7DE"/>
+              <w:bottom w:val="single" w:sz="6" w:color="D0D7DE"/>
+              <w:right w:val="single" w:sz="6" w:color="D0D7DE"/>
+            </w:tcBorders>
+          </w:tcPr>
+          <w:p>
+            <w:pPr>
+              <w:keepNext/>
+            </w:pPr>
+            <w:r>
+              <w:rPr>
+                <w:b w:val="0"/>
+                <w:sz w:val="20"/>
+              </w:rPr>
+              <w:t>El editor de la clase 4, con la extensión Playwright Test for VSCode para correr las pruebas con un clic.</w:t>
             </w:r>
           </w:p>
         </w:tc>
@@ -688,7 +800,7 @@
                 <w:b w:val="0"/>
                 <w:sz w:val="20"/>
               </w:rPr>
-              <w:t>El navegador que automatizamos en las clases 2 y 4.</w:t>
+              <w:t>El navegador que automatizamos en la clase 2.</w:t>
             </w:r>
           </w:p>
         </w:tc>
@@ -735,7 +847,22 @@
                 <w:b w:val="0"/>
                 <w:sz w:val="20"/>
               </w:rPr>
-              <w:t>El Chromium que usa Playwright en la clase 4. Se instala con un comando de Gradle.</w:t>
+              <w:t xml:space="preserve">El Chromium que usa Playwright en la clase 4. Se instala con </w:t>
+            </w:r>
+            <w:r>
+              <w:rPr>
+                <w:rFonts w:ascii="Consolas" w:hAnsi="Consolas" w:eastAsia="Consolas"/>
+                <w:color w:val="003D7A"/>
+                <w:sz w:val="20"/>
+              </w:rPr>
+              <w:t>npx playwright install chromium</w:t>
+            </w:r>
+            <w:r>
+              <w:rPr>
+                <w:b w:val="0"/>
+                <w:sz w:val="20"/>
+              </w:rPr>
+              <w:t>.</w:t>
             </w:r>
           </w:p>
         </w:tc>
@@ -777,7 +904,7 @@
         <w:rPr>
           <w:b w:val="0"/>
         </w:rPr>
-        <w:t xml:space="preserve"> en el disco C. IntelliJ IDEA solo pide 10 GB según JetBrains, y a eso se suman Java, Gradle, Git, las librerías que Gradle descarga para cada clase y los navegadores de Playwright. Tu equipo debería tener 8 GB de memoria RAM o más; con menos funciona, pero lento.</w:t>
+        <w:t xml:space="preserve"> en el disco C. IntelliJ IDEA solo pide 10 GB según JetBrains, y a eso se suman Java, Gradle, Git, Node.js, Visual Studio Code, las librerías que se descargan para cada clase y el navegador de Playwright (cerca de 560 MB). Tu equipo debería tener 8 GB de memoria RAM o más; con menos funciona, pero lento.</w:t>
       </w:r>
     </w:p>
     <w:p>
@@ -785,7 +912,7 @@
         <w:rPr>
           <w:b w:val="0"/>
         </w:rPr>
-        <w:t>Con una conexión normal todo el proceso toma entre una hora y media y dos horas. Lo que más tarda es la descarga de IntelliJ IDEA (el instalador pesa cerca de 1,2 GB).</w:t>
+        <w:t>Con una conexión normal todo el proceso toma entre una hora y media y dos horas. Lo que más tarda es la descarga de IntelliJ IDEA (el instalador pesa cerca de 1,2 GB); Node.js y Visual Studio Code son rápidos.</w:t>
       </w:r>
     </w:p>
     <w:p>
@@ -807,7 +934,7 @@
         <w:rPr>
           <w:b w:val="0"/>
         </w:rPr>
-        <w:t xml:space="preserve">Los instaladores de Java, Git, IntelliJ y Chrome piden permiso de administrador. Cuando Windows muestre la ventana "¿Quieres permitir que esta aplicación haga cambios en el dispositivo?", dale clic en </w:t>
+        <w:t xml:space="preserve">Los instaladores de Java, Git, IntelliJ, Node.js y Chrome piden permiso de administrador. Cuando Windows muestre la ventana "¿Quieres permitir que esta aplicación haga cambios en el dispositivo?", dale clic en </w:t>
       </w:r>
       <w:r>
         <w:rPr>
@@ -863,7 +990,7 @@
               <w:rPr>
                 <w:b w:val="0"/>
               </w:rPr>
-              <w:t>Si tu computador es de la empresa y no te deja instalar (te pide un usuario y contraseña de administrador que no tienes), no intentes saltarte el bloqueo. Abre un caso con soporte técnico, pásales esta guía y pídeles que instalen Java 21, Git, IntelliJ IDEA y Chrome, y que te ayuden con Gradle y la variable Path. Hazlo con varios días de anticipación porque esos casos pueden demorar.</w:t>
+              <w:t>Si tu computador es de la empresa y no te deja instalar (te pide un usuario y contraseña de administrador que no tienes), no intentes saltarte el bloqueo. Abre un caso con soporte técnico, pásales esta guía y pídeles que instalen Java 21, Git, IntelliJ IDEA, Node.js 24, Visual Studio Code y Chrome, y que te ayuden con Gradle y la variable Path. Hazlo con varios días de anticipación porque esos casos pueden demorar.</w:t>
             </w:r>
           </w:p>
         </w:tc>
@@ -1031,9 +1158,6 @@
       </w:r>
     </w:p>
     <w:p>
-      <w:pPr>
-        <w:keepNext/>
-      </w:pPr>
       <w:r>
         <w:rPr>
           <w:b w:val="0"/>
@@ -1145,7 +1269,7 @@
       <w:r>
         <w:drawing>
           <wp:inline xmlns:a="http://schemas.openxmlformats.org/drawingml/2006/main" xmlns:pic="http://schemas.openxmlformats.org/drawingml/2006/picture">
-            <wp:extent cx="5580000" cy="3104539"/>
+            <wp:extent cx="3420000" cy="1902782"/>
             <wp:docPr id="1" name="Picture 1"/>
             <wp:cNvGraphicFramePr>
               <a:graphicFrameLocks noChangeAspect="1"/>
@@ -1166,7 +1290,7 @@
                   <pic:spPr>
                     <a:xfrm>
                       <a:off x="0" y="0"/>
-                      <a:ext cx="5580000" cy="3104539"/>
+                      <a:ext cx="3420000" cy="1902782"/>
                     </a:xfrm>
                     <a:prstGeom prst="rect"/>
                   </pic:spPr>
@@ -1848,9 +1972,6 @@
       </w:r>
     </w:p>
     <w:p>
-      <w:pPr>
-        <w:keepNext/>
-      </w:pPr>
       <w:r>
         <w:rPr>
           <w:b w:val="0"/>
@@ -1964,7 +2085,7 @@
       <w:r>
         <w:drawing>
           <wp:inline xmlns:a="http://schemas.openxmlformats.org/drawingml/2006/main" xmlns:pic="http://schemas.openxmlformats.org/drawingml/2006/picture">
-            <wp:extent cx="3960000" cy="1897500"/>
+            <wp:extent cx="2880000" cy="1380000"/>
             <wp:docPr id="2" name="Picture 2"/>
             <wp:cNvGraphicFramePr>
               <a:graphicFrameLocks noChangeAspect="1"/>
@@ -1985,7 +2106,7 @@
                   <pic:spPr>
                     <a:xfrm>
                       <a:off x="0" y="0"/>
-                      <a:ext cx="3960000" cy="1897500"/>
+                      <a:ext cx="2880000" cy="1380000"/>
                     </a:xfrm>
                     <a:prstGeom prst="rect"/>
                   </pic:spPr>
@@ -2982,9 +3103,6 @@
       </w:r>
     </w:p>
     <w:p>
-      <w:pPr>
-        <w:keepNext/>
-      </w:pPr>
       <w:r>
         <w:rPr>
           <w:b w:val="0"/>
@@ -3061,7 +3179,7 @@
       <w:r>
         <w:drawing>
           <wp:inline xmlns:a="http://schemas.openxmlformats.org/drawingml/2006/main" xmlns:pic="http://schemas.openxmlformats.org/drawingml/2006/picture">
-            <wp:extent cx="5040000" cy="2571429"/>
+            <wp:extent cx="3780000" cy="1928571"/>
             <wp:docPr id="3" name="Picture 3"/>
             <wp:cNvGraphicFramePr>
               <a:graphicFrameLocks noChangeAspect="1"/>
@@ -3082,7 +3200,7 @@
                   <pic:spPr>
                     <a:xfrm>
                       <a:off x="0" y="0"/>
-                      <a:ext cx="5040000" cy="2571429"/>
+                      <a:ext cx="3780000" cy="1928571"/>
                     </a:xfrm>
                     <a:prstGeom prst="rect"/>
                   </pic:spPr>
@@ -3631,14 +3749,11 @@
       </w:r>
     </w:p>
     <w:p>
-      <w:pPr>
-        <w:keepNext/>
-      </w:pPr>
-      <w:r>
-        <w:rPr>
-          <w:b w:val="0"/>
-        </w:rPr>
-        <w:t xml:space="preserve">IntelliJ IDEA es el editor que usamos para leer, escribir y ejecutar el código Java. Antes existían dos ediciones, Community (gratis) y Ultimate (paga). Desde la versión 2025.3 JetBrains las unió en </w:t>
+      <w:r>
+        <w:rPr>
+          <w:b w:val="0"/>
+        </w:rPr>
+        <w:t xml:space="preserve">IntelliJ IDEA es el editor que usamos en las clases 1 a 3 para leer, escribir y ejecutar el código Java. Antes existían dos ediciones, Community (gratis) y Ultimate (paga). Desde la versión 2025.3 JetBrains las unió en </w:t>
       </w:r>
       <w:r>
         <w:rPr>
@@ -3734,7 +3849,7 @@
       <w:r>
         <w:drawing>
           <wp:inline xmlns:a="http://schemas.openxmlformats.org/drawingml/2006/main" xmlns:pic="http://schemas.openxmlformats.org/drawingml/2006/picture">
-            <wp:extent cx="5580000" cy="2595349"/>
+            <wp:extent cx="4140000" cy="1925581"/>
             <wp:docPr id="4" name="Picture 4"/>
             <wp:cNvGraphicFramePr>
               <a:graphicFrameLocks noChangeAspect="1"/>
@@ -3755,7 +3870,7 @@
                   <pic:spPr>
                     <a:xfrm>
                       <a:off x="0" y="0"/>
-                      <a:ext cx="5580000" cy="2595349"/>
+                      <a:ext cx="4140000" cy="1925581"/>
                     </a:xfrm>
                     <a:prstGeom prst="rect"/>
                   </pic:spPr>
@@ -4227,7 +4342,7 @@
         <w:rPr>
           <w:b w:val="0"/>
         </w:rPr>
-        <w:t>Esto lo haces después de clonar el repositorio (paso 6). Lo dejo aquí para que tengas todo lo de IntelliJ junto.</w:t>
+        <w:t>Esto lo haces después de clonar el repositorio (paso 8). Lo dejo aquí para que tengas todo lo de IntelliJ junto.</w:t>
       </w:r>
     </w:p>
     <w:p>
@@ -4697,22 +4812,1240 @@
           <w:color w:val="003D7A"/>
           <w:sz w:val="36"/>
         </w:rPr>
-        <w:t>Paso 5. Google Chrome</w:t>
+        <w:t>Paso 5. Node.js 24 LTS (clase 4)</w:t>
       </w:r>
     </w:p>
     <w:p>
+      <w:r>
+        <w:rPr>
+          <w:b w:val="0"/>
+        </w:rPr>
+        <w:t xml:space="preserve">La clase 4 no es en Java: usamos </w:t>
+      </w:r>
+      <w:r>
+        <w:rPr>
+          <w:b/>
+        </w:rPr>
+        <w:t>Playwright con TypeScript</w:t>
+      </w:r>
+      <w:r>
+        <w:rPr>
+          <w:b w:val="0"/>
+        </w:rPr>
+        <w:t xml:space="preserve">. Para eso necesitas Node.js, que ejecuta ese código, y </w:t>
+      </w:r>
+      <w:r>
+        <w:rPr>
+          <w:rFonts w:ascii="Consolas" w:hAnsi="Consolas" w:eastAsia="Consolas"/>
+          <w:color w:val="003D7A"/>
+        </w:rPr>
+        <w:t>npm</w:t>
+      </w:r>
+      <w:r>
+        <w:rPr>
+          <w:b w:val="0"/>
+        </w:rPr>
+        <w:t xml:space="preserve">, que viene incluido y descarga las librerías del proyecto. Instalamos la versión </w:t>
+      </w:r>
+      <w:r>
+        <w:rPr>
+          <w:b/>
+        </w:rPr>
+        <w:t>24 LTS</w:t>
+      </w:r>
+      <w:r>
+        <w:rPr>
+          <w:b w:val="0"/>
+        </w:rPr>
+        <w:t xml:space="preserve"> (la de soporte de largo plazo).</w:t>
+      </w:r>
+    </w:p>
+    <w:p>
       <w:pPr>
         <w:keepNext/>
-      </w:pPr>
-      <w:r>
-        <w:rPr>
-          <w:b w:val="0"/>
-        </w:rPr>
-        <w:t xml:space="preserve">En la clase 2 (Serenity con Selenium) y en la clase 4 (Playwright) las pruebas abren un navegador y lo manejan solas. Usamos Chrome. Si ya lo tienes instalado, solo actualízalo desde el menú de los tres puntos, </w:t>
-      </w:r>
+        <w:spacing w:before="200" w:after="80"/>
+      </w:pPr>
       <w:r>
         <w:rPr>
           <w:b/>
+          <w:color w:val="0072BC"/>
+          <w:sz w:val="28"/>
+        </w:rPr>
+        <w:t>Descarga</w:t>
+      </w:r>
+    </w:p>
+    <w:tbl>
+      <w:tblPr>
+        <w:tblW w:type="auto" w:w="0"/>
+        <w:jc w:val="center"/>
+        <w:tblLook w:firstColumn="1" w:firstRow="1" w:lastColumn="0" w:lastRow="0" w:noHBand="0" w:noVBand="1" w:val="04A0"/>
+      </w:tblPr>
+      <w:tblGrid>
+        <w:gridCol w:w="9632"/>
+      </w:tblGrid>
+      <w:tr>
+        <w:trPr>
+          <w:cantSplit/>
+        </w:trPr>
+        <w:tc>
+          <w:tcPr>
+            <w:tcW w:type="dxa" w:w="9632"/>
+            <w:shd w:val="clear" w:color="auto" w:fill="F2F5F9"/>
+            <w:tcBorders>
+              <w:top w:val="nil"/>
+              <w:left w:val="single" w:sz="18" w:color="0072BC"/>
+              <w:bottom w:val="nil"/>
+              <w:right w:val="nil"/>
+            </w:tcBorders>
+          </w:tcPr>
+          <w:p>
+            <w:pPr>
+              <w:keepNext/>
+              <w:spacing w:after="0" w:line="240" w:lineRule="auto"/>
+            </w:pPr>
+            <w:r/>
+            <w:r>
+              <w:rPr>
+                <w:rFonts w:ascii="Consolas" w:hAnsi="Consolas" w:eastAsia="Consolas"/>
+                <w:color w:val="1F2933"/>
+                <w:sz w:val="19"/>
+              </w:rPr>
+              <w:t>https://nodejs.org/es/download</w:t>
+            </w:r>
+          </w:p>
+        </w:tc>
+      </w:tr>
+    </w:tbl>
+    <w:p>
+      <w:pPr>
+        <w:spacing w:after="40"/>
+      </w:pPr>
+    </w:p>
+    <w:p>
+      <w:pPr>
+        <w:keepNext/>
+        <w:jc w:val="center"/>
+      </w:pPr>
+      <w:r>
+        <w:drawing>
+          <wp:inline xmlns:a="http://schemas.openxmlformats.org/drawingml/2006/main" xmlns:pic="http://schemas.openxmlformats.org/drawingml/2006/picture">
+            <wp:extent cx="3780000" cy="2340826"/>
+            <wp:docPr id="5" name="Picture 5"/>
+            <wp:cNvGraphicFramePr>
+              <a:graphicFrameLocks noChangeAspect="1"/>
+            </wp:cNvGraphicFramePr>
+            <a:graphic>
+              <a:graphicData uri="http://schemas.openxmlformats.org/drawingml/2006/picture">
+                <pic:pic>
+                  <pic:nvPicPr>
+                    <pic:cNvPr id="0" name="nodejs.png"/>
+                    <pic:cNvPicPr/>
+                  </pic:nvPicPr>
+                  <pic:blipFill>
+                    <a:blip r:embed="rId14"/>
+                    <a:stretch>
+                      <a:fillRect/>
+                    </a:stretch>
+                  </pic:blipFill>
+                  <pic:spPr>
+                    <a:xfrm>
+                      <a:off x="0" y="0"/>
+                      <a:ext cx="3780000" cy="2340826"/>
+                    </a:xfrm>
+                    <a:prstGeom prst="rect"/>
+                  </pic:spPr>
+                </pic:pic>
+              </a:graphicData>
+            </a:graphic>
+          </wp:inline>
+        </w:drawing>
+      </w:r>
+    </w:p>
+    <w:p>
+      <w:pPr>
+        <w:jc w:val="center"/>
+      </w:pPr>
+      <w:r>
+        <w:rPr>
+          <w:b w:val="0"/>
+          <w:color w:val="52606D"/>
+          <w:sz w:val="18"/>
+        </w:rPr>
+        <w:t>Página de descarga de Node.js. Revisa que diga v24.21.0 LTS, Windows y x64, y descarga el instalador .msi.</w:t>
+      </w:r>
+    </w:p>
+    <w:p>
+      <w:r>
+        <w:rPr>
+          <w:b w:val="0"/>
+        </w:rPr>
+        <w:t xml:space="preserve">Revisa que arriba diga </w:t>
+      </w:r>
+      <w:r>
+        <w:rPr>
+          <w:b/>
+        </w:rPr>
+        <w:t>v24.21.0 LTS</w:t>
+      </w:r>
+      <w:r>
+        <w:rPr>
+          <w:b w:val="0"/>
+        </w:rPr>
+        <w:t xml:space="preserve"> y abajo </w:t>
+      </w:r>
+      <w:r>
+        <w:rPr>
+          <w:b/>
+        </w:rPr>
+        <w:t>Windows</w:t>
+      </w:r>
+      <w:r>
+        <w:rPr>
+          <w:b w:val="0"/>
+        </w:rPr>
+        <w:t xml:space="preserve"> y </w:t>
+      </w:r>
+      <w:r>
+        <w:rPr>
+          <w:b/>
+        </w:rPr>
+        <w:t>x64</w:t>
+      </w:r>
+      <w:r>
+        <w:rPr>
+          <w:b w:val="0"/>
+        </w:rPr>
+        <w:t xml:space="preserve">. Dale clic en </w:t>
+      </w:r>
+      <w:r>
+        <w:rPr>
+          <w:b/>
+        </w:rPr>
+        <w:t>Windows Installer (.msi)</w:t>
+      </w:r>
+      <w:r>
+        <w:rPr>
+          <w:b w:val="0"/>
+        </w:rPr>
+        <w:t xml:space="preserve">. Se descarga </w:t>
+      </w:r>
+      <w:r>
+        <w:rPr>
+          <w:rFonts w:ascii="Consolas" w:hAnsi="Consolas" w:eastAsia="Consolas"/>
+          <w:color w:val="003D7A"/>
+        </w:rPr>
+        <w:t>node-v24.21.0-x64.msi</w:t>
+      </w:r>
+      <w:r>
+        <w:rPr>
+          <w:b w:val="0"/>
+        </w:rPr>
+        <w:t>, de unos 32 MB. Si cuando entres ya salió otra 24 más nueva (por ejemplo 24.22), sirve igual, siempre que sea 24 y diga LTS.</w:t>
+      </w:r>
+    </w:p>
+    <w:p>
+      <w:pPr>
+        <w:keepNext/>
+        <w:spacing w:before="200" w:after="80"/>
+      </w:pPr>
+      <w:r>
+        <w:rPr>
+          <w:b/>
+          <w:color w:val="0072BC"/>
+          <w:sz w:val="28"/>
+        </w:rPr>
+        <w:t>Instalación</w:t>
+      </w:r>
+    </w:p>
+    <w:p>
+      <w:pPr>
+        <w:pStyle w:val="ListNumber"/>
+        <w:spacing w:after="60"/>
+        <w:numPr>
+          <w:ilvl w:val="0"/>
+          <w:numId w:val="17"/>
+        </w:numPr>
+      </w:pPr>
+      <w:r>
+        <w:rPr>
+          <w:b w:val="0"/>
+        </w:rPr>
+        <w:t xml:space="preserve">Abre el </w:t>
+      </w:r>
+      <w:r>
+        <w:rPr>
+          <w:rFonts w:ascii="Consolas" w:hAnsi="Consolas" w:eastAsia="Consolas"/>
+          <w:color w:val="003D7A"/>
+        </w:rPr>
+        <w:t>.msi</w:t>
+      </w:r>
+      <w:r>
+        <w:rPr>
+          <w:b w:val="0"/>
+        </w:rPr>
+        <w:t xml:space="preserve">, dale </w:t>
+      </w:r>
+      <w:r>
+        <w:rPr>
+          <w:b/>
+        </w:rPr>
+        <w:t>Next</w:t>
+      </w:r>
+      <w:r>
+        <w:rPr>
+          <w:b w:val="0"/>
+        </w:rPr>
+        <w:t xml:space="preserve"> y acepta la licencia.</w:t>
+      </w:r>
+    </w:p>
+    <w:p>
+      <w:pPr>
+        <w:pStyle w:val="ListNumber"/>
+        <w:spacing w:after="60"/>
+        <w:numPr>
+          <w:ilvl w:val="0"/>
+          <w:numId w:val="17"/>
+        </w:numPr>
+      </w:pPr>
+      <w:r>
+        <w:rPr>
+          <w:b w:val="0"/>
+        </w:rPr>
+        <w:t>Deja la carpeta que propone (</w:t>
+      </w:r>
+      <w:r>
+        <w:rPr>
+          <w:rFonts w:ascii="Consolas" w:hAnsi="Consolas" w:eastAsia="Consolas"/>
+          <w:color w:val="003D7A"/>
+        </w:rPr>
+        <w:t>C:\Program Files\nodejs\</w:t>
+      </w:r>
+      <w:r>
+        <w:rPr>
+          <w:b w:val="0"/>
+        </w:rPr>
+        <w:t>).</w:t>
+      </w:r>
+    </w:p>
+    <w:p>
+      <w:pPr>
+        <w:pStyle w:val="ListNumber"/>
+        <w:spacing w:after="60"/>
+        <w:numPr>
+          <w:ilvl w:val="0"/>
+          <w:numId w:val="17"/>
+        </w:numPr>
+      </w:pPr>
+      <w:r>
+        <w:rPr>
+          <w:b w:val="0"/>
+        </w:rPr>
+        <w:t xml:space="preserve">En </w:t>
+      </w:r>
+      <w:r>
+        <w:rPr>
+          <w:b/>
+        </w:rPr>
+        <w:t>Custom Setup</w:t>
+      </w:r>
+      <w:r>
+        <w:rPr>
+          <w:b w:val="0"/>
+        </w:rPr>
+        <w:t xml:space="preserve"> deja todo como viene. Ahí está </w:t>
+      </w:r>
+      <w:r>
+        <w:rPr>
+          <w:b/>
+        </w:rPr>
+        <w:t>Add to PATH</w:t>
+      </w:r>
+      <w:r>
+        <w:rPr>
+          <w:b w:val="0"/>
+        </w:rPr>
+        <w:t xml:space="preserve">, que es lo que permite usar </w:t>
+      </w:r>
+      <w:r>
+        <w:rPr>
+          <w:rFonts w:ascii="Consolas" w:hAnsi="Consolas" w:eastAsia="Consolas"/>
+          <w:color w:val="003D7A"/>
+        </w:rPr>
+        <w:t>node</w:t>
+      </w:r>
+      <w:r>
+        <w:rPr>
+          <w:b w:val="0"/>
+        </w:rPr>
+        <w:t xml:space="preserve"> y </w:t>
+      </w:r>
+      <w:r>
+        <w:rPr>
+          <w:rFonts w:ascii="Consolas" w:hAnsi="Consolas" w:eastAsia="Consolas"/>
+          <w:color w:val="003D7A"/>
+        </w:rPr>
+        <w:t>npm</w:t>
+      </w:r>
+      <w:r>
+        <w:rPr>
+          <w:b w:val="0"/>
+        </w:rPr>
+        <w:t xml:space="preserve"> desde PowerShell.</w:t>
+      </w:r>
+    </w:p>
+    <w:p>
+      <w:pPr>
+        <w:pStyle w:val="ListNumber"/>
+        <w:spacing w:after="60"/>
+        <w:numPr>
+          <w:ilvl w:val="0"/>
+          <w:numId w:val="17"/>
+        </w:numPr>
+      </w:pPr>
+      <w:r>
+        <w:rPr>
+          <w:b w:val="0"/>
+        </w:rPr>
+        <w:t xml:space="preserve">En </w:t>
+      </w:r>
+      <w:r>
+        <w:rPr>
+          <w:b/>
+        </w:rPr>
+        <w:t>Tools for Native Modules</w:t>
+      </w:r>
+      <w:r>
+        <w:rPr>
+          <w:b w:val="0"/>
+        </w:rPr>
+        <w:t xml:space="preserve"> deja </w:t>
+      </w:r>
+      <w:r>
+        <w:rPr>
+          <w:b/>
+        </w:rPr>
+        <w:t>sin marcar</w:t>
+      </w:r>
+      <w:r>
+        <w:rPr>
+          <w:b w:val="0"/>
+        </w:rPr>
+        <w:t xml:space="preserve"> la casilla que instala herramientas adicionales (Python, Visual Studio Build Tools y Chocolatey). No las necesitamos y tardan mucho.</w:t>
+      </w:r>
+    </w:p>
+    <w:p>
+      <w:pPr>
+        <w:pStyle w:val="ListNumber"/>
+        <w:spacing w:after="60"/>
+        <w:numPr>
+          <w:ilvl w:val="0"/>
+          <w:numId w:val="17"/>
+        </w:numPr>
+      </w:pPr>
+      <w:r>
+        <w:rPr>
+          <w:b w:val="0"/>
+        </w:rPr>
+        <w:t xml:space="preserve">Dale </w:t>
+      </w:r>
+      <w:r>
+        <w:rPr>
+          <w:b/>
+        </w:rPr>
+        <w:t>Install</w:t>
+      </w:r>
+      <w:r>
+        <w:rPr>
+          <w:b w:val="0"/>
+        </w:rPr>
+        <w:t xml:space="preserve">, acepta el permiso de administrador y al final </w:t>
+      </w:r>
+      <w:r>
+        <w:rPr>
+          <w:b/>
+        </w:rPr>
+        <w:t>Finish</w:t>
+      </w:r>
+      <w:r>
+        <w:rPr>
+          <w:b w:val="0"/>
+        </w:rPr>
+        <w:t>.</w:t>
+      </w:r>
+    </w:p>
+    <w:p>
+      <w:pPr>
+        <w:keepNext/>
+        <w:spacing w:before="200" w:after="80"/>
+      </w:pPr>
+      <w:r>
+        <w:rPr>
+          <w:b/>
+          <w:color w:val="0072BC"/>
+          <w:sz w:val="28"/>
+        </w:rPr>
+        <w:t>Comprobar</w:t>
+      </w:r>
+    </w:p>
+    <w:p>
+      <w:pPr>
+        <w:keepNext/>
+      </w:pPr>
+      <w:r>
+        <w:rPr>
+          <w:b w:val="0"/>
+        </w:rPr>
+        <w:t>Abre un PowerShell nuevo y escribe:</w:t>
+      </w:r>
+    </w:p>
+    <w:tbl>
+      <w:tblPr>
+        <w:tblW w:type="auto" w:w="0"/>
+        <w:jc w:val="center"/>
+        <w:tblLook w:firstColumn="1" w:firstRow="1" w:lastColumn="0" w:lastRow="0" w:noHBand="0" w:noVBand="1" w:val="04A0"/>
+      </w:tblPr>
+      <w:tblGrid>
+        <w:gridCol w:w="9632"/>
+      </w:tblGrid>
+      <w:tr>
+        <w:trPr>
+          <w:cantSplit/>
+        </w:trPr>
+        <w:tc>
+          <w:tcPr>
+            <w:tcW w:type="dxa" w:w="9632"/>
+            <w:shd w:val="clear" w:color="auto" w:fill="F2F5F9"/>
+            <w:tcBorders>
+              <w:top w:val="nil"/>
+              <w:left w:val="single" w:sz="18" w:color="0072BC"/>
+              <w:bottom w:val="nil"/>
+              <w:right w:val="nil"/>
+            </w:tcBorders>
+          </w:tcPr>
+          <w:p>
+            <w:pPr>
+              <w:keepNext/>
+              <w:spacing w:after="0" w:line="240" w:lineRule="auto"/>
+            </w:pPr>
+            <w:r/>
+            <w:r>
+              <w:rPr>
+                <w:rFonts w:ascii="Consolas" w:hAnsi="Consolas" w:eastAsia="Consolas"/>
+                <w:color w:val="1F2933"/>
+                <w:sz w:val="19"/>
+              </w:rPr>
+              <w:t>node -v</w:t>
+            </w:r>
+          </w:p>
+          <w:p>
+            <w:pPr>
+              <w:keepNext/>
+              <w:spacing w:after="0" w:line="240" w:lineRule="auto"/>
+            </w:pPr>
+            <w:r>
+              <w:rPr>
+                <w:rFonts w:ascii="Consolas" w:hAnsi="Consolas" w:eastAsia="Consolas"/>
+                <w:color w:val="1F2933"/>
+                <w:sz w:val="19"/>
+              </w:rPr>
+              <w:t>npm -v</w:t>
+            </w:r>
+          </w:p>
+        </w:tc>
+      </w:tr>
+    </w:tbl>
+    <w:p>
+      <w:pPr>
+        <w:keepNext/>
+        <w:spacing w:after="40"/>
+      </w:pPr>
+    </w:p>
+    <w:tbl>
+      <w:tblPr>
+        <w:tblW w:type="auto" w:w="0"/>
+        <w:jc w:val="center"/>
+        <w:tblLook w:firstColumn="1" w:firstRow="1" w:lastColumn="0" w:lastRow="0" w:noHBand="0" w:noVBand="1" w:val="04A0"/>
+      </w:tblPr>
+      <w:tblGrid>
+        <w:gridCol w:w="9632"/>
+      </w:tblGrid>
+      <w:tr>
+        <w:trPr>
+          <w:cantSplit/>
+        </w:trPr>
+        <w:tc>
+          <w:tcPr>
+            <w:tcW w:type="dxa" w:w="9632"/>
+            <w:shd w:val="clear" w:color="auto" w:fill="F2F5F9"/>
+            <w:tcBorders>
+              <w:top w:val="nil"/>
+              <w:left w:val="single" w:sz="18" w:color="0072BC"/>
+              <w:bottom w:val="nil"/>
+              <w:right w:val="nil"/>
+            </w:tcBorders>
+          </w:tcPr>
+          <w:p>
+            <w:r/>
+            <w:r>
+              <w:rPr>
+                <w:b/>
+                <w:color w:val="52606D"/>
+                <w:sz w:val="18"/>
+              </w:rPr>
+              <w:t>Debe salir algo parecido a esto</w:t>
+            </w:r>
+          </w:p>
+          <w:p>
+            <w:pPr>
+              <w:keepNext/>
+              <w:spacing w:after="0" w:line="240" w:lineRule="auto"/>
+            </w:pPr>
+            <w:r>
+              <w:rPr>
+                <w:rFonts w:ascii="Consolas" w:hAnsi="Consolas" w:eastAsia="Consolas"/>
+                <w:color w:val="1F2933"/>
+                <w:sz w:val="19"/>
+              </w:rPr>
+              <w:t>v24.21.0</w:t>
+            </w:r>
+          </w:p>
+          <w:p>
+            <w:pPr>
+              <w:keepNext/>
+              <w:spacing w:after="0" w:line="240" w:lineRule="auto"/>
+            </w:pPr>
+            <w:r>
+              <w:rPr>
+                <w:rFonts w:ascii="Consolas" w:hAnsi="Consolas" w:eastAsia="Consolas"/>
+                <w:color w:val="1F2933"/>
+                <w:sz w:val="19"/>
+              </w:rPr>
+              <w:t>11.19.0</w:t>
+            </w:r>
+          </w:p>
+        </w:tc>
+      </w:tr>
+    </w:tbl>
+    <w:p>
+      <w:pPr>
+        <w:spacing w:after="40"/>
+      </w:pPr>
+    </w:p>
+    <w:p>
+      <w:r>
+        <w:rPr>
+          <w:b w:val="0"/>
+        </w:rPr>
+        <w:t xml:space="preserve">Si </w:t>
+      </w:r>
+      <w:r>
+        <w:rPr>
+          <w:rFonts w:ascii="Consolas" w:hAnsi="Consolas" w:eastAsia="Consolas"/>
+          <w:color w:val="003D7A"/>
+        </w:rPr>
+        <w:t>npm -v</w:t>
+      </w:r>
+      <w:r>
+        <w:rPr>
+          <w:b w:val="0"/>
+        </w:rPr>
+        <w:t xml:space="preserve"> responde con un error rojo que dice que </w:t>
+      </w:r>
+      <w:r>
+        <w:rPr>
+          <w:b/>
+        </w:rPr>
+        <w:t>no se puede cargar el archivo npm.ps1 porque la ejecución de scripts está deshabilitada</w:t>
+      </w:r>
+      <w:r>
+        <w:rPr>
+          <w:b w:val="0"/>
+        </w:rPr>
+        <w:t xml:space="preserve">, es normal en Windows: PowerShell bloquea los scripts por defecto. Se arregla una sola vez con el comando del problema "La ejecución de scripts está deshabilitada", al final de la guía. Si </w:t>
+      </w:r>
+      <w:r>
+        <w:rPr>
+          <w:rFonts w:ascii="Consolas" w:hAnsi="Consolas" w:eastAsia="Consolas"/>
+          <w:color w:val="003D7A"/>
+        </w:rPr>
+        <w:t>node</w:t>
+      </w:r>
+      <w:r>
+        <w:rPr>
+          <w:b w:val="0"/>
+        </w:rPr>
+        <w:t xml:space="preserve"> o </w:t>
+      </w:r>
+      <w:r>
+        <w:rPr>
+          <w:rFonts w:ascii="Consolas" w:hAnsi="Consolas" w:eastAsia="Consolas"/>
+          <w:color w:val="003D7A"/>
+        </w:rPr>
+        <w:t>npm</w:t>
+      </w:r>
+      <w:r>
+        <w:rPr>
+          <w:b w:val="0"/>
+        </w:rPr>
+        <w:t xml:space="preserve"> no se reconocen, cierra y abre PowerShell.</w:t>
+      </w:r>
+    </w:p>
+    <w:p>
+      <w:pPr>
+        <w:keepNext/>
+        <w:spacing w:before="240" w:after="160"/>
+        <w:pBdr>
+          <w:bottom w:val="single" w:sz="8" w:space="4" w:color="003D7A"/>
+        </w:pBdr>
+      </w:pPr>
+      <w:r>
+        <w:rPr>
+          <w:b/>
+          <w:color w:val="003D7A"/>
+          <w:sz w:val="36"/>
+        </w:rPr>
+        <w:t>Paso 6. Visual Studio Code y la extensión de Playwright (clase 4)</w:t>
+      </w:r>
+    </w:p>
+    <w:p>
+      <w:r>
+        <w:rPr>
+          <w:b w:val="0"/>
+        </w:rPr>
+        <w:t xml:space="preserve">Visual Studio Code es el editor que usamos en la clase 4. Es gratuito y liviano. Le agregamos la extensión oficial de Microsoft </w:t>
+      </w:r>
+      <w:r>
+        <w:rPr>
+          <w:b/>
+        </w:rPr>
+        <w:t>Playwright Test for VSCode</w:t>
+      </w:r>
+      <w:r>
+        <w:rPr>
+          <w:b w:val="0"/>
+        </w:rPr>
+        <w:t>, que muestra las pruebas en una lista y las corre con un clic.</w:t>
+      </w:r>
+    </w:p>
+    <w:p>
+      <w:pPr>
+        <w:keepNext/>
+        <w:spacing w:before="200" w:after="80"/>
+      </w:pPr>
+      <w:r>
+        <w:rPr>
+          <w:b/>
+          <w:color w:val="0072BC"/>
+          <w:sz w:val="28"/>
+        </w:rPr>
+        <w:t>Descarga</w:t>
+      </w:r>
+    </w:p>
+    <w:tbl>
+      <w:tblPr>
+        <w:tblW w:type="auto" w:w="0"/>
+        <w:jc w:val="center"/>
+        <w:tblLook w:firstColumn="1" w:firstRow="1" w:lastColumn="0" w:lastRow="0" w:noHBand="0" w:noVBand="1" w:val="04A0"/>
+      </w:tblPr>
+      <w:tblGrid>
+        <w:gridCol w:w="9632"/>
+      </w:tblGrid>
+      <w:tr>
+        <w:trPr>
+          <w:cantSplit/>
+        </w:trPr>
+        <w:tc>
+          <w:tcPr>
+            <w:tcW w:type="dxa" w:w="9632"/>
+            <w:shd w:val="clear" w:color="auto" w:fill="F2F5F9"/>
+            <w:tcBorders>
+              <w:top w:val="nil"/>
+              <w:left w:val="single" w:sz="18" w:color="0072BC"/>
+              <w:bottom w:val="nil"/>
+              <w:right w:val="nil"/>
+            </w:tcBorders>
+          </w:tcPr>
+          <w:p>
+            <w:pPr>
+              <w:keepNext/>
+              <w:spacing w:after="0" w:line="240" w:lineRule="auto"/>
+            </w:pPr>
+            <w:r/>
+            <w:r>
+              <w:rPr>
+                <w:rFonts w:ascii="Consolas" w:hAnsi="Consolas" w:eastAsia="Consolas"/>
+                <w:color w:val="1F2933"/>
+                <w:sz w:val="19"/>
+              </w:rPr>
+              <w:t>https://code.visualstudio.com/download</w:t>
+            </w:r>
+          </w:p>
+        </w:tc>
+      </w:tr>
+    </w:tbl>
+    <w:p>
+      <w:pPr>
+        <w:spacing w:after="40"/>
+      </w:pPr>
+    </w:p>
+    <w:p>
+      <w:pPr>
+        <w:keepNext/>
+        <w:jc w:val="center"/>
+      </w:pPr>
+      <w:r>
+        <w:drawing>
+          <wp:inline xmlns:a="http://schemas.openxmlformats.org/drawingml/2006/main" xmlns:pic="http://schemas.openxmlformats.org/drawingml/2006/picture">
+            <wp:extent cx="3420000" cy="2067033"/>
+            <wp:docPr id="6" name="Picture 6"/>
+            <wp:cNvGraphicFramePr>
+              <a:graphicFrameLocks noChangeAspect="1"/>
+            </wp:cNvGraphicFramePr>
+            <a:graphic>
+              <a:graphicData uri="http://schemas.openxmlformats.org/drawingml/2006/picture">
+                <pic:pic>
+                  <pic:nvPicPr>
+                    <pic:cNvPr id="0" name="vscode.png"/>
+                    <pic:cNvPicPr/>
+                  </pic:nvPicPr>
+                  <pic:blipFill>
+                    <a:blip r:embed="rId15"/>
+                    <a:stretch>
+                      <a:fillRect/>
+                    </a:stretch>
+                  </pic:blipFill>
+                  <pic:spPr>
+                    <a:xfrm>
+                      <a:off x="0" y="0"/>
+                      <a:ext cx="3420000" cy="2067033"/>
+                    </a:xfrm>
+                    <a:prstGeom prst="rect"/>
+                  </pic:spPr>
+                </pic:pic>
+              </a:graphicData>
+            </a:graphic>
+          </wp:inline>
+        </w:drawing>
+      </w:r>
+    </w:p>
+    <w:p>
+      <w:pPr>
+        <w:jc w:val="center"/>
+      </w:pPr>
+      <w:r>
+        <w:rPr>
+          <w:b w:val="0"/>
+          <w:color w:val="52606D"/>
+          <w:sz w:val="18"/>
+        </w:rPr>
+        <w:t>Página de descarga de Visual Studio Code. El botón Windows descarga el instalador de usuario de 64 bits.</w:t>
+      </w:r>
+    </w:p>
+    <w:p>
+      <w:r>
+        <w:rPr>
+          <w:b w:val="0"/>
+        </w:rPr>
+        <w:t xml:space="preserve">Dale clic en el botón </w:t>
+      </w:r>
+      <w:r>
+        <w:rPr>
+          <w:b/>
+        </w:rPr>
+        <w:t>Windows</w:t>
+      </w:r>
+      <w:r>
+        <w:rPr>
+          <w:b w:val="0"/>
+        </w:rPr>
+        <w:t xml:space="preserve"> (Windows 10, 11). Se descarga el instalador de usuario de 64 bits, que hoy es </w:t>
+      </w:r>
+      <w:r>
+        <w:rPr>
+          <w:rFonts w:ascii="Consolas" w:hAnsi="Consolas" w:eastAsia="Consolas"/>
+          <w:color w:val="003D7A"/>
+        </w:rPr>
+        <w:t>VSCodeUserSetup-x64-1.138.0.exe</w:t>
+      </w:r>
+      <w:r>
+        <w:rPr>
+          <w:b w:val="0"/>
+        </w:rPr>
+        <w:t xml:space="preserve"> (unos 225 MB). Este instalador no pide permiso de administrador.</w:t>
+      </w:r>
+    </w:p>
+    <w:p>
+      <w:pPr>
+        <w:keepNext/>
+        <w:spacing w:before="200" w:after="80"/>
+      </w:pPr>
+      <w:r>
+        <w:rPr>
+          <w:b/>
+          <w:color w:val="0072BC"/>
+          <w:sz w:val="28"/>
+        </w:rPr>
+        <w:t>Instalación</w:t>
+      </w:r>
+    </w:p>
+    <w:p>
+      <w:pPr>
+        <w:pStyle w:val="ListNumber"/>
+        <w:spacing w:after="60"/>
+        <w:numPr>
+          <w:ilvl w:val="0"/>
+          <w:numId w:val="18"/>
+        </w:numPr>
+      </w:pPr>
+      <w:r>
+        <w:rPr>
+          <w:b w:val="0"/>
+        </w:rPr>
+        <w:t xml:space="preserve">Abre el </w:t>
+      </w:r>
+      <w:r>
+        <w:rPr>
+          <w:rFonts w:ascii="Consolas" w:hAnsi="Consolas" w:eastAsia="Consolas"/>
+          <w:color w:val="003D7A"/>
+        </w:rPr>
+        <w:t>.exe</w:t>
+      </w:r>
+      <w:r>
+        <w:rPr>
+          <w:b w:val="0"/>
+        </w:rPr>
+        <w:t xml:space="preserve">, acepta el acuerdo de licencia y dale </w:t>
+      </w:r>
+      <w:r>
+        <w:rPr>
+          <w:b/>
+        </w:rPr>
+        <w:t>Siguiente</w:t>
+      </w:r>
+      <w:r>
+        <w:rPr>
+          <w:b w:val="0"/>
+        </w:rPr>
+        <w:t xml:space="preserve"> (o Next).</w:t>
+      </w:r>
+    </w:p>
+    <w:p>
+      <w:pPr>
+        <w:pStyle w:val="ListNumber"/>
+        <w:spacing w:after="60"/>
+        <w:numPr>
+          <w:ilvl w:val="0"/>
+          <w:numId w:val="18"/>
+        </w:numPr>
+      </w:pPr>
+      <w:r>
+        <w:rPr>
+          <w:b w:val="0"/>
+        </w:rPr>
+        <w:t>Deja la carpeta que propone.</w:t>
+      </w:r>
+    </w:p>
+    <w:p>
+      <w:pPr>
+        <w:pStyle w:val="ListNumber"/>
+        <w:spacing w:after="60"/>
+        <w:numPr>
+          <w:ilvl w:val="0"/>
+          <w:numId w:val="18"/>
+        </w:numPr>
+      </w:pPr>
+      <w:r>
+        <w:rPr>
+          <w:b w:val="0"/>
+        </w:rPr>
+        <w:t xml:space="preserve">En </w:t>
+      </w:r>
+      <w:r>
+        <w:rPr>
+          <w:b/>
+        </w:rPr>
+        <w:t>Seleccione las tareas adicionales</w:t>
+      </w:r>
+      <w:r>
+        <w:rPr>
+          <w:b w:val="0"/>
+        </w:rPr>
+        <w:t xml:space="preserve"> revisa que quede marcado </w:t>
+      </w:r>
+      <w:r>
+        <w:rPr>
+          <w:b/>
+        </w:rPr>
+        <w:t>Agregar a PATH</w:t>
+      </w:r>
+      <w:r>
+        <w:rPr>
+          <w:b w:val="0"/>
+        </w:rPr>
+        <w:t xml:space="preserve"> (en inglés, Add to PATH). Te recomiendo marcar también las dos opciones de </w:t>
+      </w:r>
+      <w:r>
+        <w:rPr>
+          <w:b/>
+        </w:rPr>
+        <w:t>Agregar la acción "Abrir con Code"</w:t>
+      </w:r>
+      <w:r>
+        <w:rPr>
+          <w:b w:val="0"/>
+        </w:rPr>
+        <w:t xml:space="preserve"> al menú contextual del Explorador, para abrir una carpeta con clic derecho.</w:t>
+      </w:r>
+    </w:p>
+    <w:p>
+      <w:pPr>
+        <w:pStyle w:val="ListNumber"/>
+        <w:spacing w:after="60"/>
+        <w:numPr>
+          <w:ilvl w:val="0"/>
+          <w:numId w:val="18"/>
+        </w:numPr>
+      </w:pPr>
+      <w:r>
+        <w:rPr>
+          <w:b w:val="0"/>
+        </w:rPr>
+        <w:t xml:space="preserve">Dale </w:t>
+      </w:r>
+      <w:r>
+        <w:rPr>
+          <w:b/>
+        </w:rPr>
+        <w:t>Instalar</w:t>
+      </w:r>
+      <w:r>
+        <w:rPr>
+          <w:b w:val="0"/>
+        </w:rPr>
+        <w:t xml:space="preserve"> y al final </w:t>
+      </w:r>
+      <w:r>
+        <w:rPr>
+          <w:b/>
+        </w:rPr>
+        <w:t>Finalizar</w:t>
+      </w:r>
+      <w:r>
+        <w:rPr>
+          <w:b w:val="0"/>
+        </w:rPr>
+        <w:t>.</w:t>
+      </w:r>
+    </w:p>
+    <w:p>
+      <w:pPr>
+        <w:keepNext/>
+        <w:spacing w:before="200" w:after="80"/>
+      </w:pPr>
+      <w:r>
+        <w:rPr>
+          <w:b/>
+          <w:color w:val="0072BC"/>
+          <w:sz w:val="28"/>
+        </w:rPr>
+        <w:t>Instalar la extensión y comprobar</w:t>
+      </w:r>
+    </w:p>
+    <w:p>
+      <w:pPr>
+        <w:pStyle w:val="ListNumber"/>
+        <w:spacing w:after="60"/>
+        <w:numPr>
+          <w:ilvl w:val="0"/>
+          <w:numId w:val="19"/>
+        </w:numPr>
+      </w:pPr>
+      <w:r>
+        <w:rPr>
+          <w:b w:val="0"/>
+        </w:rPr>
+        <w:t xml:space="preserve">Abre Visual Studio Code y dale clic al ícono de </w:t>
+      </w:r>
+      <w:r>
+        <w:rPr>
+          <w:b/>
+        </w:rPr>
+        <w:t>Extensiones</w:t>
+      </w:r>
+      <w:r>
+        <w:rPr>
+          <w:b w:val="0"/>
+        </w:rPr>
+        <w:t xml:space="preserve"> en la barra de la izquierda (los cuatro cuadritos) o presiona Ctrl+Shift+X.</w:t>
+      </w:r>
+    </w:p>
+    <w:p>
+      <w:pPr>
+        <w:pStyle w:val="ListNumber"/>
+        <w:spacing w:after="60"/>
+        <w:numPr>
+          <w:ilvl w:val="0"/>
+          <w:numId w:val="19"/>
+        </w:numPr>
+      </w:pPr>
+      <w:r>
+        <w:rPr>
+          <w:b w:val="0"/>
+        </w:rPr>
+        <w:t xml:space="preserve">Busca </w:t>
+      </w:r>
+      <w:r>
+        <w:rPr>
+          <w:rFonts w:ascii="Consolas" w:hAnsi="Consolas" w:eastAsia="Consolas"/>
+          <w:color w:val="003D7A"/>
+        </w:rPr>
+        <w:t>Playwright Test for VSCode</w:t>
+      </w:r>
+      <w:r>
+        <w:rPr>
+          <w:b w:val="0"/>
+        </w:rPr>
+        <w:t xml:space="preserve">. Debe decir que es de </w:t>
+      </w:r>
+      <w:r>
+        <w:rPr>
+          <w:b/>
+        </w:rPr>
+        <w:t>Microsoft</w:t>
+      </w:r>
+      <w:r>
+        <w:rPr>
+          <w:b w:val="0"/>
+        </w:rPr>
+        <w:t xml:space="preserve"> (su identificador es </w:t>
+      </w:r>
+      <w:r>
+        <w:rPr>
+          <w:rFonts w:ascii="Consolas" w:hAnsi="Consolas" w:eastAsia="Consolas"/>
+          <w:color w:val="003D7A"/>
+        </w:rPr>
+        <w:t>ms-playwright.playwright</w:t>
+      </w:r>
+      <w:r>
+        <w:rPr>
+          <w:b w:val="0"/>
+        </w:rPr>
+        <w:t xml:space="preserve">). Dale </w:t>
+      </w:r>
+      <w:r>
+        <w:rPr>
+          <w:b/>
+        </w:rPr>
+        <w:t>Install</w:t>
+      </w:r>
+      <w:r>
+        <w:rPr>
+          <w:b w:val="0"/>
+        </w:rPr>
+        <w:t>.</w:t>
+      </w:r>
+    </w:p>
+    <w:p>
+      <w:pPr>
+        <w:pStyle w:val="ListNumber"/>
+        <w:spacing w:after="60"/>
+        <w:numPr>
+          <w:ilvl w:val="0"/>
+          <w:numId w:val="19"/>
+        </w:numPr>
+      </w:pPr>
+      <w:r>
+        <w:rPr>
+          <w:b w:val="0"/>
+        </w:rPr>
+        <w:t xml:space="preserve">En la barra de la izquierda aparece la pestaña </w:t>
+      </w:r>
+      <w:r>
+        <w:rPr>
+          <w:b/>
+        </w:rPr>
+        <w:t>Testing</w:t>
+      </w:r>
+      <w:r>
+        <w:rPr>
+          <w:b w:val="0"/>
+        </w:rPr>
+        <w:t xml:space="preserve"> (</w:t>
+      </w:r>
+      <w:r>
+        <w:rPr>
+          <w:b/>
+        </w:rPr>
+        <w:t>Pruebas</w:t>
+      </w:r>
+      <w:r>
+        <w:rPr>
+          <w:b w:val="0"/>
+        </w:rPr>
+        <w:t xml:space="preserve"> si tienes el editor en español), con el ícono de un matraz. Cuando abras la carpeta del proyecto de la clase 4, ahí vas a ver sus pruebas.</w:t>
+      </w:r>
+    </w:p>
+    <w:p>
+      <w:r>
+        <w:rPr>
+          <w:b w:val="0"/>
+        </w:rPr>
+        <w:t xml:space="preserve">Para comprobar desde PowerShell, abre una ventana nueva y escribe </w:t>
+      </w:r>
+      <w:r>
+        <w:rPr>
+          <w:rFonts w:ascii="Consolas" w:hAnsi="Consolas" w:eastAsia="Consolas"/>
+          <w:color w:val="003D7A"/>
+        </w:rPr>
+        <w:t>code --version</w:t>
+      </w:r>
+      <w:r>
+        <w:rPr>
+          <w:b w:val="0"/>
+        </w:rPr>
+        <w:t xml:space="preserve">. Deben salir tres líneas: la versión (por ejemplo 1.138.0), un código largo y </w:t>
+      </w:r>
+      <w:r>
+        <w:rPr>
+          <w:rFonts w:ascii="Consolas" w:hAnsi="Consolas" w:eastAsia="Consolas"/>
+          <w:color w:val="003D7A"/>
+        </w:rPr>
+        <w:t>x64</w:t>
+      </w:r>
+      <w:r>
+        <w:rPr>
+          <w:b w:val="0"/>
+        </w:rPr>
+        <w:t>.</w:t>
+      </w:r>
+    </w:p>
+    <w:p>
+      <w:pPr>
+        <w:keepNext/>
+        <w:spacing w:before="240" w:after="160"/>
+        <w:pBdr>
+          <w:bottom w:val="single" w:sz="8" w:space="4" w:color="003D7A"/>
+        </w:pBdr>
+      </w:pPr>
+      <w:r>
+        <w:rPr>
+          <w:b/>
+          <w:color w:val="003D7A"/>
+          <w:sz w:val="36"/>
+        </w:rPr>
+        <w:t>Paso 7. Google Chrome</w:t>
+      </w:r>
+    </w:p>
+    <w:p>
+      <w:r>
+        <w:rPr>
+          <w:b w:val="0"/>
+        </w:rPr>
+        <w:t xml:space="preserve">En la clase 2 (Serenity con Selenium) las pruebas abren Chrome y lo manejan solas. Si ya lo tienes instalado, solo actualízalo desde el menú de los tres puntos, </w:t>
+      </w:r>
+      <w:r>
+        <w:rPr>
+          <w:b/>
         </w:rPr>
         <w:t>Ayuda &gt; Información de Google Chrome</w:t>
       </w:r>
@@ -4720,7 +6053,7 @@
         <w:rPr>
           <w:b w:val="0"/>
         </w:rPr>
-        <w:t>, y sigue al paso 6.</w:t>
+        <w:t>, y sigue al paso 8.</w:t>
       </w:r>
     </w:p>
     <w:tbl>
@@ -4778,8 +6111,8 @@
       <w:r>
         <w:drawing>
           <wp:inline xmlns:a="http://schemas.openxmlformats.org/drawingml/2006/main" xmlns:pic="http://schemas.openxmlformats.org/drawingml/2006/picture">
-            <wp:extent cx="5040000" cy="2805567"/>
-            <wp:docPr id="5" name="Picture 5"/>
+            <wp:extent cx="3420000" cy="1903777"/>
+            <wp:docPr id="7" name="Picture 7"/>
             <wp:cNvGraphicFramePr>
               <a:graphicFrameLocks noChangeAspect="1"/>
             </wp:cNvGraphicFramePr>
@@ -4791,7 +6124,7 @@
                     <pic:cNvPicPr/>
                   </pic:nvPicPr>
                   <pic:blipFill>
-                    <a:blip r:embed="rId14"/>
+                    <a:blip r:embed="rId16"/>
                     <a:stretch>
                       <a:fillRect/>
                     </a:stretch>
@@ -4799,7 +6132,7 @@
                   <pic:spPr>
                     <a:xfrm>
                       <a:off x="0" y="0"/>
-                      <a:ext cx="5040000" cy="2805567"/>
+                      <a:ext cx="3420000" cy="1903777"/>
                     </a:xfrm>
                     <a:prstGeom prst="rect"/>
                   </pic:spPr>
@@ -4829,7 +6162,7 @@
         <w:spacing w:after="60"/>
         <w:numPr>
           <w:ilvl w:val="0"/>
-          <w:numId w:val="17"/>
+          <w:numId w:val="20"/>
         </w:numPr>
       </w:pPr>
       <w:r>
@@ -4869,7 +6202,7 @@
         <w:spacing w:after="60"/>
         <w:numPr>
           <w:ilvl w:val="0"/>
-          <w:numId w:val="17"/>
+          <w:numId w:val="20"/>
         </w:numPr>
       </w:pPr>
       <w:r>
@@ -4898,7 +6231,7 @@
         <w:spacing w:after="60"/>
         <w:numPr>
           <w:ilvl w:val="0"/>
-          <w:numId w:val="17"/>
+          <w:numId w:val="20"/>
         </w:numPr>
       </w:pPr>
       <w:r>
@@ -4934,7 +6267,7 @@
           <w:color w:val="003D7A"/>
           <w:sz w:val="36"/>
         </w:rPr>
-        <w:t>Paso 6. Clonar el repositorio y cambiar de rama</w:t>
+        <w:t>Paso 8. Clonar el repositorio y cambiar de rama</w:t>
       </w:r>
     </w:p>
     <w:p>
@@ -5362,7 +6695,85 @@
         <w:rPr>
           <w:b w:val="0"/>
         </w:rPr>
-        <w:t>. Para cada clase haces lo mismo con el nombre de su rama.</w:t>
+        <w:t xml:space="preserve">. Para cada clase haces lo mismo con el nombre de su rama. La rama 04 es distinta porque es TypeScript: en vez de </w:t>
+      </w:r>
+      <w:r>
+        <w:rPr>
+          <w:rFonts w:ascii="Consolas" w:hAnsi="Consolas" w:eastAsia="Consolas"/>
+          <w:color w:val="003D7A"/>
+        </w:rPr>
+        <w:t>build.gradle</w:t>
+      </w:r>
+      <w:r>
+        <w:rPr>
+          <w:b w:val="0"/>
+        </w:rPr>
+        <w:t xml:space="preserve"> y </w:t>
+      </w:r>
+      <w:r>
+        <w:rPr>
+          <w:rFonts w:ascii="Consolas" w:hAnsi="Consolas" w:eastAsia="Consolas"/>
+          <w:color w:val="003D7A"/>
+        </w:rPr>
+        <w:t>src</w:t>
+      </w:r>
+      <w:r>
+        <w:rPr>
+          <w:b w:val="0"/>
+        </w:rPr>
+        <w:t xml:space="preserve"> tiene </w:t>
+      </w:r>
+      <w:r>
+        <w:rPr>
+          <w:rFonts w:ascii="Consolas" w:hAnsi="Consolas" w:eastAsia="Consolas"/>
+          <w:color w:val="003D7A"/>
+        </w:rPr>
+        <w:t>package.json</w:t>
+      </w:r>
+      <w:r>
+        <w:rPr>
+          <w:b w:val="0"/>
+        </w:rPr>
+        <w:t xml:space="preserve">, </w:t>
+      </w:r>
+      <w:r>
+        <w:rPr>
+          <w:rFonts w:ascii="Consolas" w:hAnsi="Consolas" w:eastAsia="Consolas"/>
+          <w:color w:val="003D7A"/>
+        </w:rPr>
+        <w:t>playwright.config.ts</w:t>
+      </w:r>
+      <w:r>
+        <w:rPr>
+          <w:b w:val="0"/>
+        </w:rPr>
+        <w:t xml:space="preserve">, </w:t>
+      </w:r>
+      <w:r>
+        <w:rPr>
+          <w:rFonts w:ascii="Consolas" w:hAnsi="Consolas" w:eastAsia="Consolas"/>
+          <w:color w:val="003D7A"/>
+        </w:rPr>
+        <w:t>pages</w:t>
+      </w:r>
+      <w:r>
+        <w:rPr>
+          <w:b w:val="0"/>
+        </w:rPr>
+        <w:t xml:space="preserve"> y </w:t>
+      </w:r>
+      <w:r>
+        <w:rPr>
+          <w:rFonts w:ascii="Consolas" w:hAnsi="Consolas" w:eastAsia="Consolas"/>
+          <w:color w:val="003D7A"/>
+        </w:rPr>
+        <w:t>tests</w:t>
+      </w:r>
+      <w:r>
+        <w:rPr>
+          <w:b w:val="0"/>
+        </w:rPr>
+        <w:t>.</w:t>
       </w:r>
     </w:p>
     <w:p>
@@ -5400,7 +6811,7 @@
           <w:color w:val="003D7A"/>
           <w:sz w:val="36"/>
         </w:rPr>
-        <w:t>Paso 7. Navegador de Playwright (clase 4)</w:t>
+        <w:t>Paso 9. Librerías y navegador de Playwright (clase 4)</w:t>
       </w:r>
     </w:p>
     <w:p>
@@ -5411,7 +6822,7 @@
         <w:rPr>
           <w:b w:val="0"/>
         </w:rPr>
-        <w:t>Playwright no usa el Chrome que instalaste: trae su propio navegador, Chromium, y hay que descargarlo una vez por equipo. El proyecto de la clase 4 tiene una tarea de Gradle que lo hace por ti. Puedes dejar este paso para antes de la clase 4, pero mejor hazlo ahora, porque ocupa cerca de 560 MB en disco:</w:t>
+        <w:t>Playwright no usa el Chrome que instalaste: trae su propio navegador, Chromium, y hay que descargarlo una vez por equipo. Puedes dejar este paso para antes de la clase 4, pero mejor hazlo con tiempo porque son descargas grandes. En un PowerShell nuevo:</w:t>
       </w:r>
     </w:p>
     <w:tbl>
@@ -5478,7 +6889,21 @@
                 <w:color w:val="1F2933"/>
                 <w:sz w:val="19"/>
               </w:rPr>
-              <w:t>gradle instalarNavegadores</w:t>
+              <w:t>npm ci</w:t>
+            </w:r>
+          </w:p>
+          <w:p>
+            <w:pPr>
+              <w:keepNext/>
+              <w:spacing w:after="0" w:line="240" w:lineRule="auto"/>
+            </w:pPr>
+            <w:r>
+              <w:rPr>
+                <w:rFonts w:ascii="Consolas" w:hAnsi="Consolas" w:eastAsia="Consolas"/>
+                <w:color w:val="1F2933"/>
+                <w:sz w:val="19"/>
+              </w:rPr>
+              <w:t>npx playwright install chromium</w:t>
             </w:r>
           </w:p>
         </w:tc>
@@ -5492,55 +6917,198 @@
     <w:p>
       <w:r>
         <w:rPr>
-          <w:b w:val="0"/>
-        </w:rPr>
-        <w:t xml:space="preserve">Al final debe decir </w:t>
+          <w:rFonts w:ascii="Consolas" w:hAnsi="Consolas" w:eastAsia="Consolas"/>
+          <w:color w:val="003D7A"/>
+        </w:rPr>
+        <w:t>npm ci</w:t>
+      </w:r>
+      <w:r>
+        <w:rPr>
+          <w:b w:val="0"/>
+        </w:rPr>
+        <w:t xml:space="preserve"> descarga exactamente las librerías que dice el archivo </w:t>
+      </w:r>
+      <w:r>
+        <w:rPr>
+          <w:rFonts w:ascii="Consolas" w:hAnsi="Consolas" w:eastAsia="Consolas"/>
+          <w:color w:val="003D7A"/>
+        </w:rPr>
+        <w:t>package-lock.json</w:t>
+      </w:r>
+      <w:r>
+        <w:rPr>
+          <w:b w:val="0"/>
+        </w:rPr>
+        <w:t xml:space="preserve"> del proyecto y las deja en la carpeta </w:t>
+      </w:r>
+      <w:r>
+        <w:rPr>
+          <w:rFonts w:ascii="Consolas" w:hAnsi="Consolas" w:eastAsia="Consolas"/>
+          <w:color w:val="003D7A"/>
+        </w:rPr>
+        <w:t>node_modules</w:t>
+      </w:r>
+      <w:r>
+        <w:rPr>
+          <w:b w:val="0"/>
+        </w:rPr>
+        <w:t xml:space="preserve">. </w:t>
+      </w:r>
+      <w:r>
+        <w:rPr>
+          <w:rFonts w:ascii="Consolas" w:hAnsi="Consolas" w:eastAsia="Consolas"/>
+          <w:color w:val="003D7A"/>
+        </w:rPr>
+        <w:t>npx playwright install chromium</w:t>
+      </w:r>
+      <w:r>
+        <w:rPr>
+          <w:b w:val="0"/>
+        </w:rPr>
+        <w:t xml:space="preserve"> descarga el navegador; en nuestra prueba ocupó cerca de </w:t>
       </w:r>
       <w:r>
         <w:rPr>
           <w:b/>
         </w:rPr>
-        <w:t>BUILD SUCCESSFUL</w:t>
-      </w:r>
-      <w:r>
-        <w:rPr>
-          <w:b w:val="0"/>
-        </w:rPr>
-        <w:t>. La tarea ya viene preparada para redes de empresa con proxy: le dice a Playwright que use los certificados de Windows, así que no tienes que configurar nada más.</w:t>
+        <w:t>560 MB</w:t>
+      </w:r>
+      <w:r>
+        <w:rPr>
+          <w:b w:val="0"/>
+        </w:rPr>
+        <w:t xml:space="preserve"> (Chromium, su versión sin ventana y FFmpeg). Al final no debe salir ningún error en rojo.</w:t>
       </w:r>
     </w:p>
     <w:p>
-      <w:r>
-        <w:rPr>
-          <w:b w:val="0"/>
-        </w:rPr>
-        <w:t xml:space="preserve">Si alguna vez una prueba te dice que falta el navegador y te sugiere un comando que empieza por </w:t>
+      <w:pPr>
+        <w:keepNext/>
+      </w:pPr>
+      <w:r>
+        <w:rPr>
+          <w:b w:val="0"/>
+        </w:rPr>
+        <w:t xml:space="preserve">Si estás en la red de una empresa, escribe esto </w:t>
+      </w:r>
+      <w:r>
+        <w:rPr>
+          <w:b/>
+        </w:rPr>
+        <w:t>antes</w:t>
+      </w:r>
+      <w:r>
+        <w:rPr>
+          <w:b w:val="0"/>
+        </w:rPr>
+        <w:t xml:space="preserve"> de los dos comandos, en la misma ventana. Le dice a Node.js que confíe en los certificados que tiene instalados Windows:</w:t>
+      </w:r>
+    </w:p>
+    <w:tbl>
+      <w:tblPr>
+        <w:tblW w:type="auto" w:w="0"/>
+        <w:jc w:val="center"/>
+        <w:tblLook w:firstColumn="1" w:firstRow="1" w:lastColumn="0" w:lastRow="0" w:noHBand="0" w:noVBand="1" w:val="04A0"/>
+      </w:tblPr>
+      <w:tblGrid>
+        <w:gridCol w:w="9632"/>
+      </w:tblGrid>
+      <w:tr>
+        <w:trPr>
+          <w:cantSplit/>
+        </w:trPr>
+        <w:tc>
+          <w:tcPr>
+            <w:tcW w:type="dxa" w:w="9632"/>
+            <w:shd w:val="clear" w:color="auto" w:fill="F2F5F9"/>
+            <w:tcBorders>
+              <w:top w:val="nil"/>
+              <w:left w:val="single" w:sz="18" w:color="0072BC"/>
+              <w:bottom w:val="nil"/>
+              <w:right w:val="nil"/>
+            </w:tcBorders>
+          </w:tcPr>
+          <w:p>
+            <w:pPr>
+              <w:keepNext/>
+              <w:spacing w:after="0" w:line="240" w:lineRule="auto"/>
+            </w:pPr>
+            <w:r/>
+            <w:r>
+              <w:rPr>
+                <w:rFonts w:ascii="Consolas" w:hAnsi="Consolas" w:eastAsia="Consolas"/>
+                <w:color w:val="1F2933"/>
+                <w:sz w:val="19"/>
+              </w:rPr>
+              <w:t>$env:NODE_OPTIONS="--use-system-ca"</w:t>
+            </w:r>
+          </w:p>
+          <w:p>
+            <w:pPr>
+              <w:keepNext/>
+              <w:spacing w:after="0" w:line="240" w:lineRule="auto"/>
+            </w:pPr>
+            <w:r>
+              <w:rPr>
+                <w:rFonts w:ascii="Consolas" w:hAnsi="Consolas" w:eastAsia="Consolas"/>
+                <w:color w:val="1F2933"/>
+                <w:sz w:val="19"/>
+              </w:rPr>
+              <w:t>npm ci</w:t>
+            </w:r>
+          </w:p>
+          <w:p>
+            <w:pPr>
+              <w:keepNext/>
+              <w:spacing w:after="0" w:line="240" w:lineRule="auto"/>
+            </w:pPr>
+            <w:r>
+              <w:rPr>
+                <w:rFonts w:ascii="Consolas" w:hAnsi="Consolas" w:eastAsia="Consolas"/>
+                <w:color w:val="1F2933"/>
+                <w:sz w:val="19"/>
+              </w:rPr>
+              <w:t>npx playwright install chromium</w:t>
+            </w:r>
+          </w:p>
+        </w:tc>
+      </w:tr>
+    </w:tbl>
+    <w:p>
+      <w:pPr>
+        <w:spacing w:after="40"/>
+      </w:pPr>
+    </w:p>
+    <w:p>
+      <w:r>
+        <w:rPr>
+          <w:b w:val="0"/>
+        </w:rPr>
+        <w:t xml:space="preserve">En nuestra prueba detrás del proxy de la empresa, </w:t>
       </w:r>
       <w:r>
         <w:rPr>
           <w:rFonts w:ascii="Consolas" w:hAnsi="Consolas" w:eastAsia="Consolas"/>
           <w:color w:val="003D7A"/>
         </w:rPr>
-        <w:t>mvn</w:t>
-      </w:r>
-      <w:r>
-        <w:rPr>
-          <w:b w:val="0"/>
-        </w:rPr>
-        <w:t xml:space="preserve">, ignóralo: en el semillero no usamos Maven. Corre </w:t>
-      </w:r>
-      <w:r>
-        <w:rPr>
-          <w:rFonts w:ascii="Consolas" w:hAnsi="Consolas" w:eastAsia="Consolas"/>
-          <w:color w:val="003D7A"/>
-        </w:rPr>
-        <w:t>gradle instalarNavegadores</w:t>
-      </w:r>
-      <w:r>
-        <w:rPr>
-          <w:b w:val="0"/>
-        </w:rPr>
-        <w:t xml:space="preserve"> dentro de la rama 04. Si la descarga falla por certificados, toma una captura del error y envíamela antes de la clase 4.</w:t>
+        <w:t>npm ci</w:t>
+      </w:r>
+      <w:r>
+        <w:rPr>
+          <w:b w:val="0"/>
+        </w:rPr>
+        <w:t xml:space="preserve"> funcionó sin la variable, pero la descarga del navegador falló con </w:t>
+      </w:r>
+      <w:r>
+        <w:rPr>
+          <w:b/>
+        </w:rPr>
+        <w:t>unable to get local issuer certificate</w:t>
+      </w:r>
+      <w:r>
+        <w:rPr>
+          <w:b w:val="0"/>
+        </w:rPr>
+        <w:t>; con la variable sí terminó. La variable solo dura mientras esa ventana esté abierta. Si aun así falla, toma una captura del error y envíamela antes de la clase 4.</w:t>
       </w:r>
     </w:p>
     <w:p>
@@ -5872,7 +7440,7 @@
                 <w:color w:val="003D7A"/>
                 <w:sz w:val="20"/>
               </w:rPr>
-              <w:t>git config --global user.name</w:t>
+              <w:t>node -v</w:t>
             </w:r>
           </w:p>
         </w:tc>
@@ -5895,7 +7463,7 @@
                 <w:b w:val="0"/>
                 <w:sz w:val="20"/>
               </w:rPr>
-              <w:t>Tu nombre</w:t>
+              <w:t>v24 seguido de números (por ejemplo v24.21.0)</w:t>
             </w:r>
           </w:p>
         </w:tc>
@@ -5925,6 +7493,165 @@
                 <w:color w:val="003D7A"/>
                 <w:sz w:val="20"/>
               </w:rPr>
+              <w:t>npm -v</w:t>
+            </w:r>
+          </w:p>
+        </w:tc>
+        <w:tc>
+          <w:tcPr>
+            <w:tcW w:type="dxa" w:w="5669"/>
+            <w:shd w:val="clear" w:color="auto" w:fill="F2F5F9"/>
+            <w:tcBorders>
+              <w:top w:val="single" w:sz="6" w:color="D0D7DE"/>
+              <w:left w:val="single" w:sz="6" w:color="D0D7DE"/>
+              <w:bottom w:val="single" w:sz="6" w:color="D0D7DE"/>
+              <w:right w:val="single" w:sz="6" w:color="D0D7DE"/>
+            </w:tcBorders>
+          </w:tcPr>
+          <w:p>
+            <w:pPr>
+              <w:keepNext/>
+            </w:pPr>
+            <w:r>
+              <w:rPr>
+                <w:b w:val="0"/>
+                <w:sz w:val="20"/>
+              </w:rPr>
+              <w:t>Un número de versión (por ejemplo 11.19.0), sin error rojo</w:t>
+            </w:r>
+          </w:p>
+        </w:tc>
+      </w:tr>
+      <w:tr>
+        <w:trPr>
+          <w:cantSplit/>
+        </w:trPr>
+        <w:tc>
+          <w:tcPr>
+            <w:tcW w:type="dxa" w:w="3969"/>
+            <w:tcBorders>
+              <w:top w:val="single" w:sz="6" w:color="D0D7DE"/>
+              <w:left w:val="single" w:sz="6" w:color="D0D7DE"/>
+              <w:bottom w:val="single" w:sz="6" w:color="D0D7DE"/>
+              <w:right w:val="single" w:sz="6" w:color="D0D7DE"/>
+            </w:tcBorders>
+          </w:tcPr>
+          <w:p>
+            <w:pPr>
+              <w:keepNext/>
+            </w:pPr>
+            <w:r>
+              <w:rPr>
+                <w:rFonts w:ascii="Consolas" w:hAnsi="Consolas" w:eastAsia="Consolas"/>
+                <w:color w:val="003D7A"/>
+                <w:sz w:val="20"/>
+              </w:rPr>
+              <w:t>code --version</w:t>
+            </w:r>
+          </w:p>
+        </w:tc>
+        <w:tc>
+          <w:tcPr>
+            <w:tcW w:type="dxa" w:w="5669"/>
+            <w:tcBorders>
+              <w:top w:val="single" w:sz="6" w:color="D0D7DE"/>
+              <w:left w:val="single" w:sz="6" w:color="D0D7DE"/>
+              <w:bottom w:val="single" w:sz="6" w:color="D0D7DE"/>
+              <w:right w:val="single" w:sz="6" w:color="D0D7DE"/>
+            </w:tcBorders>
+          </w:tcPr>
+          <w:p>
+            <w:pPr>
+              <w:keepNext/>
+            </w:pPr>
+            <w:r>
+              <w:rPr>
+                <w:b w:val="0"/>
+                <w:sz w:val="20"/>
+              </w:rPr>
+              <w:t>La versión de Visual Studio Code, un código largo y x64</w:t>
+            </w:r>
+          </w:p>
+        </w:tc>
+      </w:tr>
+      <w:tr>
+        <w:trPr>
+          <w:cantSplit/>
+        </w:trPr>
+        <w:tc>
+          <w:tcPr>
+            <w:tcW w:type="dxa" w:w="3969"/>
+            <w:shd w:val="clear" w:color="auto" w:fill="F2F5F9"/>
+            <w:tcBorders>
+              <w:top w:val="single" w:sz="6" w:color="D0D7DE"/>
+              <w:left w:val="single" w:sz="6" w:color="D0D7DE"/>
+              <w:bottom w:val="single" w:sz="6" w:color="D0D7DE"/>
+              <w:right w:val="single" w:sz="6" w:color="D0D7DE"/>
+            </w:tcBorders>
+          </w:tcPr>
+          <w:p>
+            <w:pPr>
+              <w:keepNext/>
+            </w:pPr>
+            <w:r>
+              <w:rPr>
+                <w:rFonts w:ascii="Consolas" w:hAnsi="Consolas" w:eastAsia="Consolas"/>
+                <w:color w:val="003D7A"/>
+                <w:sz w:val="20"/>
+              </w:rPr>
+              <w:t>git config --global user.name</w:t>
+            </w:r>
+          </w:p>
+        </w:tc>
+        <w:tc>
+          <w:tcPr>
+            <w:tcW w:type="dxa" w:w="5669"/>
+            <w:shd w:val="clear" w:color="auto" w:fill="F2F5F9"/>
+            <w:tcBorders>
+              <w:top w:val="single" w:sz="6" w:color="D0D7DE"/>
+              <w:left w:val="single" w:sz="6" w:color="D0D7DE"/>
+              <w:bottom w:val="single" w:sz="6" w:color="D0D7DE"/>
+              <w:right w:val="single" w:sz="6" w:color="D0D7DE"/>
+            </w:tcBorders>
+          </w:tcPr>
+          <w:p>
+            <w:pPr>
+              <w:keepNext/>
+            </w:pPr>
+            <w:r>
+              <w:rPr>
+                <w:b w:val="0"/>
+                <w:sz w:val="20"/>
+              </w:rPr>
+              <w:t>Tu nombre</w:t>
+            </w:r>
+          </w:p>
+        </w:tc>
+      </w:tr>
+      <w:tr>
+        <w:trPr>
+          <w:cantSplit/>
+        </w:trPr>
+        <w:tc>
+          <w:tcPr>
+            <w:tcW w:type="dxa" w:w="3969"/>
+            <w:tcBorders>
+              <w:top w:val="single" w:sz="6" w:color="D0D7DE"/>
+              <w:left w:val="single" w:sz="6" w:color="D0D7DE"/>
+              <w:bottom w:val="single" w:sz="6" w:color="D0D7DE"/>
+              <w:right w:val="single" w:sz="6" w:color="D0D7DE"/>
+            </w:tcBorders>
+          </w:tcPr>
+          <w:p>
+            <w:pPr>
+              <w:keepNext/>
+            </w:pPr>
+            <w:r>
+              <w:rPr>
+                <w:rFonts w:ascii="Consolas" w:hAnsi="Consolas" w:eastAsia="Consolas"/>
+                <w:color w:val="003D7A"/>
+                <w:sz w:val="20"/>
+              </w:rPr>
               <w:t>cd C:\semillero\semillero2026</w:t>
             </w:r>
           </w:p>
@@ -5932,7 +7659,6 @@
         <w:tc>
           <w:tcPr>
             <w:tcW w:type="dxa" w:w="5669"/>
-            <w:shd w:val="clear" w:color="auto" w:fill="F2F5F9"/>
             <w:tcBorders>
               <w:top w:val="single" w:sz="6" w:color="D0D7DE"/>
               <w:left w:val="single" w:sz="6" w:color="D0D7DE"/>
@@ -5961,6 +7687,7 @@
         <w:tc>
           <w:tcPr>
             <w:tcW w:type="dxa" w:w="3969"/>
+            <w:shd w:val="clear" w:color="auto" w:fill="F2F5F9"/>
             <w:tcBorders>
               <w:top w:val="single" w:sz="6" w:color="D0D7DE"/>
               <w:left w:val="single" w:sz="6" w:color="D0D7DE"/>
@@ -5985,6 +7712,7 @@
         <w:tc>
           <w:tcPr>
             <w:tcW w:type="dxa" w:w="5669"/>
+            <w:shd w:val="clear" w:color="auto" w:fill="F2F5F9"/>
             <w:tcBorders>
               <w:top w:val="single" w:sz="6" w:color="D0D7DE"/>
               <w:left w:val="single" w:sz="6" w:color="D0D7DE"/>
@@ -6013,7 +7741,6 @@
         <w:tc>
           <w:tcPr>
             <w:tcW w:type="dxa" w:w="3969"/>
-            <w:shd w:val="clear" w:color="auto" w:fill="F2F5F9"/>
             <w:tcBorders>
               <w:top w:val="single" w:sz="6" w:color="D0D7DE"/>
               <w:left w:val="single" w:sz="6" w:color="D0D7DE"/>
@@ -6035,7 +7762,6 @@
         <w:tc>
           <w:tcPr>
             <w:tcW w:type="dxa" w:w="5669"/>
-            <w:shd w:val="clear" w:color="auto" w:fill="F2F5F9"/>
             <w:tcBorders>
               <w:top w:val="single" w:sz="6" w:color="D0D7DE"/>
               <w:left w:val="single" w:sz="6" w:color="D0D7DE"/>
@@ -6476,6 +8202,79 @@
           <w:color w:val="0072BC"/>
           <w:sz w:val="28"/>
         </w:rPr>
+        <w:t>node o npm no se reconocen</w:t>
+      </w:r>
+    </w:p>
+    <w:p>
+      <w:r>
+        <w:rPr>
+          <w:b w:val="0"/>
+        </w:rPr>
+        <w:t xml:space="preserve">Si PowerShell dice que </w:t>
+      </w:r>
+      <w:r>
+        <w:rPr>
+          <w:rFonts w:ascii="Consolas" w:hAnsi="Consolas" w:eastAsia="Consolas"/>
+          <w:color w:val="003D7A"/>
+        </w:rPr>
+        <w:t>node</w:t>
+      </w:r>
+      <w:r>
+        <w:rPr>
+          <w:b w:val="0"/>
+        </w:rPr>
+        <w:t xml:space="preserve"> o </w:t>
+      </w:r>
+      <w:r>
+        <w:rPr>
+          <w:rFonts w:ascii="Consolas" w:hAnsi="Consolas" w:eastAsia="Consolas"/>
+          <w:color w:val="003D7A"/>
+        </w:rPr>
+        <w:t>npm</w:t>
+      </w:r>
+      <w:r>
+        <w:rPr>
+          <w:b w:val="0"/>
+        </w:rPr>
+        <w:t xml:space="preserve"> no se reconocen como nombre de un cmdlet, casi siempre es una ventana que estaba abierta antes de instalar Node.js. Cierra todas las de PowerShell (y Visual Studio Code, si lo tenías abierto) y abre una nueva. Si sigue igual, revisa con </w:t>
+      </w:r>
+      <w:r>
+        <w:rPr>
+          <w:rFonts w:ascii="Consolas" w:hAnsi="Consolas" w:eastAsia="Consolas"/>
+          <w:color w:val="003D7A"/>
+        </w:rPr>
+        <w:t>Test-Path "C:\Program Files\nodejs\node.exe"</w:t>
+      </w:r>
+      <w:r>
+        <w:rPr>
+          <w:b w:val="0"/>
+        </w:rPr>
+        <w:t xml:space="preserve">: si dice False, vuelve a instalar Node.js; si dice True, abre el instalador, elige </w:t>
+      </w:r>
+      <w:r>
+        <w:rPr>
+          <w:b/>
+        </w:rPr>
+        <w:t>Repair</w:t>
+      </w:r>
+      <w:r>
+        <w:rPr>
+          <w:b w:val="0"/>
+        </w:rPr>
+        <w:t xml:space="preserve"> y reinicia el equipo.</w:t>
+      </w:r>
+    </w:p>
+    <w:p>
+      <w:pPr>
+        <w:keepNext/>
+        <w:spacing w:before="200" w:after="80"/>
+      </w:pPr>
+      <w:r>
+        <w:rPr>
+          <w:b/>
+          <w:color w:val="0072BC"/>
+          <w:sz w:val="28"/>
+        </w:rPr>
         <w:t>PowerShell abierto antes de cambiar el Path</w:t>
       </w:r>
     </w:p>
@@ -6872,39 +8671,52 @@
         <w:rPr>
           <w:b/>
         </w:rPr>
-        <w:t>Playwright</w:t>
-      </w:r>
-      <w:r>
-        <w:rPr>
-          <w:b w:val="0"/>
-        </w:rPr>
-        <w:t xml:space="preserve"> (clase 4): </w:t>
+        <w:t>npm y Playwright</w:t>
+      </w:r>
+      <w:r>
+        <w:rPr>
+          <w:b w:val="0"/>
+        </w:rPr>
+        <w:t xml:space="preserve"> (clase 4): antes de </w:t>
       </w:r>
       <w:r>
         <w:rPr>
           <w:rFonts w:ascii="Consolas" w:hAnsi="Consolas" w:eastAsia="Consolas"/>
           <w:color w:val="003D7A"/>
         </w:rPr>
-        <w:t>gradle instalarNavegadores</w:t>
-      </w:r>
-      <w:r>
-        <w:rPr>
-          <w:b w:val="0"/>
-        </w:rPr>
-        <w:t xml:space="preserve"> ya usa los certificados de Windows. Solo si instalas los navegadores por otro camino, escribe antes </w:t>
+        <w:t>npm ci</w:t>
+      </w:r>
+      <w:r>
+        <w:rPr>
+          <w:b w:val="0"/>
+        </w:rPr>
+        <w:t xml:space="preserve"> y de </w:t>
       </w:r>
       <w:r>
         <w:rPr>
           <w:rFonts w:ascii="Consolas" w:hAnsi="Consolas" w:eastAsia="Consolas"/>
           <w:color w:val="003D7A"/>
         </w:rPr>
+        <w:t>npx playwright install chromium</w:t>
+      </w:r>
+      <w:r>
+        <w:rPr>
+          <w:b w:val="0"/>
+        </w:rPr>
+        <w:t xml:space="preserve"> escribe </w:t>
+      </w:r>
+      <w:r>
+        <w:rPr>
+          <w:rFonts w:ascii="Consolas" w:hAnsi="Consolas" w:eastAsia="Consolas"/>
+          <w:color w:val="003D7A"/>
+        </w:rPr>
         <w:t>$env:NODE_OPTIONS="--use-system-ca"</w:t>
       </w:r>
       <w:r>
         <w:rPr>
           <w:b w:val="0"/>
         </w:rPr>
-        <w:t xml:space="preserve"> en la misma ventana de PowerShell (dura mientras la ventana esté abierta).</w:t>
+        <w:t xml:space="preserve"> en la misma ventana de PowerShell. Dura mientras la ventana esté abierta. El error típico es "unable to get local issuer certificate".</w:t>
       </w:r>
     </w:p>
     <w:p>
@@ -7213,33 +9025,59 @@
         <w:rPr>
           <w:b w:val="0"/>
         </w:rPr>
-        <w:t xml:space="preserve">Gradle se ejecuta con un archivo </w:t>
+        <w:t xml:space="preserve">Lo vas a ver casi seguro con </w:t>
       </w:r>
       <w:r>
         <w:rPr>
           <w:rFonts w:ascii="Consolas" w:hAnsi="Consolas" w:eastAsia="Consolas"/>
           <w:color w:val="003D7A"/>
         </w:rPr>
-        <w:t>.bat</w:t>
-      </w:r>
-      <w:r>
-        <w:rPr>
-          <w:b w:val="0"/>
-        </w:rPr>
-        <w:t xml:space="preserve">, así que normalmente no ves este error. Si aparece al correr algún comando o script </w:t>
+        <w:t>npm</w:t>
+      </w:r>
+      <w:r>
+        <w:rPr>
+          <w:b w:val="0"/>
+        </w:rPr>
+        <w:t xml:space="preserve"> o </w:t>
       </w:r>
       <w:r>
         <w:rPr>
           <w:rFonts w:ascii="Consolas" w:hAnsi="Consolas" w:eastAsia="Consolas"/>
           <w:color w:val="003D7A"/>
         </w:rPr>
-        <w:t>.ps1</w:t>
-      </w:r>
-      <w:r>
-        <w:rPr>
-          <w:b w:val="0"/>
-        </w:rPr>
-        <w:t>, permite los scripts solo para tu usuario:</w:t>
+        <w:t>npx</w:t>
+      </w:r>
+      <w:r>
+        <w:rPr>
+          <w:b w:val="0"/>
+        </w:rPr>
+        <w:t xml:space="preserve">: el mensaje dice que no se puede cargar el archivo </w:t>
+      </w:r>
+      <w:r>
+        <w:rPr>
+          <w:rFonts w:ascii="Consolas" w:hAnsi="Consolas" w:eastAsia="Consolas"/>
+          <w:color w:val="003D7A"/>
+        </w:rPr>
+        <w:t>C:\Program Files\nodejs\npm.ps1</w:t>
+      </w:r>
+      <w:r>
+        <w:rPr>
+          <w:b w:val="0"/>
+        </w:rPr>
+        <w:t xml:space="preserve"> porque la ejecución de scripts está deshabilitada en este sistema. Gradle se ejecuta con un archivo </w:t>
+      </w:r>
+      <w:r>
+        <w:rPr>
+          <w:rFonts w:ascii="Consolas" w:hAnsi="Consolas" w:eastAsia="Consolas"/>
+          <w:color w:val="003D7A"/>
+        </w:rPr>
+        <w:t>.bat</w:t>
+      </w:r>
+      <w:r>
+        <w:rPr>
+          <w:b w:val="0"/>
+        </w:rPr>
+        <w:t xml:space="preserve"> y no tiene este problema. Permite los scripts solo para tu usuario:</w:t>
       </w:r>
     </w:p>
     <w:tbl>
@@ -7320,7 +9158,46 @@
         <w:rPr>
           <w:b w:val="0"/>
         </w:rPr>
-        <w:t xml:space="preserve"> (o Y) cuando pregunte. Si dice que la directiva la controla la organización, es un bloqueo de la empresa: pide ayuda a soporte y avísame.</w:t>
+        <w:t xml:space="preserve"> (o Y) cuando pregunte, cierra PowerShell y vuelve a probar </w:t>
+      </w:r>
+      <w:r>
+        <w:rPr>
+          <w:rFonts w:ascii="Consolas" w:hAnsi="Consolas" w:eastAsia="Consolas"/>
+          <w:color w:val="003D7A"/>
+        </w:rPr>
+        <w:t>npm -v</w:t>
+      </w:r>
+      <w:r>
+        <w:rPr>
+          <w:b w:val="0"/>
+        </w:rPr>
+        <w:t xml:space="preserve">. Mientras tanto también funciona escribir </w:t>
+      </w:r>
+      <w:r>
+        <w:rPr>
+          <w:rFonts w:ascii="Consolas" w:hAnsi="Consolas" w:eastAsia="Consolas"/>
+          <w:color w:val="003D7A"/>
+        </w:rPr>
+        <w:t>npm.cmd</w:t>
+      </w:r>
+      <w:r>
+        <w:rPr>
+          <w:b w:val="0"/>
+        </w:rPr>
+        <w:t xml:space="preserve"> en lugar de </w:t>
+      </w:r>
+      <w:r>
+        <w:rPr>
+          <w:rFonts w:ascii="Consolas" w:hAnsi="Consolas" w:eastAsia="Consolas"/>
+          <w:color w:val="003D7A"/>
+        </w:rPr>
+        <w:t>npm</w:t>
+      </w:r>
+      <w:r>
+        <w:rPr>
+          <w:b w:val="0"/>
+        </w:rPr>
+        <w:t>. Si dice que la directiva la controla la organización, es un bloqueo de la empresa: pide ayuda a soporte y avísame.</w:t>
       </w:r>
     </w:p>
     <w:p>
@@ -7368,7 +9245,7 @@
         <w:rPr>
           <w:b w:val="0"/>
         </w:rPr>
-        <w:t xml:space="preserve"> y </w:t>
+        <w:t xml:space="preserve">, </w:t>
       </w:r>
       <w:r>
         <w:rPr>
@@ -7376,6 +9253,19 @@
           <w:color w:val="003D7A"/>
         </w:rPr>
         <w:t>git --version</w:t>
+      </w:r>
+      <w:r>
+        <w:rPr>
+          <w:b w:val="0"/>
+        </w:rPr>
+        <w:t xml:space="preserve"> y </w:t>
+      </w:r>
+      <w:r>
+        <w:rPr>
+          <w:rFonts w:ascii="Consolas" w:hAnsi="Consolas" w:eastAsia="Consolas"/>
+          <w:color w:val="003D7A"/>
+        </w:rPr>
+        <w:t>node -v</w:t>
       </w:r>
       <w:r>
         <w:rPr>
@@ -7666,6 +9556,24 @@
     </w:lvlOverride>
   </w:num>
   <w:num w:numId="17">
+    <w:abstractNumId w:val="7"/>
+    <w:lvlOverride w:ilvl="0">
+      <w:startOverride w:val="1"/>
+    </w:lvlOverride>
+  </w:num>
+  <w:num w:numId="18">
+    <w:abstractNumId w:val="7"/>
+    <w:lvlOverride w:ilvl="0">
+      <w:startOverride w:val="1"/>
+    </w:lvlOverride>
+  </w:num>
+  <w:num w:numId="19">
+    <w:abstractNumId w:val="7"/>
+    <w:lvlOverride w:ilvl="0">
+      <w:startOverride w:val="1"/>
+    </w:lvlOverride>
+  </w:num>
+  <w:num w:numId="20">
     <w:abstractNumId w:val="7"/>
     <w:lvlOverride w:ilvl="0">
       <w:startOverride w:val="1"/>

</xml_diff>

<commit_message>
Clase 4 en TypeScript: corregir la guía de estudio y actualizar la guía de prerrequisitos
La guía de estudio ya no dice que Playwright se escribe en Java: las clases 2 y 3 son en Java
y la clase 4 usa Playwright con TypeScript. Se copia la guía de prerrequisitos con Node.js y
Visual Studio Code.

Co-Authored-By: Claude Opus 5 (1M context) <noreply@anthropic.com>
Claude-Session: https://claude.ai/code/session_01L2JuF1iG72koPJkmuRWSzm
</commit_message>
<xml_diff>
--- a/material-de-apoyo/Prerrequisitos_Instalacion_Entorno_Windows.docx
+++ b/material-de-apoyo/Prerrequisitos_Instalacion_Entorno_Windows.docx
@@ -44,11 +44,7 @@
         <w:t>Paso a paso para dejar listo tu equipo Windows antes de la primera clase</w:t>
       </w:r>
     </w:p>
-    <w:p>
-      <w:pPr>
-        <w:keepNext/>
-      </w:pPr>
-    </w:p>
+    <w:p/>
     <w:tbl>
       <w:tblPr>
         <w:tblW w:type="auto" w:w="0"/>
@@ -322,14 +318,11 @@
       </w:r>
     </w:p>
     <w:p>
-      <w:pPr>
-        <w:keepNext/>
-      </w:pPr>
-      <w:r>
-        <w:rPr>
-          <w:b w:val="0"/>
-        </w:rPr>
-        <w:t>Esta guía es para ti aunque nunca hayas instalado una herramienta de programación. Vas a instalar seis cosas, una detrás de otra, y después de cada una vas a comprobar que quedó bien con un comando. Si algo no sale como dice aquí, no sigas con la siguiente: revisa el apartado de esa herramienta o el capítulo de problemas frecuentes al final.</w:t>
+      <w:r>
+        <w:rPr>
+          <w:b w:val="0"/>
+        </w:rPr>
+        <w:t>Esta guía es para ti aunque nunca hayas instalado una herramienta de programación. Vas a instalar ocho cosas, una detrás de otra, y después de cada una vas a comprobar que quedó bien con un comando. Si algo no sale como dice aquí, no sigas con la siguiente: revisa el apartado de esa herramienta o el capítulo de problemas frecuentes al final.</w:t>
       </w:r>
     </w:p>
     <w:p>
@@ -518,7 +511,7 @@
                 <w:b w:val="0"/>
                 <w:sz w:val="20"/>
               </w:rPr>
-              <w:t>Compila y ejecuta los proyectos (</w:t>
+              <w:t>Compila y ejecuta los proyectos Java (</w:t>
             </w:r>
             <w:r>
               <w:rPr>
@@ -533,7 +526,7 @@
                 <w:b w:val="0"/>
                 <w:sz w:val="20"/>
               </w:rPr>
-              <w:t xml:space="preserve"> en la clase 1). Desde la clase 2 descarga Serenity, Cucumber, Playwright y JUnit.</w:t>
+              <w:t xml:space="preserve"> en la clase 1). En las clases 2 y 3 descarga Serenity, Cucumber y JUnit y corre las pruebas.</w:t>
             </w:r>
           </w:p>
         </w:tc>
@@ -637,7 +630,126 @@
                 <w:b w:val="0"/>
                 <w:sz w:val="20"/>
               </w:rPr>
-              <w:t>El editor donde lees y escribes el código. Es gratuito para lo que vamos a hacer.</w:t>
+              <w:t>El editor de las clases 1 a 3, donde lees y escribes el código Java. Es gratuito para lo que vamos a hacer.</w:t>
+            </w:r>
+          </w:p>
+        </w:tc>
+      </w:tr>
+      <w:tr>
+        <w:trPr>
+          <w:cantSplit/>
+        </w:trPr>
+        <w:tc>
+          <w:tcPr>
+            <w:tcW w:type="dxa" w:w="2835"/>
+            <w:tcBorders>
+              <w:top w:val="single" w:sz="6" w:color="D0D7DE"/>
+              <w:left w:val="single" w:sz="6" w:color="D0D7DE"/>
+              <w:bottom w:val="single" w:sz="6" w:color="D0D7DE"/>
+              <w:right w:val="single" w:sz="6" w:color="D0D7DE"/>
+            </w:tcBorders>
+          </w:tcPr>
+          <w:p>
+            <w:pPr>
+              <w:keepNext/>
+            </w:pPr>
+            <w:r>
+              <w:rPr>
+                <w:b w:val="0"/>
+                <w:sz w:val="20"/>
+              </w:rPr>
+              <w:t>Node.js 24 LTS</w:t>
+            </w:r>
+          </w:p>
+        </w:tc>
+        <w:tc>
+          <w:tcPr>
+            <w:tcW w:type="dxa" w:w="6803"/>
+            <w:tcBorders>
+              <w:top w:val="single" w:sz="6" w:color="D0D7DE"/>
+              <w:left w:val="single" w:sz="6" w:color="D0D7DE"/>
+              <w:bottom w:val="single" w:sz="6" w:color="D0D7DE"/>
+              <w:right w:val="single" w:sz="6" w:color="D0D7DE"/>
+            </w:tcBorders>
+          </w:tcPr>
+          <w:p>
+            <w:pPr>
+              <w:keepNext/>
+            </w:pPr>
+            <w:r>
+              <w:rPr>
+                <w:b w:val="0"/>
+                <w:sz w:val="20"/>
+              </w:rPr>
+              <w:t xml:space="preserve">Ejecuta Playwright con TypeScript en la clase 4. Trae </w:t>
+            </w:r>
+            <w:r>
+              <w:rPr>
+                <w:rFonts w:ascii="Consolas" w:hAnsi="Consolas" w:eastAsia="Consolas"/>
+                <w:color w:val="003D7A"/>
+                <w:sz w:val="20"/>
+              </w:rPr>
+              <w:t>npm</w:t>
+            </w:r>
+            <w:r>
+              <w:rPr>
+                <w:b w:val="0"/>
+                <w:sz w:val="20"/>
+              </w:rPr>
+              <w:t>, que descarga las librerías del proyecto.</w:t>
+            </w:r>
+          </w:p>
+        </w:tc>
+      </w:tr>
+      <w:tr>
+        <w:trPr>
+          <w:cantSplit/>
+        </w:trPr>
+        <w:tc>
+          <w:tcPr>
+            <w:tcW w:type="dxa" w:w="2835"/>
+            <w:shd w:val="clear" w:color="auto" w:fill="F2F5F9"/>
+            <w:tcBorders>
+              <w:top w:val="single" w:sz="6" w:color="D0D7DE"/>
+              <w:left w:val="single" w:sz="6" w:color="D0D7DE"/>
+              <w:bottom w:val="single" w:sz="6" w:color="D0D7DE"/>
+              <w:right w:val="single" w:sz="6" w:color="D0D7DE"/>
+            </w:tcBorders>
+          </w:tcPr>
+          <w:p>
+            <w:pPr>
+              <w:keepNext/>
+            </w:pPr>
+            <w:r>
+              <w:rPr>
+                <w:b w:val="0"/>
+                <w:sz w:val="20"/>
+              </w:rPr>
+              <w:t>Visual Studio Code</w:t>
+            </w:r>
+          </w:p>
+        </w:tc>
+        <w:tc>
+          <w:tcPr>
+            <w:tcW w:type="dxa" w:w="6803"/>
+            <w:shd w:val="clear" w:color="auto" w:fill="F2F5F9"/>
+            <w:tcBorders>
+              <w:top w:val="single" w:sz="6" w:color="D0D7DE"/>
+              <w:left w:val="single" w:sz="6" w:color="D0D7DE"/>
+              <w:bottom w:val="single" w:sz="6" w:color="D0D7DE"/>
+              <w:right w:val="single" w:sz="6" w:color="D0D7DE"/>
+            </w:tcBorders>
+          </w:tcPr>
+          <w:p>
+            <w:pPr>
+              <w:keepNext/>
+            </w:pPr>
+            <w:r>
+              <w:rPr>
+                <w:b w:val="0"/>
+                <w:sz w:val="20"/>
+              </w:rPr>
+              <w:t>El editor de la clase 4, con la extensión Playwright Test for VSCode para correr las pruebas con un clic.</w:t>
             </w:r>
           </w:p>
         </w:tc>
@@ -688,7 +800,7 @@
                 <w:b w:val="0"/>
                 <w:sz w:val="20"/>
               </w:rPr>
-              <w:t>El navegador que automatizamos en las clases 2 y 4.</w:t>
+              <w:t>El navegador que automatizamos en la clase 2.</w:t>
             </w:r>
           </w:p>
         </w:tc>
@@ -735,7 +847,22 @@
                 <w:b w:val="0"/>
                 <w:sz w:val="20"/>
               </w:rPr>
-              <w:t>El Chromium que usa Playwright en la clase 4. Se instala con un comando de Gradle.</w:t>
+              <w:t xml:space="preserve">El Chromium que usa Playwright en la clase 4. Se instala con </w:t>
+            </w:r>
+            <w:r>
+              <w:rPr>
+                <w:rFonts w:ascii="Consolas" w:hAnsi="Consolas" w:eastAsia="Consolas"/>
+                <w:color w:val="003D7A"/>
+                <w:sz w:val="20"/>
+              </w:rPr>
+              <w:t>npx playwright install chromium</w:t>
+            </w:r>
+            <w:r>
+              <w:rPr>
+                <w:b w:val="0"/>
+                <w:sz w:val="20"/>
+              </w:rPr>
+              <w:t>.</w:t>
             </w:r>
           </w:p>
         </w:tc>
@@ -777,7 +904,7 @@
         <w:rPr>
           <w:b w:val="0"/>
         </w:rPr>
-        <w:t xml:space="preserve"> en el disco C. IntelliJ IDEA solo pide 10 GB según JetBrains, y a eso se suman Java, Gradle, Git, las librerías que Gradle descarga para cada clase y los navegadores de Playwright. Tu equipo debería tener 8 GB de memoria RAM o más; con menos funciona, pero lento.</w:t>
+        <w:t xml:space="preserve"> en el disco C. IntelliJ IDEA solo pide 10 GB según JetBrains, y a eso se suman Java, Gradle, Git, Node.js, Visual Studio Code, las librerías que se descargan para cada clase y el navegador de Playwright (cerca de 560 MB). Tu equipo debería tener 8 GB de memoria RAM o más; con menos funciona, pero lento.</w:t>
       </w:r>
     </w:p>
     <w:p>
@@ -785,7 +912,7 @@
         <w:rPr>
           <w:b w:val="0"/>
         </w:rPr>
-        <w:t>Con una conexión normal todo el proceso toma entre una hora y media y dos horas. Lo que más tarda es la descarga de IntelliJ IDEA (el instalador pesa cerca de 1,2 GB).</w:t>
+        <w:t>Con una conexión normal todo el proceso toma entre una hora y media y dos horas. Lo que más tarda es la descarga de IntelliJ IDEA (el instalador pesa cerca de 1,2 GB); Node.js y Visual Studio Code son rápidos.</w:t>
       </w:r>
     </w:p>
     <w:p>
@@ -807,7 +934,7 @@
         <w:rPr>
           <w:b w:val="0"/>
         </w:rPr>
-        <w:t xml:space="preserve">Los instaladores de Java, Git, IntelliJ y Chrome piden permiso de administrador. Cuando Windows muestre la ventana "¿Quieres permitir que esta aplicación haga cambios en el dispositivo?", dale clic en </w:t>
+        <w:t xml:space="preserve">Los instaladores de Java, Git, IntelliJ, Node.js y Chrome piden permiso de administrador. Cuando Windows muestre la ventana "¿Quieres permitir que esta aplicación haga cambios en el dispositivo?", dale clic en </w:t>
       </w:r>
       <w:r>
         <w:rPr>
@@ -863,7 +990,7 @@
               <w:rPr>
                 <w:b w:val="0"/>
               </w:rPr>
-              <w:t>Si tu computador es de la empresa y no te deja instalar (te pide un usuario y contraseña de administrador que no tienes), no intentes saltarte el bloqueo. Abre un caso con soporte técnico, pásales esta guía y pídeles que instalen Java 21, Git, IntelliJ IDEA y Chrome, y que te ayuden con Gradle y la variable Path. Hazlo con varios días de anticipación porque esos casos pueden demorar.</w:t>
+              <w:t>Si tu computador es de la empresa y no te deja instalar (te pide un usuario y contraseña de administrador que no tienes), no intentes saltarte el bloqueo. Abre un caso con soporte técnico, pásales esta guía y pídeles que instalen Java 21, Git, IntelliJ IDEA, Node.js 24, Visual Studio Code y Chrome, y que te ayuden con Gradle y la variable Path. Hazlo con varios días de anticipación porque esos casos pueden demorar.</w:t>
             </w:r>
           </w:p>
         </w:tc>
@@ -1031,9 +1158,6 @@
       </w:r>
     </w:p>
     <w:p>
-      <w:pPr>
-        <w:keepNext/>
-      </w:pPr>
       <w:r>
         <w:rPr>
           <w:b w:val="0"/>
@@ -1145,7 +1269,7 @@
       <w:r>
         <w:drawing>
           <wp:inline xmlns:a="http://schemas.openxmlformats.org/drawingml/2006/main" xmlns:pic="http://schemas.openxmlformats.org/drawingml/2006/picture">
-            <wp:extent cx="5580000" cy="3104539"/>
+            <wp:extent cx="3420000" cy="1902782"/>
             <wp:docPr id="1" name="Picture 1"/>
             <wp:cNvGraphicFramePr>
               <a:graphicFrameLocks noChangeAspect="1"/>
@@ -1166,7 +1290,7 @@
                   <pic:spPr>
                     <a:xfrm>
                       <a:off x="0" y="0"/>
-                      <a:ext cx="5580000" cy="3104539"/>
+                      <a:ext cx="3420000" cy="1902782"/>
                     </a:xfrm>
                     <a:prstGeom prst="rect"/>
                   </pic:spPr>
@@ -1848,9 +1972,6 @@
       </w:r>
     </w:p>
     <w:p>
-      <w:pPr>
-        <w:keepNext/>
-      </w:pPr>
       <w:r>
         <w:rPr>
           <w:b w:val="0"/>
@@ -1964,7 +2085,7 @@
       <w:r>
         <w:drawing>
           <wp:inline xmlns:a="http://schemas.openxmlformats.org/drawingml/2006/main" xmlns:pic="http://schemas.openxmlformats.org/drawingml/2006/picture">
-            <wp:extent cx="3960000" cy="1897500"/>
+            <wp:extent cx="2880000" cy="1380000"/>
             <wp:docPr id="2" name="Picture 2"/>
             <wp:cNvGraphicFramePr>
               <a:graphicFrameLocks noChangeAspect="1"/>
@@ -1985,7 +2106,7 @@
                   <pic:spPr>
                     <a:xfrm>
                       <a:off x="0" y="0"/>
-                      <a:ext cx="3960000" cy="1897500"/>
+                      <a:ext cx="2880000" cy="1380000"/>
                     </a:xfrm>
                     <a:prstGeom prst="rect"/>
                   </pic:spPr>
@@ -2982,9 +3103,6 @@
       </w:r>
     </w:p>
     <w:p>
-      <w:pPr>
-        <w:keepNext/>
-      </w:pPr>
       <w:r>
         <w:rPr>
           <w:b w:val="0"/>
@@ -3061,7 +3179,7 @@
       <w:r>
         <w:drawing>
           <wp:inline xmlns:a="http://schemas.openxmlformats.org/drawingml/2006/main" xmlns:pic="http://schemas.openxmlformats.org/drawingml/2006/picture">
-            <wp:extent cx="5040000" cy="2571429"/>
+            <wp:extent cx="3780000" cy="1928571"/>
             <wp:docPr id="3" name="Picture 3"/>
             <wp:cNvGraphicFramePr>
               <a:graphicFrameLocks noChangeAspect="1"/>
@@ -3082,7 +3200,7 @@
                   <pic:spPr>
                     <a:xfrm>
                       <a:off x="0" y="0"/>
-                      <a:ext cx="5040000" cy="2571429"/>
+                      <a:ext cx="3780000" cy="1928571"/>
                     </a:xfrm>
                     <a:prstGeom prst="rect"/>
                   </pic:spPr>
@@ -3631,14 +3749,11 @@
       </w:r>
     </w:p>
     <w:p>
-      <w:pPr>
-        <w:keepNext/>
-      </w:pPr>
-      <w:r>
-        <w:rPr>
-          <w:b w:val="0"/>
-        </w:rPr>
-        <w:t xml:space="preserve">IntelliJ IDEA es el editor que usamos para leer, escribir y ejecutar el código Java. Antes existían dos ediciones, Community (gratis) y Ultimate (paga). Desde la versión 2025.3 JetBrains las unió en </w:t>
+      <w:r>
+        <w:rPr>
+          <w:b w:val="0"/>
+        </w:rPr>
+        <w:t xml:space="preserve">IntelliJ IDEA es el editor que usamos en las clases 1 a 3 para leer, escribir y ejecutar el código Java. Antes existían dos ediciones, Community (gratis) y Ultimate (paga). Desde la versión 2025.3 JetBrains las unió en </w:t>
       </w:r>
       <w:r>
         <w:rPr>
@@ -3734,7 +3849,7 @@
       <w:r>
         <w:drawing>
           <wp:inline xmlns:a="http://schemas.openxmlformats.org/drawingml/2006/main" xmlns:pic="http://schemas.openxmlformats.org/drawingml/2006/picture">
-            <wp:extent cx="5580000" cy="2595349"/>
+            <wp:extent cx="4140000" cy="1925581"/>
             <wp:docPr id="4" name="Picture 4"/>
             <wp:cNvGraphicFramePr>
               <a:graphicFrameLocks noChangeAspect="1"/>
@@ -3755,7 +3870,7 @@
                   <pic:spPr>
                     <a:xfrm>
                       <a:off x="0" y="0"/>
-                      <a:ext cx="5580000" cy="2595349"/>
+                      <a:ext cx="4140000" cy="1925581"/>
                     </a:xfrm>
                     <a:prstGeom prst="rect"/>
                   </pic:spPr>
@@ -4227,7 +4342,7 @@
         <w:rPr>
           <w:b w:val="0"/>
         </w:rPr>
-        <w:t>Esto lo haces después de clonar el repositorio (paso 6). Lo dejo aquí para que tengas todo lo de IntelliJ junto.</w:t>
+        <w:t>Esto lo haces después de clonar el repositorio (paso 8). Lo dejo aquí para que tengas todo lo de IntelliJ junto.</w:t>
       </w:r>
     </w:p>
     <w:p>
@@ -4697,22 +4812,1240 @@
           <w:color w:val="003D7A"/>
           <w:sz w:val="36"/>
         </w:rPr>
-        <w:t>Paso 5. Google Chrome</w:t>
+        <w:t>Paso 5. Node.js 24 LTS (clase 4)</w:t>
       </w:r>
     </w:p>
     <w:p>
+      <w:r>
+        <w:rPr>
+          <w:b w:val="0"/>
+        </w:rPr>
+        <w:t xml:space="preserve">La clase 4 no es en Java: usamos </w:t>
+      </w:r>
+      <w:r>
+        <w:rPr>
+          <w:b/>
+        </w:rPr>
+        <w:t>Playwright con TypeScript</w:t>
+      </w:r>
+      <w:r>
+        <w:rPr>
+          <w:b w:val="0"/>
+        </w:rPr>
+        <w:t xml:space="preserve">. Para eso necesitas Node.js, que ejecuta ese código, y </w:t>
+      </w:r>
+      <w:r>
+        <w:rPr>
+          <w:rFonts w:ascii="Consolas" w:hAnsi="Consolas" w:eastAsia="Consolas"/>
+          <w:color w:val="003D7A"/>
+        </w:rPr>
+        <w:t>npm</w:t>
+      </w:r>
+      <w:r>
+        <w:rPr>
+          <w:b w:val="0"/>
+        </w:rPr>
+        <w:t xml:space="preserve">, que viene incluido y descarga las librerías del proyecto. Instalamos la versión </w:t>
+      </w:r>
+      <w:r>
+        <w:rPr>
+          <w:b/>
+        </w:rPr>
+        <w:t>24 LTS</w:t>
+      </w:r>
+      <w:r>
+        <w:rPr>
+          <w:b w:val="0"/>
+        </w:rPr>
+        <w:t xml:space="preserve"> (la de soporte de largo plazo).</w:t>
+      </w:r>
+    </w:p>
+    <w:p>
       <w:pPr>
         <w:keepNext/>
-      </w:pPr>
-      <w:r>
-        <w:rPr>
-          <w:b w:val="0"/>
-        </w:rPr>
-        <w:t xml:space="preserve">En la clase 2 (Serenity con Selenium) y en la clase 4 (Playwright) las pruebas abren un navegador y lo manejan solas. Usamos Chrome. Si ya lo tienes instalado, solo actualízalo desde el menú de los tres puntos, </w:t>
-      </w:r>
+        <w:spacing w:before="200" w:after="80"/>
+      </w:pPr>
       <w:r>
         <w:rPr>
           <w:b/>
+          <w:color w:val="0072BC"/>
+          <w:sz w:val="28"/>
+        </w:rPr>
+        <w:t>Descarga</w:t>
+      </w:r>
+    </w:p>
+    <w:tbl>
+      <w:tblPr>
+        <w:tblW w:type="auto" w:w="0"/>
+        <w:jc w:val="center"/>
+        <w:tblLook w:firstColumn="1" w:firstRow="1" w:lastColumn="0" w:lastRow="0" w:noHBand="0" w:noVBand="1" w:val="04A0"/>
+      </w:tblPr>
+      <w:tblGrid>
+        <w:gridCol w:w="9632"/>
+      </w:tblGrid>
+      <w:tr>
+        <w:trPr>
+          <w:cantSplit/>
+        </w:trPr>
+        <w:tc>
+          <w:tcPr>
+            <w:tcW w:type="dxa" w:w="9632"/>
+            <w:shd w:val="clear" w:color="auto" w:fill="F2F5F9"/>
+            <w:tcBorders>
+              <w:top w:val="nil"/>
+              <w:left w:val="single" w:sz="18" w:color="0072BC"/>
+              <w:bottom w:val="nil"/>
+              <w:right w:val="nil"/>
+            </w:tcBorders>
+          </w:tcPr>
+          <w:p>
+            <w:pPr>
+              <w:keepNext/>
+              <w:spacing w:after="0" w:line="240" w:lineRule="auto"/>
+            </w:pPr>
+            <w:r/>
+            <w:r>
+              <w:rPr>
+                <w:rFonts w:ascii="Consolas" w:hAnsi="Consolas" w:eastAsia="Consolas"/>
+                <w:color w:val="1F2933"/>
+                <w:sz w:val="19"/>
+              </w:rPr>
+              <w:t>https://nodejs.org/es/download</w:t>
+            </w:r>
+          </w:p>
+        </w:tc>
+      </w:tr>
+    </w:tbl>
+    <w:p>
+      <w:pPr>
+        <w:spacing w:after="40"/>
+      </w:pPr>
+    </w:p>
+    <w:p>
+      <w:pPr>
+        <w:keepNext/>
+        <w:jc w:val="center"/>
+      </w:pPr>
+      <w:r>
+        <w:drawing>
+          <wp:inline xmlns:a="http://schemas.openxmlformats.org/drawingml/2006/main" xmlns:pic="http://schemas.openxmlformats.org/drawingml/2006/picture">
+            <wp:extent cx="3780000" cy="2340826"/>
+            <wp:docPr id="5" name="Picture 5"/>
+            <wp:cNvGraphicFramePr>
+              <a:graphicFrameLocks noChangeAspect="1"/>
+            </wp:cNvGraphicFramePr>
+            <a:graphic>
+              <a:graphicData uri="http://schemas.openxmlformats.org/drawingml/2006/picture">
+                <pic:pic>
+                  <pic:nvPicPr>
+                    <pic:cNvPr id="0" name="nodejs.png"/>
+                    <pic:cNvPicPr/>
+                  </pic:nvPicPr>
+                  <pic:blipFill>
+                    <a:blip r:embed="rId14"/>
+                    <a:stretch>
+                      <a:fillRect/>
+                    </a:stretch>
+                  </pic:blipFill>
+                  <pic:spPr>
+                    <a:xfrm>
+                      <a:off x="0" y="0"/>
+                      <a:ext cx="3780000" cy="2340826"/>
+                    </a:xfrm>
+                    <a:prstGeom prst="rect"/>
+                  </pic:spPr>
+                </pic:pic>
+              </a:graphicData>
+            </a:graphic>
+          </wp:inline>
+        </w:drawing>
+      </w:r>
+    </w:p>
+    <w:p>
+      <w:pPr>
+        <w:jc w:val="center"/>
+      </w:pPr>
+      <w:r>
+        <w:rPr>
+          <w:b w:val="0"/>
+          <w:color w:val="52606D"/>
+          <w:sz w:val="18"/>
+        </w:rPr>
+        <w:t>Página de descarga de Node.js. Revisa que diga v24.21.0 LTS, Windows y x64, y descarga el instalador .msi.</w:t>
+      </w:r>
+    </w:p>
+    <w:p>
+      <w:r>
+        <w:rPr>
+          <w:b w:val="0"/>
+        </w:rPr>
+        <w:t xml:space="preserve">Revisa que arriba diga </w:t>
+      </w:r>
+      <w:r>
+        <w:rPr>
+          <w:b/>
+        </w:rPr>
+        <w:t>v24.21.0 LTS</w:t>
+      </w:r>
+      <w:r>
+        <w:rPr>
+          <w:b w:val="0"/>
+        </w:rPr>
+        <w:t xml:space="preserve"> y abajo </w:t>
+      </w:r>
+      <w:r>
+        <w:rPr>
+          <w:b/>
+        </w:rPr>
+        <w:t>Windows</w:t>
+      </w:r>
+      <w:r>
+        <w:rPr>
+          <w:b w:val="0"/>
+        </w:rPr>
+        <w:t xml:space="preserve"> y </w:t>
+      </w:r>
+      <w:r>
+        <w:rPr>
+          <w:b/>
+        </w:rPr>
+        <w:t>x64</w:t>
+      </w:r>
+      <w:r>
+        <w:rPr>
+          <w:b w:val="0"/>
+        </w:rPr>
+        <w:t xml:space="preserve">. Dale clic en </w:t>
+      </w:r>
+      <w:r>
+        <w:rPr>
+          <w:b/>
+        </w:rPr>
+        <w:t>Windows Installer (.msi)</w:t>
+      </w:r>
+      <w:r>
+        <w:rPr>
+          <w:b w:val="0"/>
+        </w:rPr>
+        <w:t xml:space="preserve">. Se descarga </w:t>
+      </w:r>
+      <w:r>
+        <w:rPr>
+          <w:rFonts w:ascii="Consolas" w:hAnsi="Consolas" w:eastAsia="Consolas"/>
+          <w:color w:val="003D7A"/>
+        </w:rPr>
+        <w:t>node-v24.21.0-x64.msi</w:t>
+      </w:r>
+      <w:r>
+        <w:rPr>
+          <w:b w:val="0"/>
+        </w:rPr>
+        <w:t>, de unos 32 MB. Si cuando entres ya salió otra 24 más nueva (por ejemplo 24.22), sirve igual, siempre que sea 24 y diga LTS.</w:t>
+      </w:r>
+    </w:p>
+    <w:p>
+      <w:pPr>
+        <w:keepNext/>
+        <w:spacing w:before="200" w:after="80"/>
+      </w:pPr>
+      <w:r>
+        <w:rPr>
+          <w:b/>
+          <w:color w:val="0072BC"/>
+          <w:sz w:val="28"/>
+        </w:rPr>
+        <w:t>Instalación</w:t>
+      </w:r>
+    </w:p>
+    <w:p>
+      <w:pPr>
+        <w:pStyle w:val="ListNumber"/>
+        <w:spacing w:after="60"/>
+        <w:numPr>
+          <w:ilvl w:val="0"/>
+          <w:numId w:val="17"/>
+        </w:numPr>
+      </w:pPr>
+      <w:r>
+        <w:rPr>
+          <w:b w:val="0"/>
+        </w:rPr>
+        <w:t xml:space="preserve">Abre el </w:t>
+      </w:r>
+      <w:r>
+        <w:rPr>
+          <w:rFonts w:ascii="Consolas" w:hAnsi="Consolas" w:eastAsia="Consolas"/>
+          <w:color w:val="003D7A"/>
+        </w:rPr>
+        <w:t>.msi</w:t>
+      </w:r>
+      <w:r>
+        <w:rPr>
+          <w:b w:val="0"/>
+        </w:rPr>
+        <w:t xml:space="preserve">, dale </w:t>
+      </w:r>
+      <w:r>
+        <w:rPr>
+          <w:b/>
+        </w:rPr>
+        <w:t>Next</w:t>
+      </w:r>
+      <w:r>
+        <w:rPr>
+          <w:b w:val="0"/>
+        </w:rPr>
+        <w:t xml:space="preserve"> y acepta la licencia.</w:t>
+      </w:r>
+    </w:p>
+    <w:p>
+      <w:pPr>
+        <w:pStyle w:val="ListNumber"/>
+        <w:spacing w:after="60"/>
+        <w:numPr>
+          <w:ilvl w:val="0"/>
+          <w:numId w:val="17"/>
+        </w:numPr>
+      </w:pPr>
+      <w:r>
+        <w:rPr>
+          <w:b w:val="0"/>
+        </w:rPr>
+        <w:t>Deja la carpeta que propone (</w:t>
+      </w:r>
+      <w:r>
+        <w:rPr>
+          <w:rFonts w:ascii="Consolas" w:hAnsi="Consolas" w:eastAsia="Consolas"/>
+          <w:color w:val="003D7A"/>
+        </w:rPr>
+        <w:t>C:\Program Files\nodejs\</w:t>
+      </w:r>
+      <w:r>
+        <w:rPr>
+          <w:b w:val="0"/>
+        </w:rPr>
+        <w:t>).</w:t>
+      </w:r>
+    </w:p>
+    <w:p>
+      <w:pPr>
+        <w:pStyle w:val="ListNumber"/>
+        <w:spacing w:after="60"/>
+        <w:numPr>
+          <w:ilvl w:val="0"/>
+          <w:numId w:val="17"/>
+        </w:numPr>
+      </w:pPr>
+      <w:r>
+        <w:rPr>
+          <w:b w:val="0"/>
+        </w:rPr>
+        <w:t xml:space="preserve">En </w:t>
+      </w:r>
+      <w:r>
+        <w:rPr>
+          <w:b/>
+        </w:rPr>
+        <w:t>Custom Setup</w:t>
+      </w:r>
+      <w:r>
+        <w:rPr>
+          <w:b w:val="0"/>
+        </w:rPr>
+        <w:t xml:space="preserve"> deja todo como viene. Ahí está </w:t>
+      </w:r>
+      <w:r>
+        <w:rPr>
+          <w:b/>
+        </w:rPr>
+        <w:t>Add to PATH</w:t>
+      </w:r>
+      <w:r>
+        <w:rPr>
+          <w:b w:val="0"/>
+        </w:rPr>
+        <w:t xml:space="preserve">, que es lo que permite usar </w:t>
+      </w:r>
+      <w:r>
+        <w:rPr>
+          <w:rFonts w:ascii="Consolas" w:hAnsi="Consolas" w:eastAsia="Consolas"/>
+          <w:color w:val="003D7A"/>
+        </w:rPr>
+        <w:t>node</w:t>
+      </w:r>
+      <w:r>
+        <w:rPr>
+          <w:b w:val="0"/>
+        </w:rPr>
+        <w:t xml:space="preserve"> y </w:t>
+      </w:r>
+      <w:r>
+        <w:rPr>
+          <w:rFonts w:ascii="Consolas" w:hAnsi="Consolas" w:eastAsia="Consolas"/>
+          <w:color w:val="003D7A"/>
+        </w:rPr>
+        <w:t>npm</w:t>
+      </w:r>
+      <w:r>
+        <w:rPr>
+          <w:b w:val="0"/>
+        </w:rPr>
+        <w:t xml:space="preserve"> desde PowerShell.</w:t>
+      </w:r>
+    </w:p>
+    <w:p>
+      <w:pPr>
+        <w:pStyle w:val="ListNumber"/>
+        <w:spacing w:after="60"/>
+        <w:numPr>
+          <w:ilvl w:val="0"/>
+          <w:numId w:val="17"/>
+        </w:numPr>
+      </w:pPr>
+      <w:r>
+        <w:rPr>
+          <w:b w:val="0"/>
+        </w:rPr>
+        <w:t xml:space="preserve">En </w:t>
+      </w:r>
+      <w:r>
+        <w:rPr>
+          <w:b/>
+        </w:rPr>
+        <w:t>Tools for Native Modules</w:t>
+      </w:r>
+      <w:r>
+        <w:rPr>
+          <w:b w:val="0"/>
+        </w:rPr>
+        <w:t xml:space="preserve"> deja </w:t>
+      </w:r>
+      <w:r>
+        <w:rPr>
+          <w:b/>
+        </w:rPr>
+        <w:t>sin marcar</w:t>
+      </w:r>
+      <w:r>
+        <w:rPr>
+          <w:b w:val="0"/>
+        </w:rPr>
+        <w:t xml:space="preserve"> la casilla que instala herramientas adicionales (Python, Visual Studio Build Tools y Chocolatey). No las necesitamos y tardan mucho.</w:t>
+      </w:r>
+    </w:p>
+    <w:p>
+      <w:pPr>
+        <w:pStyle w:val="ListNumber"/>
+        <w:spacing w:after="60"/>
+        <w:numPr>
+          <w:ilvl w:val="0"/>
+          <w:numId w:val="17"/>
+        </w:numPr>
+      </w:pPr>
+      <w:r>
+        <w:rPr>
+          <w:b w:val="0"/>
+        </w:rPr>
+        <w:t xml:space="preserve">Dale </w:t>
+      </w:r>
+      <w:r>
+        <w:rPr>
+          <w:b/>
+        </w:rPr>
+        <w:t>Install</w:t>
+      </w:r>
+      <w:r>
+        <w:rPr>
+          <w:b w:val="0"/>
+        </w:rPr>
+        <w:t xml:space="preserve">, acepta el permiso de administrador y al final </w:t>
+      </w:r>
+      <w:r>
+        <w:rPr>
+          <w:b/>
+        </w:rPr>
+        <w:t>Finish</w:t>
+      </w:r>
+      <w:r>
+        <w:rPr>
+          <w:b w:val="0"/>
+        </w:rPr>
+        <w:t>.</w:t>
+      </w:r>
+    </w:p>
+    <w:p>
+      <w:pPr>
+        <w:keepNext/>
+        <w:spacing w:before="200" w:after="80"/>
+      </w:pPr>
+      <w:r>
+        <w:rPr>
+          <w:b/>
+          <w:color w:val="0072BC"/>
+          <w:sz w:val="28"/>
+        </w:rPr>
+        <w:t>Comprobar</w:t>
+      </w:r>
+    </w:p>
+    <w:p>
+      <w:pPr>
+        <w:keepNext/>
+      </w:pPr>
+      <w:r>
+        <w:rPr>
+          <w:b w:val="0"/>
+        </w:rPr>
+        <w:t>Abre un PowerShell nuevo y escribe:</w:t>
+      </w:r>
+    </w:p>
+    <w:tbl>
+      <w:tblPr>
+        <w:tblW w:type="auto" w:w="0"/>
+        <w:jc w:val="center"/>
+        <w:tblLook w:firstColumn="1" w:firstRow="1" w:lastColumn="0" w:lastRow="0" w:noHBand="0" w:noVBand="1" w:val="04A0"/>
+      </w:tblPr>
+      <w:tblGrid>
+        <w:gridCol w:w="9632"/>
+      </w:tblGrid>
+      <w:tr>
+        <w:trPr>
+          <w:cantSplit/>
+        </w:trPr>
+        <w:tc>
+          <w:tcPr>
+            <w:tcW w:type="dxa" w:w="9632"/>
+            <w:shd w:val="clear" w:color="auto" w:fill="F2F5F9"/>
+            <w:tcBorders>
+              <w:top w:val="nil"/>
+              <w:left w:val="single" w:sz="18" w:color="0072BC"/>
+              <w:bottom w:val="nil"/>
+              <w:right w:val="nil"/>
+            </w:tcBorders>
+          </w:tcPr>
+          <w:p>
+            <w:pPr>
+              <w:keepNext/>
+              <w:spacing w:after="0" w:line="240" w:lineRule="auto"/>
+            </w:pPr>
+            <w:r/>
+            <w:r>
+              <w:rPr>
+                <w:rFonts w:ascii="Consolas" w:hAnsi="Consolas" w:eastAsia="Consolas"/>
+                <w:color w:val="1F2933"/>
+                <w:sz w:val="19"/>
+              </w:rPr>
+              <w:t>node -v</w:t>
+            </w:r>
+          </w:p>
+          <w:p>
+            <w:pPr>
+              <w:keepNext/>
+              <w:spacing w:after="0" w:line="240" w:lineRule="auto"/>
+            </w:pPr>
+            <w:r>
+              <w:rPr>
+                <w:rFonts w:ascii="Consolas" w:hAnsi="Consolas" w:eastAsia="Consolas"/>
+                <w:color w:val="1F2933"/>
+                <w:sz w:val="19"/>
+              </w:rPr>
+              <w:t>npm -v</w:t>
+            </w:r>
+          </w:p>
+        </w:tc>
+      </w:tr>
+    </w:tbl>
+    <w:p>
+      <w:pPr>
+        <w:keepNext/>
+        <w:spacing w:after="40"/>
+      </w:pPr>
+    </w:p>
+    <w:tbl>
+      <w:tblPr>
+        <w:tblW w:type="auto" w:w="0"/>
+        <w:jc w:val="center"/>
+        <w:tblLook w:firstColumn="1" w:firstRow="1" w:lastColumn="0" w:lastRow="0" w:noHBand="0" w:noVBand="1" w:val="04A0"/>
+      </w:tblPr>
+      <w:tblGrid>
+        <w:gridCol w:w="9632"/>
+      </w:tblGrid>
+      <w:tr>
+        <w:trPr>
+          <w:cantSplit/>
+        </w:trPr>
+        <w:tc>
+          <w:tcPr>
+            <w:tcW w:type="dxa" w:w="9632"/>
+            <w:shd w:val="clear" w:color="auto" w:fill="F2F5F9"/>
+            <w:tcBorders>
+              <w:top w:val="nil"/>
+              <w:left w:val="single" w:sz="18" w:color="0072BC"/>
+              <w:bottom w:val="nil"/>
+              <w:right w:val="nil"/>
+            </w:tcBorders>
+          </w:tcPr>
+          <w:p>
+            <w:r/>
+            <w:r>
+              <w:rPr>
+                <w:b/>
+                <w:color w:val="52606D"/>
+                <w:sz w:val="18"/>
+              </w:rPr>
+              <w:t>Debe salir algo parecido a esto</w:t>
+            </w:r>
+          </w:p>
+          <w:p>
+            <w:pPr>
+              <w:keepNext/>
+              <w:spacing w:after="0" w:line="240" w:lineRule="auto"/>
+            </w:pPr>
+            <w:r>
+              <w:rPr>
+                <w:rFonts w:ascii="Consolas" w:hAnsi="Consolas" w:eastAsia="Consolas"/>
+                <w:color w:val="1F2933"/>
+                <w:sz w:val="19"/>
+              </w:rPr>
+              <w:t>v24.21.0</w:t>
+            </w:r>
+          </w:p>
+          <w:p>
+            <w:pPr>
+              <w:keepNext/>
+              <w:spacing w:after="0" w:line="240" w:lineRule="auto"/>
+            </w:pPr>
+            <w:r>
+              <w:rPr>
+                <w:rFonts w:ascii="Consolas" w:hAnsi="Consolas" w:eastAsia="Consolas"/>
+                <w:color w:val="1F2933"/>
+                <w:sz w:val="19"/>
+              </w:rPr>
+              <w:t>11.19.0</w:t>
+            </w:r>
+          </w:p>
+        </w:tc>
+      </w:tr>
+    </w:tbl>
+    <w:p>
+      <w:pPr>
+        <w:spacing w:after="40"/>
+      </w:pPr>
+    </w:p>
+    <w:p>
+      <w:r>
+        <w:rPr>
+          <w:b w:val="0"/>
+        </w:rPr>
+        <w:t xml:space="preserve">Si </w:t>
+      </w:r>
+      <w:r>
+        <w:rPr>
+          <w:rFonts w:ascii="Consolas" w:hAnsi="Consolas" w:eastAsia="Consolas"/>
+          <w:color w:val="003D7A"/>
+        </w:rPr>
+        <w:t>npm -v</w:t>
+      </w:r>
+      <w:r>
+        <w:rPr>
+          <w:b w:val="0"/>
+        </w:rPr>
+        <w:t xml:space="preserve"> responde con un error rojo que dice que </w:t>
+      </w:r>
+      <w:r>
+        <w:rPr>
+          <w:b/>
+        </w:rPr>
+        <w:t>no se puede cargar el archivo npm.ps1 porque la ejecución de scripts está deshabilitada</w:t>
+      </w:r>
+      <w:r>
+        <w:rPr>
+          <w:b w:val="0"/>
+        </w:rPr>
+        <w:t xml:space="preserve">, es normal en Windows: PowerShell bloquea los scripts por defecto. Se arregla una sola vez con el comando del problema "La ejecución de scripts está deshabilitada", al final de la guía. Si </w:t>
+      </w:r>
+      <w:r>
+        <w:rPr>
+          <w:rFonts w:ascii="Consolas" w:hAnsi="Consolas" w:eastAsia="Consolas"/>
+          <w:color w:val="003D7A"/>
+        </w:rPr>
+        <w:t>node</w:t>
+      </w:r>
+      <w:r>
+        <w:rPr>
+          <w:b w:val="0"/>
+        </w:rPr>
+        <w:t xml:space="preserve"> o </w:t>
+      </w:r>
+      <w:r>
+        <w:rPr>
+          <w:rFonts w:ascii="Consolas" w:hAnsi="Consolas" w:eastAsia="Consolas"/>
+          <w:color w:val="003D7A"/>
+        </w:rPr>
+        <w:t>npm</w:t>
+      </w:r>
+      <w:r>
+        <w:rPr>
+          <w:b w:val="0"/>
+        </w:rPr>
+        <w:t xml:space="preserve"> no se reconocen, cierra y abre PowerShell.</w:t>
+      </w:r>
+    </w:p>
+    <w:p>
+      <w:pPr>
+        <w:keepNext/>
+        <w:spacing w:before="240" w:after="160"/>
+        <w:pBdr>
+          <w:bottom w:val="single" w:sz="8" w:space="4" w:color="003D7A"/>
+        </w:pBdr>
+      </w:pPr>
+      <w:r>
+        <w:rPr>
+          <w:b/>
+          <w:color w:val="003D7A"/>
+          <w:sz w:val="36"/>
+        </w:rPr>
+        <w:t>Paso 6. Visual Studio Code y la extensión de Playwright (clase 4)</w:t>
+      </w:r>
+    </w:p>
+    <w:p>
+      <w:r>
+        <w:rPr>
+          <w:b w:val="0"/>
+        </w:rPr>
+        <w:t xml:space="preserve">Visual Studio Code es el editor que usamos en la clase 4. Es gratuito y liviano. Le agregamos la extensión oficial de Microsoft </w:t>
+      </w:r>
+      <w:r>
+        <w:rPr>
+          <w:b/>
+        </w:rPr>
+        <w:t>Playwright Test for VSCode</w:t>
+      </w:r>
+      <w:r>
+        <w:rPr>
+          <w:b w:val="0"/>
+        </w:rPr>
+        <w:t>, que muestra las pruebas en una lista y las corre con un clic.</w:t>
+      </w:r>
+    </w:p>
+    <w:p>
+      <w:pPr>
+        <w:keepNext/>
+        <w:spacing w:before="200" w:after="80"/>
+      </w:pPr>
+      <w:r>
+        <w:rPr>
+          <w:b/>
+          <w:color w:val="0072BC"/>
+          <w:sz w:val="28"/>
+        </w:rPr>
+        <w:t>Descarga</w:t>
+      </w:r>
+    </w:p>
+    <w:tbl>
+      <w:tblPr>
+        <w:tblW w:type="auto" w:w="0"/>
+        <w:jc w:val="center"/>
+        <w:tblLook w:firstColumn="1" w:firstRow="1" w:lastColumn="0" w:lastRow="0" w:noHBand="0" w:noVBand="1" w:val="04A0"/>
+      </w:tblPr>
+      <w:tblGrid>
+        <w:gridCol w:w="9632"/>
+      </w:tblGrid>
+      <w:tr>
+        <w:trPr>
+          <w:cantSplit/>
+        </w:trPr>
+        <w:tc>
+          <w:tcPr>
+            <w:tcW w:type="dxa" w:w="9632"/>
+            <w:shd w:val="clear" w:color="auto" w:fill="F2F5F9"/>
+            <w:tcBorders>
+              <w:top w:val="nil"/>
+              <w:left w:val="single" w:sz="18" w:color="0072BC"/>
+              <w:bottom w:val="nil"/>
+              <w:right w:val="nil"/>
+            </w:tcBorders>
+          </w:tcPr>
+          <w:p>
+            <w:pPr>
+              <w:keepNext/>
+              <w:spacing w:after="0" w:line="240" w:lineRule="auto"/>
+            </w:pPr>
+            <w:r/>
+            <w:r>
+              <w:rPr>
+                <w:rFonts w:ascii="Consolas" w:hAnsi="Consolas" w:eastAsia="Consolas"/>
+                <w:color w:val="1F2933"/>
+                <w:sz w:val="19"/>
+              </w:rPr>
+              <w:t>https://code.visualstudio.com/download</w:t>
+            </w:r>
+          </w:p>
+        </w:tc>
+      </w:tr>
+    </w:tbl>
+    <w:p>
+      <w:pPr>
+        <w:spacing w:after="40"/>
+      </w:pPr>
+    </w:p>
+    <w:p>
+      <w:pPr>
+        <w:keepNext/>
+        <w:jc w:val="center"/>
+      </w:pPr>
+      <w:r>
+        <w:drawing>
+          <wp:inline xmlns:a="http://schemas.openxmlformats.org/drawingml/2006/main" xmlns:pic="http://schemas.openxmlformats.org/drawingml/2006/picture">
+            <wp:extent cx="3420000" cy="2067033"/>
+            <wp:docPr id="6" name="Picture 6"/>
+            <wp:cNvGraphicFramePr>
+              <a:graphicFrameLocks noChangeAspect="1"/>
+            </wp:cNvGraphicFramePr>
+            <a:graphic>
+              <a:graphicData uri="http://schemas.openxmlformats.org/drawingml/2006/picture">
+                <pic:pic>
+                  <pic:nvPicPr>
+                    <pic:cNvPr id="0" name="vscode.png"/>
+                    <pic:cNvPicPr/>
+                  </pic:nvPicPr>
+                  <pic:blipFill>
+                    <a:blip r:embed="rId15"/>
+                    <a:stretch>
+                      <a:fillRect/>
+                    </a:stretch>
+                  </pic:blipFill>
+                  <pic:spPr>
+                    <a:xfrm>
+                      <a:off x="0" y="0"/>
+                      <a:ext cx="3420000" cy="2067033"/>
+                    </a:xfrm>
+                    <a:prstGeom prst="rect"/>
+                  </pic:spPr>
+                </pic:pic>
+              </a:graphicData>
+            </a:graphic>
+          </wp:inline>
+        </w:drawing>
+      </w:r>
+    </w:p>
+    <w:p>
+      <w:pPr>
+        <w:jc w:val="center"/>
+      </w:pPr>
+      <w:r>
+        <w:rPr>
+          <w:b w:val="0"/>
+          <w:color w:val="52606D"/>
+          <w:sz w:val="18"/>
+        </w:rPr>
+        <w:t>Página de descarga de Visual Studio Code. El botón Windows descarga el instalador de usuario de 64 bits.</w:t>
+      </w:r>
+    </w:p>
+    <w:p>
+      <w:r>
+        <w:rPr>
+          <w:b w:val="0"/>
+        </w:rPr>
+        <w:t xml:space="preserve">Dale clic en el botón </w:t>
+      </w:r>
+      <w:r>
+        <w:rPr>
+          <w:b/>
+        </w:rPr>
+        <w:t>Windows</w:t>
+      </w:r>
+      <w:r>
+        <w:rPr>
+          <w:b w:val="0"/>
+        </w:rPr>
+        <w:t xml:space="preserve"> (Windows 10, 11). Se descarga el instalador de usuario de 64 bits, que hoy es </w:t>
+      </w:r>
+      <w:r>
+        <w:rPr>
+          <w:rFonts w:ascii="Consolas" w:hAnsi="Consolas" w:eastAsia="Consolas"/>
+          <w:color w:val="003D7A"/>
+        </w:rPr>
+        <w:t>VSCodeUserSetup-x64-1.138.0.exe</w:t>
+      </w:r>
+      <w:r>
+        <w:rPr>
+          <w:b w:val="0"/>
+        </w:rPr>
+        <w:t xml:space="preserve"> (unos 225 MB). Este instalador no pide permiso de administrador.</w:t>
+      </w:r>
+    </w:p>
+    <w:p>
+      <w:pPr>
+        <w:keepNext/>
+        <w:spacing w:before="200" w:after="80"/>
+      </w:pPr>
+      <w:r>
+        <w:rPr>
+          <w:b/>
+          <w:color w:val="0072BC"/>
+          <w:sz w:val="28"/>
+        </w:rPr>
+        <w:t>Instalación</w:t>
+      </w:r>
+    </w:p>
+    <w:p>
+      <w:pPr>
+        <w:pStyle w:val="ListNumber"/>
+        <w:spacing w:after="60"/>
+        <w:numPr>
+          <w:ilvl w:val="0"/>
+          <w:numId w:val="18"/>
+        </w:numPr>
+      </w:pPr>
+      <w:r>
+        <w:rPr>
+          <w:b w:val="0"/>
+        </w:rPr>
+        <w:t xml:space="preserve">Abre el </w:t>
+      </w:r>
+      <w:r>
+        <w:rPr>
+          <w:rFonts w:ascii="Consolas" w:hAnsi="Consolas" w:eastAsia="Consolas"/>
+          <w:color w:val="003D7A"/>
+        </w:rPr>
+        <w:t>.exe</w:t>
+      </w:r>
+      <w:r>
+        <w:rPr>
+          <w:b w:val="0"/>
+        </w:rPr>
+        <w:t xml:space="preserve">, acepta el acuerdo de licencia y dale </w:t>
+      </w:r>
+      <w:r>
+        <w:rPr>
+          <w:b/>
+        </w:rPr>
+        <w:t>Siguiente</w:t>
+      </w:r>
+      <w:r>
+        <w:rPr>
+          <w:b w:val="0"/>
+        </w:rPr>
+        <w:t xml:space="preserve"> (o Next).</w:t>
+      </w:r>
+    </w:p>
+    <w:p>
+      <w:pPr>
+        <w:pStyle w:val="ListNumber"/>
+        <w:spacing w:after="60"/>
+        <w:numPr>
+          <w:ilvl w:val="0"/>
+          <w:numId w:val="18"/>
+        </w:numPr>
+      </w:pPr>
+      <w:r>
+        <w:rPr>
+          <w:b w:val="0"/>
+        </w:rPr>
+        <w:t>Deja la carpeta que propone.</w:t>
+      </w:r>
+    </w:p>
+    <w:p>
+      <w:pPr>
+        <w:pStyle w:val="ListNumber"/>
+        <w:spacing w:after="60"/>
+        <w:numPr>
+          <w:ilvl w:val="0"/>
+          <w:numId w:val="18"/>
+        </w:numPr>
+      </w:pPr>
+      <w:r>
+        <w:rPr>
+          <w:b w:val="0"/>
+        </w:rPr>
+        <w:t xml:space="preserve">En </w:t>
+      </w:r>
+      <w:r>
+        <w:rPr>
+          <w:b/>
+        </w:rPr>
+        <w:t>Seleccione las tareas adicionales</w:t>
+      </w:r>
+      <w:r>
+        <w:rPr>
+          <w:b w:val="0"/>
+        </w:rPr>
+        <w:t xml:space="preserve"> revisa que quede marcado </w:t>
+      </w:r>
+      <w:r>
+        <w:rPr>
+          <w:b/>
+        </w:rPr>
+        <w:t>Agregar a PATH</w:t>
+      </w:r>
+      <w:r>
+        <w:rPr>
+          <w:b w:val="0"/>
+        </w:rPr>
+        <w:t xml:space="preserve"> (en inglés, Add to PATH). Te recomiendo marcar también las dos opciones de </w:t>
+      </w:r>
+      <w:r>
+        <w:rPr>
+          <w:b/>
+        </w:rPr>
+        <w:t>Agregar la acción "Abrir con Code"</w:t>
+      </w:r>
+      <w:r>
+        <w:rPr>
+          <w:b w:val="0"/>
+        </w:rPr>
+        <w:t xml:space="preserve"> al menú contextual del Explorador, para abrir una carpeta con clic derecho.</w:t>
+      </w:r>
+    </w:p>
+    <w:p>
+      <w:pPr>
+        <w:pStyle w:val="ListNumber"/>
+        <w:spacing w:after="60"/>
+        <w:numPr>
+          <w:ilvl w:val="0"/>
+          <w:numId w:val="18"/>
+        </w:numPr>
+      </w:pPr>
+      <w:r>
+        <w:rPr>
+          <w:b w:val="0"/>
+        </w:rPr>
+        <w:t xml:space="preserve">Dale </w:t>
+      </w:r>
+      <w:r>
+        <w:rPr>
+          <w:b/>
+        </w:rPr>
+        <w:t>Instalar</w:t>
+      </w:r>
+      <w:r>
+        <w:rPr>
+          <w:b w:val="0"/>
+        </w:rPr>
+        <w:t xml:space="preserve"> y al final </w:t>
+      </w:r>
+      <w:r>
+        <w:rPr>
+          <w:b/>
+        </w:rPr>
+        <w:t>Finalizar</w:t>
+      </w:r>
+      <w:r>
+        <w:rPr>
+          <w:b w:val="0"/>
+        </w:rPr>
+        <w:t>.</w:t>
+      </w:r>
+    </w:p>
+    <w:p>
+      <w:pPr>
+        <w:keepNext/>
+        <w:spacing w:before="200" w:after="80"/>
+      </w:pPr>
+      <w:r>
+        <w:rPr>
+          <w:b/>
+          <w:color w:val="0072BC"/>
+          <w:sz w:val="28"/>
+        </w:rPr>
+        <w:t>Instalar la extensión y comprobar</w:t>
+      </w:r>
+    </w:p>
+    <w:p>
+      <w:pPr>
+        <w:pStyle w:val="ListNumber"/>
+        <w:spacing w:after="60"/>
+        <w:numPr>
+          <w:ilvl w:val="0"/>
+          <w:numId w:val="19"/>
+        </w:numPr>
+      </w:pPr>
+      <w:r>
+        <w:rPr>
+          <w:b w:val="0"/>
+        </w:rPr>
+        <w:t xml:space="preserve">Abre Visual Studio Code y dale clic al ícono de </w:t>
+      </w:r>
+      <w:r>
+        <w:rPr>
+          <w:b/>
+        </w:rPr>
+        <w:t>Extensiones</w:t>
+      </w:r>
+      <w:r>
+        <w:rPr>
+          <w:b w:val="0"/>
+        </w:rPr>
+        <w:t xml:space="preserve"> en la barra de la izquierda (los cuatro cuadritos) o presiona Ctrl+Shift+X.</w:t>
+      </w:r>
+    </w:p>
+    <w:p>
+      <w:pPr>
+        <w:pStyle w:val="ListNumber"/>
+        <w:spacing w:after="60"/>
+        <w:numPr>
+          <w:ilvl w:val="0"/>
+          <w:numId w:val="19"/>
+        </w:numPr>
+      </w:pPr>
+      <w:r>
+        <w:rPr>
+          <w:b w:val="0"/>
+        </w:rPr>
+        <w:t xml:space="preserve">Busca </w:t>
+      </w:r>
+      <w:r>
+        <w:rPr>
+          <w:rFonts w:ascii="Consolas" w:hAnsi="Consolas" w:eastAsia="Consolas"/>
+          <w:color w:val="003D7A"/>
+        </w:rPr>
+        <w:t>Playwright Test for VSCode</w:t>
+      </w:r>
+      <w:r>
+        <w:rPr>
+          <w:b w:val="0"/>
+        </w:rPr>
+        <w:t xml:space="preserve">. Debe decir que es de </w:t>
+      </w:r>
+      <w:r>
+        <w:rPr>
+          <w:b/>
+        </w:rPr>
+        <w:t>Microsoft</w:t>
+      </w:r>
+      <w:r>
+        <w:rPr>
+          <w:b w:val="0"/>
+        </w:rPr>
+        <w:t xml:space="preserve"> (su identificador es </w:t>
+      </w:r>
+      <w:r>
+        <w:rPr>
+          <w:rFonts w:ascii="Consolas" w:hAnsi="Consolas" w:eastAsia="Consolas"/>
+          <w:color w:val="003D7A"/>
+        </w:rPr>
+        <w:t>ms-playwright.playwright</w:t>
+      </w:r>
+      <w:r>
+        <w:rPr>
+          <w:b w:val="0"/>
+        </w:rPr>
+        <w:t xml:space="preserve">). Dale </w:t>
+      </w:r>
+      <w:r>
+        <w:rPr>
+          <w:b/>
+        </w:rPr>
+        <w:t>Install</w:t>
+      </w:r>
+      <w:r>
+        <w:rPr>
+          <w:b w:val="0"/>
+        </w:rPr>
+        <w:t>.</w:t>
+      </w:r>
+    </w:p>
+    <w:p>
+      <w:pPr>
+        <w:pStyle w:val="ListNumber"/>
+        <w:spacing w:after="60"/>
+        <w:numPr>
+          <w:ilvl w:val="0"/>
+          <w:numId w:val="19"/>
+        </w:numPr>
+      </w:pPr>
+      <w:r>
+        <w:rPr>
+          <w:b w:val="0"/>
+        </w:rPr>
+        <w:t xml:space="preserve">En la barra de la izquierda aparece la pestaña </w:t>
+      </w:r>
+      <w:r>
+        <w:rPr>
+          <w:b/>
+        </w:rPr>
+        <w:t>Testing</w:t>
+      </w:r>
+      <w:r>
+        <w:rPr>
+          <w:b w:val="0"/>
+        </w:rPr>
+        <w:t xml:space="preserve"> (</w:t>
+      </w:r>
+      <w:r>
+        <w:rPr>
+          <w:b/>
+        </w:rPr>
+        <w:t>Pruebas</w:t>
+      </w:r>
+      <w:r>
+        <w:rPr>
+          <w:b w:val="0"/>
+        </w:rPr>
+        <w:t xml:space="preserve"> si tienes el editor en español), con el ícono de un matraz. Cuando abras la carpeta del proyecto de la clase 4, ahí vas a ver sus pruebas.</w:t>
+      </w:r>
+    </w:p>
+    <w:p>
+      <w:r>
+        <w:rPr>
+          <w:b w:val="0"/>
+        </w:rPr>
+        <w:t xml:space="preserve">Para comprobar desde PowerShell, abre una ventana nueva y escribe </w:t>
+      </w:r>
+      <w:r>
+        <w:rPr>
+          <w:rFonts w:ascii="Consolas" w:hAnsi="Consolas" w:eastAsia="Consolas"/>
+          <w:color w:val="003D7A"/>
+        </w:rPr>
+        <w:t>code --version</w:t>
+      </w:r>
+      <w:r>
+        <w:rPr>
+          <w:b w:val="0"/>
+        </w:rPr>
+        <w:t xml:space="preserve">. Deben salir tres líneas: la versión (por ejemplo 1.138.0), un código largo y </w:t>
+      </w:r>
+      <w:r>
+        <w:rPr>
+          <w:rFonts w:ascii="Consolas" w:hAnsi="Consolas" w:eastAsia="Consolas"/>
+          <w:color w:val="003D7A"/>
+        </w:rPr>
+        <w:t>x64</w:t>
+      </w:r>
+      <w:r>
+        <w:rPr>
+          <w:b w:val="0"/>
+        </w:rPr>
+        <w:t>.</w:t>
+      </w:r>
+    </w:p>
+    <w:p>
+      <w:pPr>
+        <w:keepNext/>
+        <w:spacing w:before="240" w:after="160"/>
+        <w:pBdr>
+          <w:bottom w:val="single" w:sz="8" w:space="4" w:color="003D7A"/>
+        </w:pBdr>
+      </w:pPr>
+      <w:r>
+        <w:rPr>
+          <w:b/>
+          <w:color w:val="003D7A"/>
+          <w:sz w:val="36"/>
+        </w:rPr>
+        <w:t>Paso 7. Google Chrome</w:t>
+      </w:r>
+    </w:p>
+    <w:p>
+      <w:r>
+        <w:rPr>
+          <w:b w:val="0"/>
+        </w:rPr>
+        <w:t xml:space="preserve">En la clase 2 (Serenity con Selenium) las pruebas abren Chrome y lo manejan solas. Si ya lo tienes instalado, solo actualízalo desde el menú de los tres puntos, </w:t>
+      </w:r>
+      <w:r>
+        <w:rPr>
+          <w:b/>
         </w:rPr>
         <w:t>Ayuda &gt; Información de Google Chrome</w:t>
       </w:r>
@@ -4720,7 +6053,7 @@
         <w:rPr>
           <w:b w:val="0"/>
         </w:rPr>
-        <w:t>, y sigue al paso 6.</w:t>
+        <w:t>, y sigue al paso 8.</w:t>
       </w:r>
     </w:p>
     <w:tbl>
@@ -4778,8 +6111,8 @@
       <w:r>
         <w:drawing>
           <wp:inline xmlns:a="http://schemas.openxmlformats.org/drawingml/2006/main" xmlns:pic="http://schemas.openxmlformats.org/drawingml/2006/picture">
-            <wp:extent cx="5040000" cy="2805567"/>
-            <wp:docPr id="5" name="Picture 5"/>
+            <wp:extent cx="3420000" cy="1903777"/>
+            <wp:docPr id="7" name="Picture 7"/>
             <wp:cNvGraphicFramePr>
               <a:graphicFrameLocks noChangeAspect="1"/>
             </wp:cNvGraphicFramePr>
@@ -4791,7 +6124,7 @@
                     <pic:cNvPicPr/>
                   </pic:nvPicPr>
                   <pic:blipFill>
-                    <a:blip r:embed="rId14"/>
+                    <a:blip r:embed="rId16"/>
                     <a:stretch>
                       <a:fillRect/>
                     </a:stretch>
@@ -4799,7 +6132,7 @@
                   <pic:spPr>
                     <a:xfrm>
                       <a:off x="0" y="0"/>
-                      <a:ext cx="5040000" cy="2805567"/>
+                      <a:ext cx="3420000" cy="1903777"/>
                     </a:xfrm>
                     <a:prstGeom prst="rect"/>
                   </pic:spPr>
@@ -4829,7 +6162,7 @@
         <w:spacing w:after="60"/>
         <w:numPr>
           <w:ilvl w:val="0"/>
-          <w:numId w:val="17"/>
+          <w:numId w:val="20"/>
         </w:numPr>
       </w:pPr>
       <w:r>
@@ -4869,7 +6202,7 @@
         <w:spacing w:after="60"/>
         <w:numPr>
           <w:ilvl w:val="0"/>
-          <w:numId w:val="17"/>
+          <w:numId w:val="20"/>
         </w:numPr>
       </w:pPr>
       <w:r>
@@ -4898,7 +6231,7 @@
         <w:spacing w:after="60"/>
         <w:numPr>
           <w:ilvl w:val="0"/>
-          <w:numId w:val="17"/>
+          <w:numId w:val="20"/>
         </w:numPr>
       </w:pPr>
       <w:r>
@@ -4934,7 +6267,7 @@
           <w:color w:val="003D7A"/>
           <w:sz w:val="36"/>
         </w:rPr>
-        <w:t>Paso 6. Clonar el repositorio y cambiar de rama</w:t>
+        <w:t>Paso 8. Clonar el repositorio y cambiar de rama</w:t>
       </w:r>
     </w:p>
     <w:p>
@@ -5362,7 +6695,85 @@
         <w:rPr>
           <w:b w:val="0"/>
         </w:rPr>
-        <w:t>. Para cada clase haces lo mismo con el nombre de su rama.</w:t>
+        <w:t xml:space="preserve">. Para cada clase haces lo mismo con el nombre de su rama. La rama 04 es distinta porque es TypeScript: en vez de </w:t>
+      </w:r>
+      <w:r>
+        <w:rPr>
+          <w:rFonts w:ascii="Consolas" w:hAnsi="Consolas" w:eastAsia="Consolas"/>
+          <w:color w:val="003D7A"/>
+        </w:rPr>
+        <w:t>build.gradle</w:t>
+      </w:r>
+      <w:r>
+        <w:rPr>
+          <w:b w:val="0"/>
+        </w:rPr>
+        <w:t xml:space="preserve"> y </w:t>
+      </w:r>
+      <w:r>
+        <w:rPr>
+          <w:rFonts w:ascii="Consolas" w:hAnsi="Consolas" w:eastAsia="Consolas"/>
+          <w:color w:val="003D7A"/>
+        </w:rPr>
+        <w:t>src</w:t>
+      </w:r>
+      <w:r>
+        <w:rPr>
+          <w:b w:val="0"/>
+        </w:rPr>
+        <w:t xml:space="preserve"> tiene </w:t>
+      </w:r>
+      <w:r>
+        <w:rPr>
+          <w:rFonts w:ascii="Consolas" w:hAnsi="Consolas" w:eastAsia="Consolas"/>
+          <w:color w:val="003D7A"/>
+        </w:rPr>
+        <w:t>package.json</w:t>
+      </w:r>
+      <w:r>
+        <w:rPr>
+          <w:b w:val="0"/>
+        </w:rPr>
+        <w:t xml:space="preserve">, </w:t>
+      </w:r>
+      <w:r>
+        <w:rPr>
+          <w:rFonts w:ascii="Consolas" w:hAnsi="Consolas" w:eastAsia="Consolas"/>
+          <w:color w:val="003D7A"/>
+        </w:rPr>
+        <w:t>playwright.config.ts</w:t>
+      </w:r>
+      <w:r>
+        <w:rPr>
+          <w:b w:val="0"/>
+        </w:rPr>
+        <w:t xml:space="preserve">, </w:t>
+      </w:r>
+      <w:r>
+        <w:rPr>
+          <w:rFonts w:ascii="Consolas" w:hAnsi="Consolas" w:eastAsia="Consolas"/>
+          <w:color w:val="003D7A"/>
+        </w:rPr>
+        <w:t>pages</w:t>
+      </w:r>
+      <w:r>
+        <w:rPr>
+          <w:b w:val="0"/>
+        </w:rPr>
+        <w:t xml:space="preserve"> y </w:t>
+      </w:r>
+      <w:r>
+        <w:rPr>
+          <w:rFonts w:ascii="Consolas" w:hAnsi="Consolas" w:eastAsia="Consolas"/>
+          <w:color w:val="003D7A"/>
+        </w:rPr>
+        <w:t>tests</w:t>
+      </w:r>
+      <w:r>
+        <w:rPr>
+          <w:b w:val="0"/>
+        </w:rPr>
+        <w:t>.</w:t>
       </w:r>
     </w:p>
     <w:p>
@@ -5400,7 +6811,7 @@
           <w:color w:val="003D7A"/>
           <w:sz w:val="36"/>
         </w:rPr>
-        <w:t>Paso 7. Navegador de Playwright (clase 4)</w:t>
+        <w:t>Paso 9. Librerías y navegador de Playwright (clase 4)</w:t>
       </w:r>
     </w:p>
     <w:p>
@@ -5411,7 +6822,7 @@
         <w:rPr>
           <w:b w:val="0"/>
         </w:rPr>
-        <w:t>Playwright no usa el Chrome que instalaste: trae su propio navegador, Chromium, y hay que descargarlo una vez por equipo. El proyecto de la clase 4 tiene una tarea de Gradle que lo hace por ti. Puedes dejar este paso para antes de la clase 4, pero mejor hazlo ahora, porque ocupa cerca de 560 MB en disco:</w:t>
+        <w:t>Playwright no usa el Chrome que instalaste: trae su propio navegador, Chromium, y hay que descargarlo una vez por equipo. Puedes dejar este paso para antes de la clase 4, pero mejor hazlo con tiempo porque son descargas grandes. En un PowerShell nuevo:</w:t>
       </w:r>
     </w:p>
     <w:tbl>
@@ -5478,7 +6889,21 @@
                 <w:color w:val="1F2933"/>
                 <w:sz w:val="19"/>
               </w:rPr>
-              <w:t>gradle instalarNavegadores</w:t>
+              <w:t>npm ci</w:t>
+            </w:r>
+          </w:p>
+          <w:p>
+            <w:pPr>
+              <w:keepNext/>
+              <w:spacing w:after="0" w:line="240" w:lineRule="auto"/>
+            </w:pPr>
+            <w:r>
+              <w:rPr>
+                <w:rFonts w:ascii="Consolas" w:hAnsi="Consolas" w:eastAsia="Consolas"/>
+                <w:color w:val="1F2933"/>
+                <w:sz w:val="19"/>
+              </w:rPr>
+              <w:t>npx playwright install chromium</w:t>
             </w:r>
           </w:p>
         </w:tc>
@@ -5492,55 +6917,198 @@
     <w:p>
       <w:r>
         <w:rPr>
-          <w:b w:val="0"/>
-        </w:rPr>
-        <w:t xml:space="preserve">Al final debe decir </w:t>
+          <w:rFonts w:ascii="Consolas" w:hAnsi="Consolas" w:eastAsia="Consolas"/>
+          <w:color w:val="003D7A"/>
+        </w:rPr>
+        <w:t>npm ci</w:t>
+      </w:r>
+      <w:r>
+        <w:rPr>
+          <w:b w:val="0"/>
+        </w:rPr>
+        <w:t xml:space="preserve"> descarga exactamente las librerías que dice el archivo </w:t>
+      </w:r>
+      <w:r>
+        <w:rPr>
+          <w:rFonts w:ascii="Consolas" w:hAnsi="Consolas" w:eastAsia="Consolas"/>
+          <w:color w:val="003D7A"/>
+        </w:rPr>
+        <w:t>package-lock.json</w:t>
+      </w:r>
+      <w:r>
+        <w:rPr>
+          <w:b w:val="0"/>
+        </w:rPr>
+        <w:t xml:space="preserve"> del proyecto y las deja en la carpeta </w:t>
+      </w:r>
+      <w:r>
+        <w:rPr>
+          <w:rFonts w:ascii="Consolas" w:hAnsi="Consolas" w:eastAsia="Consolas"/>
+          <w:color w:val="003D7A"/>
+        </w:rPr>
+        <w:t>node_modules</w:t>
+      </w:r>
+      <w:r>
+        <w:rPr>
+          <w:b w:val="0"/>
+        </w:rPr>
+        <w:t xml:space="preserve">. </w:t>
+      </w:r>
+      <w:r>
+        <w:rPr>
+          <w:rFonts w:ascii="Consolas" w:hAnsi="Consolas" w:eastAsia="Consolas"/>
+          <w:color w:val="003D7A"/>
+        </w:rPr>
+        <w:t>npx playwright install chromium</w:t>
+      </w:r>
+      <w:r>
+        <w:rPr>
+          <w:b w:val="0"/>
+        </w:rPr>
+        <w:t xml:space="preserve"> descarga el navegador; en nuestra prueba ocupó cerca de </w:t>
       </w:r>
       <w:r>
         <w:rPr>
           <w:b/>
         </w:rPr>
-        <w:t>BUILD SUCCESSFUL</w:t>
-      </w:r>
-      <w:r>
-        <w:rPr>
-          <w:b w:val="0"/>
-        </w:rPr>
-        <w:t>. La tarea ya viene preparada para redes de empresa con proxy: le dice a Playwright que use los certificados de Windows, así que no tienes que configurar nada más.</w:t>
+        <w:t>560 MB</w:t>
+      </w:r>
+      <w:r>
+        <w:rPr>
+          <w:b w:val="0"/>
+        </w:rPr>
+        <w:t xml:space="preserve"> (Chromium, su versión sin ventana y FFmpeg). Al final no debe salir ningún error en rojo.</w:t>
       </w:r>
     </w:p>
     <w:p>
-      <w:r>
-        <w:rPr>
-          <w:b w:val="0"/>
-        </w:rPr>
-        <w:t xml:space="preserve">Si alguna vez una prueba te dice que falta el navegador y te sugiere un comando que empieza por </w:t>
+      <w:pPr>
+        <w:keepNext/>
+      </w:pPr>
+      <w:r>
+        <w:rPr>
+          <w:b w:val="0"/>
+        </w:rPr>
+        <w:t xml:space="preserve">Si estás en la red de una empresa, escribe esto </w:t>
+      </w:r>
+      <w:r>
+        <w:rPr>
+          <w:b/>
+        </w:rPr>
+        <w:t>antes</w:t>
+      </w:r>
+      <w:r>
+        <w:rPr>
+          <w:b w:val="0"/>
+        </w:rPr>
+        <w:t xml:space="preserve"> de los dos comandos, en la misma ventana. Le dice a Node.js que confíe en los certificados que tiene instalados Windows:</w:t>
+      </w:r>
+    </w:p>
+    <w:tbl>
+      <w:tblPr>
+        <w:tblW w:type="auto" w:w="0"/>
+        <w:jc w:val="center"/>
+        <w:tblLook w:firstColumn="1" w:firstRow="1" w:lastColumn="0" w:lastRow="0" w:noHBand="0" w:noVBand="1" w:val="04A0"/>
+      </w:tblPr>
+      <w:tblGrid>
+        <w:gridCol w:w="9632"/>
+      </w:tblGrid>
+      <w:tr>
+        <w:trPr>
+          <w:cantSplit/>
+        </w:trPr>
+        <w:tc>
+          <w:tcPr>
+            <w:tcW w:type="dxa" w:w="9632"/>
+            <w:shd w:val="clear" w:color="auto" w:fill="F2F5F9"/>
+            <w:tcBorders>
+              <w:top w:val="nil"/>
+              <w:left w:val="single" w:sz="18" w:color="0072BC"/>
+              <w:bottom w:val="nil"/>
+              <w:right w:val="nil"/>
+            </w:tcBorders>
+          </w:tcPr>
+          <w:p>
+            <w:pPr>
+              <w:keepNext/>
+              <w:spacing w:after="0" w:line="240" w:lineRule="auto"/>
+            </w:pPr>
+            <w:r/>
+            <w:r>
+              <w:rPr>
+                <w:rFonts w:ascii="Consolas" w:hAnsi="Consolas" w:eastAsia="Consolas"/>
+                <w:color w:val="1F2933"/>
+                <w:sz w:val="19"/>
+              </w:rPr>
+              <w:t>$env:NODE_OPTIONS="--use-system-ca"</w:t>
+            </w:r>
+          </w:p>
+          <w:p>
+            <w:pPr>
+              <w:keepNext/>
+              <w:spacing w:after="0" w:line="240" w:lineRule="auto"/>
+            </w:pPr>
+            <w:r>
+              <w:rPr>
+                <w:rFonts w:ascii="Consolas" w:hAnsi="Consolas" w:eastAsia="Consolas"/>
+                <w:color w:val="1F2933"/>
+                <w:sz w:val="19"/>
+              </w:rPr>
+              <w:t>npm ci</w:t>
+            </w:r>
+          </w:p>
+          <w:p>
+            <w:pPr>
+              <w:keepNext/>
+              <w:spacing w:after="0" w:line="240" w:lineRule="auto"/>
+            </w:pPr>
+            <w:r>
+              <w:rPr>
+                <w:rFonts w:ascii="Consolas" w:hAnsi="Consolas" w:eastAsia="Consolas"/>
+                <w:color w:val="1F2933"/>
+                <w:sz w:val="19"/>
+              </w:rPr>
+              <w:t>npx playwright install chromium</w:t>
+            </w:r>
+          </w:p>
+        </w:tc>
+      </w:tr>
+    </w:tbl>
+    <w:p>
+      <w:pPr>
+        <w:spacing w:after="40"/>
+      </w:pPr>
+    </w:p>
+    <w:p>
+      <w:r>
+        <w:rPr>
+          <w:b w:val="0"/>
+        </w:rPr>
+        <w:t xml:space="preserve">En nuestra prueba detrás del proxy de la empresa, </w:t>
       </w:r>
       <w:r>
         <w:rPr>
           <w:rFonts w:ascii="Consolas" w:hAnsi="Consolas" w:eastAsia="Consolas"/>
           <w:color w:val="003D7A"/>
         </w:rPr>
-        <w:t>mvn</w:t>
-      </w:r>
-      <w:r>
-        <w:rPr>
-          <w:b w:val="0"/>
-        </w:rPr>
-        <w:t xml:space="preserve">, ignóralo: en el semillero no usamos Maven. Corre </w:t>
-      </w:r>
-      <w:r>
-        <w:rPr>
-          <w:rFonts w:ascii="Consolas" w:hAnsi="Consolas" w:eastAsia="Consolas"/>
-          <w:color w:val="003D7A"/>
-        </w:rPr>
-        <w:t>gradle instalarNavegadores</w:t>
-      </w:r>
-      <w:r>
-        <w:rPr>
-          <w:b w:val="0"/>
-        </w:rPr>
-        <w:t xml:space="preserve"> dentro de la rama 04. Si la descarga falla por certificados, toma una captura del error y envíamela antes de la clase 4.</w:t>
+        <w:t>npm ci</w:t>
+      </w:r>
+      <w:r>
+        <w:rPr>
+          <w:b w:val="0"/>
+        </w:rPr>
+        <w:t xml:space="preserve"> funcionó sin la variable, pero la descarga del navegador falló con </w:t>
+      </w:r>
+      <w:r>
+        <w:rPr>
+          <w:b/>
+        </w:rPr>
+        <w:t>unable to get local issuer certificate</w:t>
+      </w:r>
+      <w:r>
+        <w:rPr>
+          <w:b w:val="0"/>
+        </w:rPr>
+        <w:t>; con la variable sí terminó. La variable solo dura mientras esa ventana esté abierta. Si aun así falla, toma una captura del error y envíamela antes de la clase 4.</w:t>
       </w:r>
     </w:p>
     <w:p>
@@ -5872,7 +7440,7 @@
                 <w:color w:val="003D7A"/>
                 <w:sz w:val="20"/>
               </w:rPr>
-              <w:t>git config --global user.name</w:t>
+              <w:t>node -v</w:t>
             </w:r>
           </w:p>
         </w:tc>
@@ -5895,7 +7463,7 @@
                 <w:b w:val="0"/>
                 <w:sz w:val="20"/>
               </w:rPr>
-              <w:t>Tu nombre</w:t>
+              <w:t>v24 seguido de números (por ejemplo v24.21.0)</w:t>
             </w:r>
           </w:p>
         </w:tc>
@@ -5925,6 +7493,165 @@
                 <w:color w:val="003D7A"/>
                 <w:sz w:val="20"/>
               </w:rPr>
+              <w:t>npm -v</w:t>
+            </w:r>
+          </w:p>
+        </w:tc>
+        <w:tc>
+          <w:tcPr>
+            <w:tcW w:type="dxa" w:w="5669"/>
+            <w:shd w:val="clear" w:color="auto" w:fill="F2F5F9"/>
+            <w:tcBorders>
+              <w:top w:val="single" w:sz="6" w:color="D0D7DE"/>
+              <w:left w:val="single" w:sz="6" w:color="D0D7DE"/>
+              <w:bottom w:val="single" w:sz="6" w:color="D0D7DE"/>
+              <w:right w:val="single" w:sz="6" w:color="D0D7DE"/>
+            </w:tcBorders>
+          </w:tcPr>
+          <w:p>
+            <w:pPr>
+              <w:keepNext/>
+            </w:pPr>
+            <w:r>
+              <w:rPr>
+                <w:b w:val="0"/>
+                <w:sz w:val="20"/>
+              </w:rPr>
+              <w:t>Un número de versión (por ejemplo 11.19.0), sin error rojo</w:t>
+            </w:r>
+          </w:p>
+        </w:tc>
+      </w:tr>
+      <w:tr>
+        <w:trPr>
+          <w:cantSplit/>
+        </w:trPr>
+        <w:tc>
+          <w:tcPr>
+            <w:tcW w:type="dxa" w:w="3969"/>
+            <w:tcBorders>
+              <w:top w:val="single" w:sz="6" w:color="D0D7DE"/>
+              <w:left w:val="single" w:sz="6" w:color="D0D7DE"/>
+              <w:bottom w:val="single" w:sz="6" w:color="D0D7DE"/>
+              <w:right w:val="single" w:sz="6" w:color="D0D7DE"/>
+            </w:tcBorders>
+          </w:tcPr>
+          <w:p>
+            <w:pPr>
+              <w:keepNext/>
+            </w:pPr>
+            <w:r>
+              <w:rPr>
+                <w:rFonts w:ascii="Consolas" w:hAnsi="Consolas" w:eastAsia="Consolas"/>
+                <w:color w:val="003D7A"/>
+                <w:sz w:val="20"/>
+              </w:rPr>
+              <w:t>code --version</w:t>
+            </w:r>
+          </w:p>
+        </w:tc>
+        <w:tc>
+          <w:tcPr>
+            <w:tcW w:type="dxa" w:w="5669"/>
+            <w:tcBorders>
+              <w:top w:val="single" w:sz="6" w:color="D0D7DE"/>
+              <w:left w:val="single" w:sz="6" w:color="D0D7DE"/>
+              <w:bottom w:val="single" w:sz="6" w:color="D0D7DE"/>
+              <w:right w:val="single" w:sz="6" w:color="D0D7DE"/>
+            </w:tcBorders>
+          </w:tcPr>
+          <w:p>
+            <w:pPr>
+              <w:keepNext/>
+            </w:pPr>
+            <w:r>
+              <w:rPr>
+                <w:b w:val="0"/>
+                <w:sz w:val="20"/>
+              </w:rPr>
+              <w:t>La versión de Visual Studio Code, un código largo y x64</w:t>
+            </w:r>
+          </w:p>
+        </w:tc>
+      </w:tr>
+      <w:tr>
+        <w:trPr>
+          <w:cantSplit/>
+        </w:trPr>
+        <w:tc>
+          <w:tcPr>
+            <w:tcW w:type="dxa" w:w="3969"/>
+            <w:shd w:val="clear" w:color="auto" w:fill="F2F5F9"/>
+            <w:tcBorders>
+              <w:top w:val="single" w:sz="6" w:color="D0D7DE"/>
+              <w:left w:val="single" w:sz="6" w:color="D0D7DE"/>
+              <w:bottom w:val="single" w:sz="6" w:color="D0D7DE"/>
+              <w:right w:val="single" w:sz="6" w:color="D0D7DE"/>
+            </w:tcBorders>
+          </w:tcPr>
+          <w:p>
+            <w:pPr>
+              <w:keepNext/>
+            </w:pPr>
+            <w:r>
+              <w:rPr>
+                <w:rFonts w:ascii="Consolas" w:hAnsi="Consolas" w:eastAsia="Consolas"/>
+                <w:color w:val="003D7A"/>
+                <w:sz w:val="20"/>
+              </w:rPr>
+              <w:t>git config --global user.name</w:t>
+            </w:r>
+          </w:p>
+        </w:tc>
+        <w:tc>
+          <w:tcPr>
+            <w:tcW w:type="dxa" w:w="5669"/>
+            <w:shd w:val="clear" w:color="auto" w:fill="F2F5F9"/>
+            <w:tcBorders>
+              <w:top w:val="single" w:sz="6" w:color="D0D7DE"/>
+              <w:left w:val="single" w:sz="6" w:color="D0D7DE"/>
+              <w:bottom w:val="single" w:sz="6" w:color="D0D7DE"/>
+              <w:right w:val="single" w:sz="6" w:color="D0D7DE"/>
+            </w:tcBorders>
+          </w:tcPr>
+          <w:p>
+            <w:pPr>
+              <w:keepNext/>
+            </w:pPr>
+            <w:r>
+              <w:rPr>
+                <w:b w:val="0"/>
+                <w:sz w:val="20"/>
+              </w:rPr>
+              <w:t>Tu nombre</w:t>
+            </w:r>
+          </w:p>
+        </w:tc>
+      </w:tr>
+      <w:tr>
+        <w:trPr>
+          <w:cantSplit/>
+        </w:trPr>
+        <w:tc>
+          <w:tcPr>
+            <w:tcW w:type="dxa" w:w="3969"/>
+            <w:tcBorders>
+              <w:top w:val="single" w:sz="6" w:color="D0D7DE"/>
+              <w:left w:val="single" w:sz="6" w:color="D0D7DE"/>
+              <w:bottom w:val="single" w:sz="6" w:color="D0D7DE"/>
+              <w:right w:val="single" w:sz="6" w:color="D0D7DE"/>
+            </w:tcBorders>
+          </w:tcPr>
+          <w:p>
+            <w:pPr>
+              <w:keepNext/>
+            </w:pPr>
+            <w:r>
+              <w:rPr>
+                <w:rFonts w:ascii="Consolas" w:hAnsi="Consolas" w:eastAsia="Consolas"/>
+                <w:color w:val="003D7A"/>
+                <w:sz w:val="20"/>
+              </w:rPr>
               <w:t>cd C:\semillero\semillero2026</w:t>
             </w:r>
           </w:p>
@@ -5932,7 +7659,6 @@
         <w:tc>
           <w:tcPr>
             <w:tcW w:type="dxa" w:w="5669"/>
-            <w:shd w:val="clear" w:color="auto" w:fill="F2F5F9"/>
             <w:tcBorders>
               <w:top w:val="single" w:sz="6" w:color="D0D7DE"/>
               <w:left w:val="single" w:sz="6" w:color="D0D7DE"/>
@@ -5961,6 +7687,7 @@
         <w:tc>
           <w:tcPr>
             <w:tcW w:type="dxa" w:w="3969"/>
+            <w:shd w:val="clear" w:color="auto" w:fill="F2F5F9"/>
             <w:tcBorders>
               <w:top w:val="single" w:sz="6" w:color="D0D7DE"/>
               <w:left w:val="single" w:sz="6" w:color="D0D7DE"/>
@@ -5985,6 +7712,7 @@
         <w:tc>
           <w:tcPr>
             <w:tcW w:type="dxa" w:w="5669"/>
+            <w:shd w:val="clear" w:color="auto" w:fill="F2F5F9"/>
             <w:tcBorders>
               <w:top w:val="single" w:sz="6" w:color="D0D7DE"/>
               <w:left w:val="single" w:sz="6" w:color="D0D7DE"/>
@@ -6013,7 +7741,6 @@
         <w:tc>
           <w:tcPr>
             <w:tcW w:type="dxa" w:w="3969"/>
-            <w:shd w:val="clear" w:color="auto" w:fill="F2F5F9"/>
             <w:tcBorders>
               <w:top w:val="single" w:sz="6" w:color="D0D7DE"/>
               <w:left w:val="single" w:sz="6" w:color="D0D7DE"/>
@@ -6035,7 +7762,6 @@
         <w:tc>
           <w:tcPr>
             <w:tcW w:type="dxa" w:w="5669"/>
-            <w:shd w:val="clear" w:color="auto" w:fill="F2F5F9"/>
             <w:tcBorders>
               <w:top w:val="single" w:sz="6" w:color="D0D7DE"/>
               <w:left w:val="single" w:sz="6" w:color="D0D7DE"/>
@@ -6476,6 +8202,79 @@
           <w:color w:val="0072BC"/>
           <w:sz w:val="28"/>
         </w:rPr>
+        <w:t>node o npm no se reconocen</w:t>
+      </w:r>
+    </w:p>
+    <w:p>
+      <w:r>
+        <w:rPr>
+          <w:b w:val="0"/>
+        </w:rPr>
+        <w:t xml:space="preserve">Si PowerShell dice que </w:t>
+      </w:r>
+      <w:r>
+        <w:rPr>
+          <w:rFonts w:ascii="Consolas" w:hAnsi="Consolas" w:eastAsia="Consolas"/>
+          <w:color w:val="003D7A"/>
+        </w:rPr>
+        <w:t>node</w:t>
+      </w:r>
+      <w:r>
+        <w:rPr>
+          <w:b w:val="0"/>
+        </w:rPr>
+        <w:t xml:space="preserve"> o </w:t>
+      </w:r>
+      <w:r>
+        <w:rPr>
+          <w:rFonts w:ascii="Consolas" w:hAnsi="Consolas" w:eastAsia="Consolas"/>
+          <w:color w:val="003D7A"/>
+        </w:rPr>
+        <w:t>npm</w:t>
+      </w:r>
+      <w:r>
+        <w:rPr>
+          <w:b w:val="0"/>
+        </w:rPr>
+        <w:t xml:space="preserve"> no se reconocen como nombre de un cmdlet, casi siempre es una ventana que estaba abierta antes de instalar Node.js. Cierra todas las de PowerShell (y Visual Studio Code, si lo tenías abierto) y abre una nueva. Si sigue igual, revisa con </w:t>
+      </w:r>
+      <w:r>
+        <w:rPr>
+          <w:rFonts w:ascii="Consolas" w:hAnsi="Consolas" w:eastAsia="Consolas"/>
+          <w:color w:val="003D7A"/>
+        </w:rPr>
+        <w:t>Test-Path "C:\Program Files\nodejs\node.exe"</w:t>
+      </w:r>
+      <w:r>
+        <w:rPr>
+          <w:b w:val="0"/>
+        </w:rPr>
+        <w:t xml:space="preserve">: si dice False, vuelve a instalar Node.js; si dice True, abre el instalador, elige </w:t>
+      </w:r>
+      <w:r>
+        <w:rPr>
+          <w:b/>
+        </w:rPr>
+        <w:t>Repair</w:t>
+      </w:r>
+      <w:r>
+        <w:rPr>
+          <w:b w:val="0"/>
+        </w:rPr>
+        <w:t xml:space="preserve"> y reinicia el equipo.</w:t>
+      </w:r>
+    </w:p>
+    <w:p>
+      <w:pPr>
+        <w:keepNext/>
+        <w:spacing w:before="200" w:after="80"/>
+      </w:pPr>
+      <w:r>
+        <w:rPr>
+          <w:b/>
+          <w:color w:val="0072BC"/>
+          <w:sz w:val="28"/>
+        </w:rPr>
         <w:t>PowerShell abierto antes de cambiar el Path</w:t>
       </w:r>
     </w:p>
@@ -6872,39 +8671,52 @@
         <w:rPr>
           <w:b/>
         </w:rPr>
-        <w:t>Playwright</w:t>
-      </w:r>
-      <w:r>
-        <w:rPr>
-          <w:b w:val="0"/>
-        </w:rPr>
-        <w:t xml:space="preserve"> (clase 4): </w:t>
+        <w:t>npm y Playwright</w:t>
+      </w:r>
+      <w:r>
+        <w:rPr>
+          <w:b w:val="0"/>
+        </w:rPr>
+        <w:t xml:space="preserve"> (clase 4): antes de </w:t>
       </w:r>
       <w:r>
         <w:rPr>
           <w:rFonts w:ascii="Consolas" w:hAnsi="Consolas" w:eastAsia="Consolas"/>
           <w:color w:val="003D7A"/>
         </w:rPr>
-        <w:t>gradle instalarNavegadores</w:t>
-      </w:r>
-      <w:r>
-        <w:rPr>
-          <w:b w:val="0"/>
-        </w:rPr>
-        <w:t xml:space="preserve"> ya usa los certificados de Windows. Solo si instalas los navegadores por otro camino, escribe antes </w:t>
+        <w:t>npm ci</w:t>
+      </w:r>
+      <w:r>
+        <w:rPr>
+          <w:b w:val="0"/>
+        </w:rPr>
+        <w:t xml:space="preserve"> y de </w:t>
       </w:r>
       <w:r>
         <w:rPr>
           <w:rFonts w:ascii="Consolas" w:hAnsi="Consolas" w:eastAsia="Consolas"/>
           <w:color w:val="003D7A"/>
         </w:rPr>
+        <w:t>npx playwright install chromium</w:t>
+      </w:r>
+      <w:r>
+        <w:rPr>
+          <w:b w:val="0"/>
+        </w:rPr>
+        <w:t xml:space="preserve"> escribe </w:t>
+      </w:r>
+      <w:r>
+        <w:rPr>
+          <w:rFonts w:ascii="Consolas" w:hAnsi="Consolas" w:eastAsia="Consolas"/>
+          <w:color w:val="003D7A"/>
+        </w:rPr>
         <w:t>$env:NODE_OPTIONS="--use-system-ca"</w:t>
       </w:r>
       <w:r>
         <w:rPr>
           <w:b w:val="0"/>
         </w:rPr>
-        <w:t xml:space="preserve"> en la misma ventana de PowerShell (dura mientras la ventana esté abierta).</w:t>
+        <w:t xml:space="preserve"> en la misma ventana de PowerShell. Dura mientras la ventana esté abierta. El error típico es "unable to get local issuer certificate".</w:t>
       </w:r>
     </w:p>
     <w:p>
@@ -7213,33 +9025,59 @@
         <w:rPr>
           <w:b w:val="0"/>
         </w:rPr>
-        <w:t xml:space="preserve">Gradle se ejecuta con un archivo </w:t>
+        <w:t xml:space="preserve">Lo vas a ver casi seguro con </w:t>
       </w:r>
       <w:r>
         <w:rPr>
           <w:rFonts w:ascii="Consolas" w:hAnsi="Consolas" w:eastAsia="Consolas"/>
           <w:color w:val="003D7A"/>
         </w:rPr>
-        <w:t>.bat</w:t>
-      </w:r>
-      <w:r>
-        <w:rPr>
-          <w:b w:val="0"/>
-        </w:rPr>
-        <w:t xml:space="preserve">, así que normalmente no ves este error. Si aparece al correr algún comando o script </w:t>
+        <w:t>npm</w:t>
+      </w:r>
+      <w:r>
+        <w:rPr>
+          <w:b w:val="0"/>
+        </w:rPr>
+        <w:t xml:space="preserve"> o </w:t>
       </w:r>
       <w:r>
         <w:rPr>
           <w:rFonts w:ascii="Consolas" w:hAnsi="Consolas" w:eastAsia="Consolas"/>
           <w:color w:val="003D7A"/>
         </w:rPr>
-        <w:t>.ps1</w:t>
-      </w:r>
-      <w:r>
-        <w:rPr>
-          <w:b w:val="0"/>
-        </w:rPr>
-        <w:t>, permite los scripts solo para tu usuario:</w:t>
+        <w:t>npx</w:t>
+      </w:r>
+      <w:r>
+        <w:rPr>
+          <w:b w:val="0"/>
+        </w:rPr>
+        <w:t xml:space="preserve">: el mensaje dice que no se puede cargar el archivo </w:t>
+      </w:r>
+      <w:r>
+        <w:rPr>
+          <w:rFonts w:ascii="Consolas" w:hAnsi="Consolas" w:eastAsia="Consolas"/>
+          <w:color w:val="003D7A"/>
+        </w:rPr>
+        <w:t>C:\Program Files\nodejs\npm.ps1</w:t>
+      </w:r>
+      <w:r>
+        <w:rPr>
+          <w:b w:val="0"/>
+        </w:rPr>
+        <w:t xml:space="preserve"> porque la ejecución de scripts está deshabilitada en este sistema. Gradle se ejecuta con un archivo </w:t>
+      </w:r>
+      <w:r>
+        <w:rPr>
+          <w:rFonts w:ascii="Consolas" w:hAnsi="Consolas" w:eastAsia="Consolas"/>
+          <w:color w:val="003D7A"/>
+        </w:rPr>
+        <w:t>.bat</w:t>
+      </w:r>
+      <w:r>
+        <w:rPr>
+          <w:b w:val="0"/>
+        </w:rPr>
+        <w:t xml:space="preserve"> y no tiene este problema. Permite los scripts solo para tu usuario:</w:t>
       </w:r>
     </w:p>
     <w:tbl>
@@ -7320,7 +9158,46 @@
         <w:rPr>
           <w:b w:val="0"/>
         </w:rPr>
-        <w:t xml:space="preserve"> (o Y) cuando pregunte. Si dice que la directiva la controla la organización, es un bloqueo de la empresa: pide ayuda a soporte y avísame.</w:t>
+        <w:t xml:space="preserve"> (o Y) cuando pregunte, cierra PowerShell y vuelve a probar </w:t>
+      </w:r>
+      <w:r>
+        <w:rPr>
+          <w:rFonts w:ascii="Consolas" w:hAnsi="Consolas" w:eastAsia="Consolas"/>
+          <w:color w:val="003D7A"/>
+        </w:rPr>
+        <w:t>npm -v</w:t>
+      </w:r>
+      <w:r>
+        <w:rPr>
+          <w:b w:val="0"/>
+        </w:rPr>
+        <w:t xml:space="preserve">. Mientras tanto también funciona escribir </w:t>
+      </w:r>
+      <w:r>
+        <w:rPr>
+          <w:rFonts w:ascii="Consolas" w:hAnsi="Consolas" w:eastAsia="Consolas"/>
+          <w:color w:val="003D7A"/>
+        </w:rPr>
+        <w:t>npm.cmd</w:t>
+      </w:r>
+      <w:r>
+        <w:rPr>
+          <w:b w:val="0"/>
+        </w:rPr>
+        <w:t xml:space="preserve"> en lugar de </w:t>
+      </w:r>
+      <w:r>
+        <w:rPr>
+          <w:rFonts w:ascii="Consolas" w:hAnsi="Consolas" w:eastAsia="Consolas"/>
+          <w:color w:val="003D7A"/>
+        </w:rPr>
+        <w:t>npm</w:t>
+      </w:r>
+      <w:r>
+        <w:rPr>
+          <w:b w:val="0"/>
+        </w:rPr>
+        <w:t>. Si dice que la directiva la controla la organización, es un bloqueo de la empresa: pide ayuda a soporte y avísame.</w:t>
       </w:r>
     </w:p>
     <w:p>
@@ -7368,7 +9245,7 @@
         <w:rPr>
           <w:b w:val="0"/>
         </w:rPr>
-        <w:t xml:space="preserve"> y </w:t>
+        <w:t xml:space="preserve">, </w:t>
       </w:r>
       <w:r>
         <w:rPr>
@@ -7376,6 +9253,19 @@
           <w:color w:val="003D7A"/>
         </w:rPr>
         <w:t>git --version</w:t>
+      </w:r>
+      <w:r>
+        <w:rPr>
+          <w:b w:val="0"/>
+        </w:rPr>
+        <w:t xml:space="preserve"> y </w:t>
+      </w:r>
+      <w:r>
+        <w:rPr>
+          <w:rFonts w:ascii="Consolas" w:hAnsi="Consolas" w:eastAsia="Consolas"/>
+          <w:color w:val="003D7A"/>
+        </w:rPr>
+        <w:t>node -v</w:t>
       </w:r>
       <w:r>
         <w:rPr>
@@ -7666,6 +9556,24 @@
     </w:lvlOverride>
   </w:num>
   <w:num w:numId="17">
+    <w:abstractNumId w:val="7"/>
+    <w:lvlOverride w:ilvl="0">
+      <w:startOverride w:val="1"/>
+    </w:lvlOverride>
+  </w:num>
+  <w:num w:numId="18">
+    <w:abstractNumId w:val="7"/>
+    <w:lvlOverride w:ilvl="0">
+      <w:startOverride w:val="1"/>
+    </w:lvlOverride>
+  </w:num>
+  <w:num w:numId="19">
+    <w:abstractNumId w:val="7"/>
+    <w:lvlOverride w:ilvl="0">
+      <w:startOverride w:val="1"/>
+    </w:lvlOverride>
+  </w:num>
+  <w:num w:numId="20">
     <w:abstractNumId w:val="7"/>
     <w:lvlOverride w:ilvl="0">
       <w:startOverride w:val="1"/>

</xml_diff>

<commit_message>
Guía de prerrequisitos con npm run instalar:navegador para la clase 4
Co-Authored-By: Claude Opus 5 (1M context) <noreply@anthropic.com>
Claude-Session: https://claude.ai/code/session_01L2JuF1iG72koPJkmuRWSzm
</commit_message>
<xml_diff>
--- a/material-de-apoyo/Prerrequisitos_Instalacion_Entorno_Windows.docx
+++ b/material-de-apoyo/Prerrequisitos_Instalacion_Entorno_Windows.docx
@@ -855,7 +855,7 @@
                 <w:color w:val="003D7A"/>
                 <w:sz w:val="20"/>
               </w:rPr>
-              <w:t>npx playwright install chromium</w:t>
+              <w:t>npm run instalar:navegador</w:t>
             </w:r>
             <w:r>
               <w:rPr>
@@ -6747,7 +6747,7 @@
         <w:rPr>
           <w:b w:val="0"/>
         </w:rPr>
-        <w:t xml:space="preserve">, </w:t>
+        <w:t xml:space="preserve"> y las carpetas </w:t>
       </w:r>
       <w:r>
         <w:rPr>
@@ -6755,6 +6755,19 @@
           <w:color w:val="003D7A"/>
         </w:rPr>
         <w:t>pages</w:t>
+      </w:r>
+      <w:r>
+        <w:rPr>
+          <w:b w:val="0"/>
+        </w:rPr>
+        <w:t xml:space="preserve">, </w:t>
+      </w:r>
+      <w:r>
+        <w:rPr>
+          <w:rFonts w:ascii="Consolas" w:hAnsi="Consolas" w:eastAsia="Consolas"/>
+          <w:color w:val="003D7A"/>
+        </w:rPr>
+        <w:t>data</w:t>
       </w:r>
       <w:r>
         <w:rPr>
@@ -6903,7 +6916,7 @@
                 <w:color w:val="1F2933"/>
                 <w:sz w:val="19"/>
               </w:rPr>
-              <w:t>npx playwright install chromium</w:t>
+              <w:t>npm run instalar:navegador</w:t>
             </w:r>
           </w:p>
         </w:tc>
@@ -6959,13 +6972,13 @@
           <w:rFonts w:ascii="Consolas" w:hAnsi="Consolas" w:eastAsia="Consolas"/>
           <w:color w:val="003D7A"/>
         </w:rPr>
-        <w:t>npx playwright install chromium</w:t>
-      </w:r>
-      <w:r>
-        <w:rPr>
-          <w:b w:val="0"/>
-        </w:rPr>
-        <w:t xml:space="preserve"> descarga el navegador; en nuestra prueba ocupó cerca de </w:t>
+        <w:t>npm run instalar:navegador</w:t>
+      </w:r>
+      <w:r>
+        <w:rPr>
+          <w:b w:val="0"/>
+        </w:rPr>
+        <w:t xml:space="preserve"> descarga el navegador (solo lo corres una vez); en nuestra prueba ocupó cerca de </w:t>
       </w:r>
       <w:r>
         <w:rPr>
@@ -6981,134 +6994,71 @@
       </w:r>
     </w:p>
     <w:p>
-      <w:pPr>
-        <w:keepNext/>
-      </w:pPr>
-      <w:r>
-        <w:rPr>
-          <w:b w:val="0"/>
-        </w:rPr>
-        <w:t xml:space="preserve">Si estás en la red de una empresa, escribe esto </w:t>
-      </w:r>
-      <w:r>
-        <w:rPr>
-          <w:b/>
-        </w:rPr>
-        <w:t>antes</w:t>
-      </w:r>
-      <w:r>
-        <w:rPr>
-          <w:b w:val="0"/>
-        </w:rPr>
-        <w:t xml:space="preserve"> de los dos comandos, en la misma ventana. Le dice a Node.js que confíe en los certificados que tiene instalados Windows:</w:t>
-      </w:r>
-    </w:p>
-    <w:tbl>
-      <w:tblPr>
-        <w:tblW w:type="auto" w:w="0"/>
-        <w:jc w:val="center"/>
-        <w:tblLook w:firstColumn="1" w:firstRow="1" w:lastColumn="0" w:lastRow="0" w:noHBand="0" w:noVBand="1" w:val="04A0"/>
-      </w:tblPr>
-      <w:tblGrid>
-        <w:gridCol w:w="9632"/>
-      </w:tblGrid>
-      <w:tr>
-        <w:trPr>
-          <w:cantSplit/>
-        </w:trPr>
-        <w:tc>
-          <w:tcPr>
-            <w:tcW w:type="dxa" w:w="9632"/>
-            <w:shd w:val="clear" w:color="auto" w:fill="F2F5F9"/>
-            <w:tcBorders>
-              <w:top w:val="nil"/>
-              <w:left w:val="single" w:sz="18" w:color="0072BC"/>
-              <w:bottom w:val="nil"/>
-              <w:right w:val="nil"/>
-            </w:tcBorders>
-          </w:tcPr>
-          <w:p>
-            <w:pPr>
-              <w:keepNext/>
-              <w:spacing w:after="0" w:line="240" w:lineRule="auto"/>
-            </w:pPr>
-            <w:r/>
-            <w:r>
-              <w:rPr>
-                <w:rFonts w:ascii="Consolas" w:hAnsi="Consolas" w:eastAsia="Consolas"/>
-                <w:color w:val="1F2933"/>
-                <w:sz w:val="19"/>
-              </w:rPr>
-              <w:t>$env:NODE_OPTIONS="--use-system-ca"</w:t>
-            </w:r>
-          </w:p>
-          <w:p>
-            <w:pPr>
-              <w:keepNext/>
-              <w:spacing w:after="0" w:line="240" w:lineRule="auto"/>
-            </w:pPr>
-            <w:r>
-              <w:rPr>
-                <w:rFonts w:ascii="Consolas" w:hAnsi="Consolas" w:eastAsia="Consolas"/>
-                <w:color w:val="1F2933"/>
-                <w:sz w:val="19"/>
-              </w:rPr>
-              <w:t>npm ci</w:t>
-            </w:r>
-          </w:p>
-          <w:p>
-            <w:pPr>
-              <w:keepNext/>
-              <w:spacing w:after="0" w:line="240" w:lineRule="auto"/>
-            </w:pPr>
-            <w:r>
-              <w:rPr>
-                <w:rFonts w:ascii="Consolas" w:hAnsi="Consolas" w:eastAsia="Consolas"/>
-                <w:color w:val="1F2933"/>
-                <w:sz w:val="19"/>
-              </w:rPr>
-              <w:t>npx playwright install chromium</w:t>
-            </w:r>
-          </w:p>
-        </w:tc>
-      </w:tr>
-    </w:tbl>
-    <w:p>
-      <w:pPr>
-        <w:spacing w:after="40"/>
-      </w:pPr>
+      <w:r>
+        <w:rPr>
+          <w:b w:val="0"/>
+        </w:rPr>
+        <w:t xml:space="preserve">No tienes que configurar nada para la red de la empresa: el comando </w:t>
+      </w:r>
+      <w:r>
+        <w:rPr>
+          <w:rFonts w:ascii="Consolas" w:hAnsi="Consolas" w:eastAsia="Consolas"/>
+          <w:color w:val="003D7A"/>
+        </w:rPr>
+        <w:t>instalar:navegador</w:t>
+      </w:r>
+      <w:r>
+        <w:rPr>
+          <w:b w:val="0"/>
+        </w:rPr>
+        <w:t xml:space="preserve"> ya le dice a Node.js que use los certificados que tiene instalados el equipo. En nuestra prueba detrás del proxy de la empresa, los dos comandos terminaron bien sin configurar nada más. Si aun así falla, toma una captura del error y envíamela antes de la clase 4.</w:t>
+      </w:r>
     </w:p>
     <w:p>
       <w:r>
         <w:rPr>
           <w:b w:val="0"/>
         </w:rPr>
-        <w:t xml:space="preserve">En nuestra prueba detrás del proxy de la empresa, </w:t>
+        <w:t xml:space="preserve">Con eso la rama queda lista. En clase vamos a usar </w:t>
       </w:r>
       <w:r>
         <w:rPr>
           <w:rFonts w:ascii="Consolas" w:hAnsi="Consolas" w:eastAsia="Consolas"/>
           <w:color w:val="003D7A"/>
         </w:rPr>
-        <w:t>npm ci</w:t>
-      </w:r>
-      <w:r>
-        <w:rPr>
-          <w:b w:val="0"/>
-        </w:rPr>
-        <w:t xml:space="preserve"> funcionó sin la variable, pero la descarga del navegador falló con </w:t>
-      </w:r>
-      <w:r>
-        <w:rPr>
-          <w:b/>
-        </w:rPr>
-        <w:t>unable to get local issuer certificate</w:t>
-      </w:r>
-      <w:r>
-        <w:rPr>
-          <w:b w:val="0"/>
-        </w:rPr>
-        <w:t>; con la variable sí terminó. La variable solo dura mientras esa ventana esté abierta. Si aun así falla, toma una captura del error y envíamela antes de la clase 4.</w:t>
+        <w:t>npm test</w:t>
+      </w:r>
+      <w:r>
+        <w:rPr>
+          <w:b w:val="0"/>
+        </w:rPr>
+        <w:t xml:space="preserve"> para correr las pruebas, </w:t>
+      </w:r>
+      <w:r>
+        <w:rPr>
+          <w:rFonts w:ascii="Consolas" w:hAnsi="Consolas" w:eastAsia="Consolas"/>
+          <w:color w:val="003D7A"/>
+        </w:rPr>
+        <w:t>npm run test:visible</w:t>
+      </w:r>
+      <w:r>
+        <w:rPr>
+          <w:b w:val="0"/>
+        </w:rPr>
+        <w:t xml:space="preserve"> para verlas en el navegador y </w:t>
+      </w:r>
+      <w:r>
+        <w:rPr>
+          <w:rFonts w:ascii="Consolas" w:hAnsi="Consolas" w:eastAsia="Consolas"/>
+          <w:color w:val="003D7A"/>
+        </w:rPr>
+        <w:t>npm run reporte</w:t>
+      </w:r>
+      <w:r>
+        <w:rPr>
+          <w:b w:val="0"/>
+        </w:rPr>
+        <w:t xml:space="preserve"> para abrir el reporte.</w:t>
       </w:r>
     </w:p>
     <w:p>
@@ -8671,26 +8621,26 @@
         <w:rPr>
           <w:b/>
         </w:rPr>
-        <w:t>npm y Playwright</w:t>
-      </w:r>
-      <w:r>
-        <w:rPr>
-          <w:b w:val="0"/>
-        </w:rPr>
-        <w:t xml:space="preserve"> (clase 4): antes de </w:t>
+        <w:t>Playwright</w:t>
+      </w:r>
+      <w:r>
+        <w:rPr>
+          <w:b w:val="0"/>
+        </w:rPr>
+        <w:t xml:space="preserve"> (clase 4): usa </w:t>
       </w:r>
       <w:r>
         <w:rPr>
           <w:rFonts w:ascii="Consolas" w:hAnsi="Consolas" w:eastAsia="Consolas"/>
           <w:color w:val="003D7A"/>
         </w:rPr>
-        <w:t>npm ci</w:t>
-      </w:r>
-      <w:r>
-        <w:rPr>
-          <w:b w:val="0"/>
-        </w:rPr>
-        <w:t xml:space="preserve"> y de </w:t>
+        <w:t>npm run instalar:navegador</w:t>
+      </w:r>
+      <w:r>
+        <w:rPr>
+          <w:b w:val="0"/>
+        </w:rPr>
+        <w:t xml:space="preserve">, que ya confía en los certificados del equipo. Solo si instalas el navegador por otro camino (por ejemplo </w:t>
       </w:r>
       <w:r>
         <w:rPr>
@@ -8703,7 +8653,7 @@
         <w:rPr>
           <w:b w:val="0"/>
         </w:rPr>
-        <w:t xml:space="preserve"> escribe </w:t>
+        <w:t xml:space="preserve">), escribe antes </w:t>
       </w:r>
       <w:r>
         <w:rPr>
@@ -8716,7 +8666,7 @@
         <w:rPr>
           <w:b w:val="0"/>
         </w:rPr>
-        <w:t xml:space="preserve"> en la misma ventana de PowerShell. Dura mientras la ventana esté abierta. El error típico es "unable to get local issuer certificate".</w:t>
+        <w:t xml:space="preserve"> en la misma ventana de PowerShell. El error típico sin eso es "unable to get local issuer certificate".</w:t>
       </w:r>
     </w:p>
     <w:p>

</xml_diff>

<commit_message>
Clase 4: usar npm run instalar:navegador en la guía de prerrequisitos y el README
La rama 04 trae el script instalar:navegador, que ya usa los certificados del equipo, así
que la variable NODE_OPTIONS queda solo como alternativa. El README lista los comandos de
la rama 04 y la carpeta data/.

Co-Authored-By: Claude Opus 5 (1M context) <noreply@anthropic.com>
Claude-Session: https://claude.ai/code/session_01L2JuF1iG72koPJkmuRWSzm
</commit_message>
<xml_diff>
--- a/material-de-apoyo/Prerrequisitos_Instalacion_Entorno_Windows.docx
+++ b/material-de-apoyo/Prerrequisitos_Instalacion_Entorno_Windows.docx
@@ -855,7 +855,7 @@
                 <w:color w:val="003D7A"/>
                 <w:sz w:val="20"/>
               </w:rPr>
-              <w:t>npx playwright install chromium</w:t>
+              <w:t>npm run instalar:navegador</w:t>
             </w:r>
             <w:r>
               <w:rPr>
@@ -6747,7 +6747,7 @@
         <w:rPr>
           <w:b w:val="0"/>
         </w:rPr>
-        <w:t xml:space="preserve">, </w:t>
+        <w:t xml:space="preserve"> y las carpetas </w:t>
       </w:r>
       <w:r>
         <w:rPr>
@@ -6755,6 +6755,19 @@
           <w:color w:val="003D7A"/>
         </w:rPr>
         <w:t>pages</w:t>
+      </w:r>
+      <w:r>
+        <w:rPr>
+          <w:b w:val="0"/>
+        </w:rPr>
+        <w:t xml:space="preserve">, </w:t>
+      </w:r>
+      <w:r>
+        <w:rPr>
+          <w:rFonts w:ascii="Consolas" w:hAnsi="Consolas" w:eastAsia="Consolas"/>
+          <w:color w:val="003D7A"/>
+        </w:rPr>
+        <w:t>data</w:t>
       </w:r>
       <w:r>
         <w:rPr>
@@ -6903,7 +6916,7 @@
                 <w:color w:val="1F2933"/>
                 <w:sz w:val="19"/>
               </w:rPr>
-              <w:t>npx playwright install chromium</w:t>
+              <w:t>npm run instalar:navegador</w:t>
             </w:r>
           </w:p>
         </w:tc>
@@ -6959,13 +6972,13 @@
           <w:rFonts w:ascii="Consolas" w:hAnsi="Consolas" w:eastAsia="Consolas"/>
           <w:color w:val="003D7A"/>
         </w:rPr>
-        <w:t>npx playwright install chromium</w:t>
-      </w:r>
-      <w:r>
-        <w:rPr>
-          <w:b w:val="0"/>
-        </w:rPr>
-        <w:t xml:space="preserve"> descarga el navegador; en nuestra prueba ocupó cerca de </w:t>
+        <w:t>npm run instalar:navegador</w:t>
+      </w:r>
+      <w:r>
+        <w:rPr>
+          <w:b w:val="0"/>
+        </w:rPr>
+        <w:t xml:space="preserve"> descarga el navegador (solo lo corres una vez); en nuestra prueba ocupó cerca de </w:t>
       </w:r>
       <w:r>
         <w:rPr>
@@ -6981,134 +6994,71 @@
       </w:r>
     </w:p>
     <w:p>
-      <w:pPr>
-        <w:keepNext/>
-      </w:pPr>
-      <w:r>
-        <w:rPr>
-          <w:b w:val="0"/>
-        </w:rPr>
-        <w:t xml:space="preserve">Si estás en la red de una empresa, escribe esto </w:t>
-      </w:r>
-      <w:r>
-        <w:rPr>
-          <w:b/>
-        </w:rPr>
-        <w:t>antes</w:t>
-      </w:r>
-      <w:r>
-        <w:rPr>
-          <w:b w:val="0"/>
-        </w:rPr>
-        <w:t xml:space="preserve"> de los dos comandos, en la misma ventana. Le dice a Node.js que confíe en los certificados que tiene instalados Windows:</w:t>
-      </w:r>
-    </w:p>
-    <w:tbl>
-      <w:tblPr>
-        <w:tblW w:type="auto" w:w="0"/>
-        <w:jc w:val="center"/>
-        <w:tblLook w:firstColumn="1" w:firstRow="1" w:lastColumn="0" w:lastRow="0" w:noHBand="0" w:noVBand="1" w:val="04A0"/>
-      </w:tblPr>
-      <w:tblGrid>
-        <w:gridCol w:w="9632"/>
-      </w:tblGrid>
-      <w:tr>
-        <w:trPr>
-          <w:cantSplit/>
-        </w:trPr>
-        <w:tc>
-          <w:tcPr>
-            <w:tcW w:type="dxa" w:w="9632"/>
-            <w:shd w:val="clear" w:color="auto" w:fill="F2F5F9"/>
-            <w:tcBorders>
-              <w:top w:val="nil"/>
-              <w:left w:val="single" w:sz="18" w:color="0072BC"/>
-              <w:bottom w:val="nil"/>
-              <w:right w:val="nil"/>
-            </w:tcBorders>
-          </w:tcPr>
-          <w:p>
-            <w:pPr>
-              <w:keepNext/>
-              <w:spacing w:after="0" w:line="240" w:lineRule="auto"/>
-            </w:pPr>
-            <w:r/>
-            <w:r>
-              <w:rPr>
-                <w:rFonts w:ascii="Consolas" w:hAnsi="Consolas" w:eastAsia="Consolas"/>
-                <w:color w:val="1F2933"/>
-                <w:sz w:val="19"/>
-              </w:rPr>
-              <w:t>$env:NODE_OPTIONS="--use-system-ca"</w:t>
-            </w:r>
-          </w:p>
-          <w:p>
-            <w:pPr>
-              <w:keepNext/>
-              <w:spacing w:after="0" w:line="240" w:lineRule="auto"/>
-            </w:pPr>
-            <w:r>
-              <w:rPr>
-                <w:rFonts w:ascii="Consolas" w:hAnsi="Consolas" w:eastAsia="Consolas"/>
-                <w:color w:val="1F2933"/>
-                <w:sz w:val="19"/>
-              </w:rPr>
-              <w:t>npm ci</w:t>
-            </w:r>
-          </w:p>
-          <w:p>
-            <w:pPr>
-              <w:keepNext/>
-              <w:spacing w:after="0" w:line="240" w:lineRule="auto"/>
-            </w:pPr>
-            <w:r>
-              <w:rPr>
-                <w:rFonts w:ascii="Consolas" w:hAnsi="Consolas" w:eastAsia="Consolas"/>
-                <w:color w:val="1F2933"/>
-                <w:sz w:val="19"/>
-              </w:rPr>
-              <w:t>npx playwright install chromium</w:t>
-            </w:r>
-          </w:p>
-        </w:tc>
-      </w:tr>
-    </w:tbl>
-    <w:p>
-      <w:pPr>
-        <w:spacing w:after="40"/>
-      </w:pPr>
+      <w:r>
+        <w:rPr>
+          <w:b w:val="0"/>
+        </w:rPr>
+        <w:t xml:space="preserve">No tienes que configurar nada para la red de la empresa: el comando </w:t>
+      </w:r>
+      <w:r>
+        <w:rPr>
+          <w:rFonts w:ascii="Consolas" w:hAnsi="Consolas" w:eastAsia="Consolas"/>
+          <w:color w:val="003D7A"/>
+        </w:rPr>
+        <w:t>instalar:navegador</w:t>
+      </w:r>
+      <w:r>
+        <w:rPr>
+          <w:b w:val="0"/>
+        </w:rPr>
+        <w:t xml:space="preserve"> ya le dice a Node.js que use los certificados que tiene instalados el equipo. En nuestra prueba detrás del proxy de la empresa, los dos comandos terminaron bien sin configurar nada más. Si aun así falla, toma una captura del error y envíamela antes de la clase 4.</w:t>
+      </w:r>
     </w:p>
     <w:p>
       <w:r>
         <w:rPr>
           <w:b w:val="0"/>
         </w:rPr>
-        <w:t xml:space="preserve">En nuestra prueba detrás del proxy de la empresa, </w:t>
+        <w:t xml:space="preserve">Con eso la rama queda lista. En clase vamos a usar </w:t>
       </w:r>
       <w:r>
         <w:rPr>
           <w:rFonts w:ascii="Consolas" w:hAnsi="Consolas" w:eastAsia="Consolas"/>
           <w:color w:val="003D7A"/>
         </w:rPr>
-        <w:t>npm ci</w:t>
-      </w:r>
-      <w:r>
-        <w:rPr>
-          <w:b w:val="0"/>
-        </w:rPr>
-        <w:t xml:space="preserve"> funcionó sin la variable, pero la descarga del navegador falló con </w:t>
-      </w:r>
-      <w:r>
-        <w:rPr>
-          <w:b/>
-        </w:rPr>
-        <w:t>unable to get local issuer certificate</w:t>
-      </w:r>
-      <w:r>
-        <w:rPr>
-          <w:b w:val="0"/>
-        </w:rPr>
-        <w:t>; con la variable sí terminó. La variable solo dura mientras esa ventana esté abierta. Si aun así falla, toma una captura del error y envíamela antes de la clase 4.</w:t>
+        <w:t>npm test</w:t>
+      </w:r>
+      <w:r>
+        <w:rPr>
+          <w:b w:val="0"/>
+        </w:rPr>
+        <w:t xml:space="preserve"> para correr las pruebas, </w:t>
+      </w:r>
+      <w:r>
+        <w:rPr>
+          <w:rFonts w:ascii="Consolas" w:hAnsi="Consolas" w:eastAsia="Consolas"/>
+          <w:color w:val="003D7A"/>
+        </w:rPr>
+        <w:t>npm run test:visible</w:t>
+      </w:r>
+      <w:r>
+        <w:rPr>
+          <w:b w:val="0"/>
+        </w:rPr>
+        <w:t xml:space="preserve"> para verlas en el navegador y </w:t>
+      </w:r>
+      <w:r>
+        <w:rPr>
+          <w:rFonts w:ascii="Consolas" w:hAnsi="Consolas" w:eastAsia="Consolas"/>
+          <w:color w:val="003D7A"/>
+        </w:rPr>
+        <w:t>npm run reporte</w:t>
+      </w:r>
+      <w:r>
+        <w:rPr>
+          <w:b w:val="0"/>
+        </w:rPr>
+        <w:t xml:space="preserve"> para abrir el reporte.</w:t>
       </w:r>
     </w:p>
     <w:p>
@@ -8671,26 +8621,26 @@
         <w:rPr>
           <w:b/>
         </w:rPr>
-        <w:t>npm y Playwright</w:t>
-      </w:r>
-      <w:r>
-        <w:rPr>
-          <w:b w:val="0"/>
-        </w:rPr>
-        <w:t xml:space="preserve"> (clase 4): antes de </w:t>
+        <w:t>Playwright</w:t>
+      </w:r>
+      <w:r>
+        <w:rPr>
+          <w:b w:val="0"/>
+        </w:rPr>
+        <w:t xml:space="preserve"> (clase 4): usa </w:t>
       </w:r>
       <w:r>
         <w:rPr>
           <w:rFonts w:ascii="Consolas" w:hAnsi="Consolas" w:eastAsia="Consolas"/>
           <w:color w:val="003D7A"/>
         </w:rPr>
-        <w:t>npm ci</w:t>
-      </w:r>
-      <w:r>
-        <w:rPr>
-          <w:b w:val="0"/>
-        </w:rPr>
-        <w:t xml:space="preserve"> y de </w:t>
+        <w:t>npm run instalar:navegador</w:t>
+      </w:r>
+      <w:r>
+        <w:rPr>
+          <w:b w:val="0"/>
+        </w:rPr>
+        <w:t xml:space="preserve">, que ya confía en los certificados del equipo. Solo si instalas el navegador por otro camino (por ejemplo </w:t>
       </w:r>
       <w:r>
         <w:rPr>
@@ -8703,7 +8653,7 @@
         <w:rPr>
           <w:b w:val="0"/>
         </w:rPr>
-        <w:t xml:space="preserve"> escribe </w:t>
+        <w:t xml:space="preserve">), escribe antes </w:t>
       </w:r>
       <w:r>
         <w:rPr>
@@ -8716,7 +8666,7 @@
         <w:rPr>
           <w:b w:val="0"/>
         </w:rPr>
-        <w:t xml:space="preserve"> en la misma ventana de PowerShell. Dura mientras la ventana esté abierta. El error típico es "unable to get local issuer certificate".</w:t>
+        <w:t xml:space="preserve"> en la misma ventana de PowerShell. El error típico sin eso es "unable to get local issuer certificate".</w:t>
       </w:r>
     </w:p>
     <w:p>

</xml_diff>

<commit_message>
Actualizar guía de prerrequisitos: Node.js y VS Code para la clase 4
Co-Authored-By: Claude Opus 5 (1M context) <noreply@anthropic.com>
Claude-Session: https://claude.ai/code/session_01L2JuF1iG72koPJkmuRWSzm
</commit_message>
<xml_diff>
--- a/material-de-apoyo/Prerrequisitos_Instalacion_Entorno_Windows.docx
+++ b/material-de-apoyo/Prerrequisitos_Instalacion_Entorno_Windows.docx
@@ -44,11 +44,7 @@
         <w:t>Paso a paso para dejar listo tu equipo Windows antes de la primera clase</w:t>
       </w:r>
     </w:p>
-    <w:p>
-      <w:pPr>
-        <w:keepNext/>
-      </w:pPr>
-    </w:p>
+    <w:p/>
     <w:tbl>
       <w:tblPr>
         <w:tblW w:type="auto" w:w="0"/>
@@ -322,14 +318,11 @@
       </w:r>
     </w:p>
     <w:p>
-      <w:pPr>
-        <w:keepNext/>
-      </w:pPr>
-      <w:r>
-        <w:rPr>
-          <w:b w:val="0"/>
-        </w:rPr>
-        <w:t>Esta guía es para ti aunque nunca hayas instalado una herramienta de programación. Vas a instalar seis cosas, una detrás de otra, y después de cada una vas a comprobar que quedó bien con un comando. Si algo no sale como dice aquí, no sigas con la siguiente: revisa el apartado de esa herramienta o el capítulo de problemas frecuentes al final.</w:t>
+      <w:r>
+        <w:rPr>
+          <w:b w:val="0"/>
+        </w:rPr>
+        <w:t>Esta guía es para ti aunque nunca hayas instalado una herramienta de programación. Vas a instalar ocho cosas, una detrás de otra, y después de cada una vas a comprobar que quedó bien con un comando. Si algo no sale como dice aquí, no sigas con la siguiente: revisa el apartado de esa herramienta o el capítulo de problemas frecuentes al final.</w:t>
       </w:r>
     </w:p>
     <w:p>
@@ -518,7 +511,7 @@
                 <w:b w:val="0"/>
                 <w:sz w:val="20"/>
               </w:rPr>
-              <w:t>Compila y ejecuta los proyectos (</w:t>
+              <w:t>Compila y ejecuta los proyectos Java (</w:t>
             </w:r>
             <w:r>
               <w:rPr>
@@ -533,7 +526,7 @@
                 <w:b w:val="0"/>
                 <w:sz w:val="20"/>
               </w:rPr>
-              <w:t xml:space="preserve"> en la clase 1). Desde la clase 2 descarga Serenity, Cucumber, Playwright y JUnit.</w:t>
+              <w:t xml:space="preserve"> en la clase 1). En las clases 2 y 3 descarga Serenity, Cucumber y JUnit y corre las pruebas.</w:t>
             </w:r>
           </w:p>
         </w:tc>
@@ -637,7 +630,126 @@
                 <w:b w:val="0"/>
                 <w:sz w:val="20"/>
               </w:rPr>
-              <w:t>El editor donde lees y escribes el código. Es gratuito para lo que vamos a hacer.</w:t>
+              <w:t>El editor de las clases 1 a 3, donde lees y escribes el código Java. Es gratuito para lo que vamos a hacer.</w:t>
+            </w:r>
+          </w:p>
+        </w:tc>
+      </w:tr>
+      <w:tr>
+        <w:trPr>
+          <w:cantSplit/>
+        </w:trPr>
+        <w:tc>
+          <w:tcPr>
+            <w:tcW w:type="dxa" w:w="2835"/>
+            <w:tcBorders>
+              <w:top w:val="single" w:sz="6" w:color="D0D7DE"/>
+              <w:left w:val="single" w:sz="6" w:color="D0D7DE"/>
+              <w:bottom w:val="single" w:sz="6" w:color="D0D7DE"/>
+              <w:right w:val="single" w:sz="6" w:color="D0D7DE"/>
+            </w:tcBorders>
+          </w:tcPr>
+          <w:p>
+            <w:pPr>
+              <w:keepNext/>
+            </w:pPr>
+            <w:r>
+              <w:rPr>
+                <w:b w:val="0"/>
+                <w:sz w:val="20"/>
+              </w:rPr>
+              <w:t>Node.js 24 LTS</w:t>
+            </w:r>
+          </w:p>
+        </w:tc>
+        <w:tc>
+          <w:tcPr>
+            <w:tcW w:type="dxa" w:w="6803"/>
+            <w:tcBorders>
+              <w:top w:val="single" w:sz="6" w:color="D0D7DE"/>
+              <w:left w:val="single" w:sz="6" w:color="D0D7DE"/>
+              <w:bottom w:val="single" w:sz="6" w:color="D0D7DE"/>
+              <w:right w:val="single" w:sz="6" w:color="D0D7DE"/>
+            </w:tcBorders>
+          </w:tcPr>
+          <w:p>
+            <w:pPr>
+              <w:keepNext/>
+            </w:pPr>
+            <w:r>
+              <w:rPr>
+                <w:b w:val="0"/>
+                <w:sz w:val="20"/>
+              </w:rPr>
+              <w:t xml:space="preserve">Ejecuta Playwright con TypeScript en la clase 4. Trae </w:t>
+            </w:r>
+            <w:r>
+              <w:rPr>
+                <w:rFonts w:ascii="Consolas" w:hAnsi="Consolas" w:eastAsia="Consolas"/>
+                <w:color w:val="003D7A"/>
+                <w:sz w:val="20"/>
+              </w:rPr>
+              <w:t>npm</w:t>
+            </w:r>
+            <w:r>
+              <w:rPr>
+                <w:b w:val="0"/>
+                <w:sz w:val="20"/>
+              </w:rPr>
+              <w:t>, que descarga las librerías del proyecto.</w:t>
+            </w:r>
+          </w:p>
+        </w:tc>
+      </w:tr>
+      <w:tr>
+        <w:trPr>
+          <w:cantSplit/>
+        </w:trPr>
+        <w:tc>
+          <w:tcPr>
+            <w:tcW w:type="dxa" w:w="2835"/>
+            <w:shd w:val="clear" w:color="auto" w:fill="F2F5F9"/>
+            <w:tcBorders>
+              <w:top w:val="single" w:sz="6" w:color="D0D7DE"/>
+              <w:left w:val="single" w:sz="6" w:color="D0D7DE"/>
+              <w:bottom w:val="single" w:sz="6" w:color="D0D7DE"/>
+              <w:right w:val="single" w:sz="6" w:color="D0D7DE"/>
+            </w:tcBorders>
+          </w:tcPr>
+          <w:p>
+            <w:pPr>
+              <w:keepNext/>
+            </w:pPr>
+            <w:r>
+              <w:rPr>
+                <w:b w:val="0"/>
+                <w:sz w:val="20"/>
+              </w:rPr>
+              <w:t>Visual Studio Code</w:t>
+            </w:r>
+          </w:p>
+        </w:tc>
+        <w:tc>
+          <w:tcPr>
+            <w:tcW w:type="dxa" w:w="6803"/>
+            <w:shd w:val="clear" w:color="auto" w:fill="F2F5F9"/>
+            <w:tcBorders>
+              <w:top w:val="single" w:sz="6" w:color="D0D7DE"/>
+              <w:left w:val="single" w:sz="6" w:color="D0D7DE"/>
+              <w:bottom w:val="single" w:sz="6" w:color="D0D7DE"/>
+              <w:right w:val="single" w:sz="6" w:color="D0D7DE"/>
+            </w:tcBorders>
+          </w:tcPr>
+          <w:p>
+            <w:pPr>
+              <w:keepNext/>
+            </w:pPr>
+            <w:r>
+              <w:rPr>
+                <w:b w:val="0"/>
+                <w:sz w:val="20"/>
+              </w:rPr>
+              <w:t>El editor de la clase 4, con la extensión Playwright Test for VSCode para correr las pruebas con un clic.</w:t>
             </w:r>
           </w:p>
         </w:tc>
@@ -688,7 +800,7 @@
                 <w:b w:val="0"/>
                 <w:sz w:val="20"/>
               </w:rPr>
-              <w:t>El navegador que automatizamos en las clases 2 y 4.</w:t>
+              <w:t>El navegador que automatizamos en la clase 2.</w:t>
             </w:r>
           </w:p>
         </w:tc>
@@ -735,7 +847,22 @@
                 <w:b w:val="0"/>
                 <w:sz w:val="20"/>
               </w:rPr>
-              <w:t>El Chromium que usa Playwright en la clase 4. Se instala con un comando de Gradle.</w:t>
+              <w:t xml:space="preserve">El Chromium que usa Playwright en la clase 4. Se instala con </w:t>
+            </w:r>
+            <w:r>
+              <w:rPr>
+                <w:rFonts w:ascii="Consolas" w:hAnsi="Consolas" w:eastAsia="Consolas"/>
+                <w:color w:val="003D7A"/>
+                <w:sz w:val="20"/>
+              </w:rPr>
+              <w:t>npm run instalar:navegador</w:t>
+            </w:r>
+            <w:r>
+              <w:rPr>
+                <w:b w:val="0"/>
+                <w:sz w:val="20"/>
+              </w:rPr>
+              <w:t>.</w:t>
             </w:r>
           </w:p>
         </w:tc>
@@ -777,7 +904,7 @@
         <w:rPr>
           <w:b w:val="0"/>
         </w:rPr>
-        <w:t xml:space="preserve"> en el disco C. IntelliJ IDEA solo pide 10 GB según JetBrains, y a eso se suman Java, Gradle, Git, las librerías que Gradle descarga para cada clase y los navegadores de Playwright. Tu equipo debería tener 8 GB de memoria RAM o más; con menos funciona, pero lento.</w:t>
+        <w:t xml:space="preserve"> en el disco C. IntelliJ IDEA solo pide 10 GB según JetBrains, y a eso se suman Java, Gradle, Git, Node.js, Visual Studio Code, las librerías que se descargan para cada clase y el navegador de Playwright (cerca de 560 MB). Tu equipo debería tener 8 GB de memoria RAM o más; con menos funciona, pero lento.</w:t>
       </w:r>
     </w:p>
     <w:p>
@@ -785,7 +912,7 @@
         <w:rPr>
           <w:b w:val="0"/>
         </w:rPr>
-        <w:t>Con una conexión normal todo el proceso toma entre una hora y media y dos horas. Lo que más tarda es la descarga de IntelliJ IDEA (el instalador pesa cerca de 1,2 GB).</w:t>
+        <w:t>Con una conexión normal todo el proceso toma entre una hora y media y dos horas. Lo que más tarda es la descarga de IntelliJ IDEA (el instalador pesa cerca de 1,2 GB); Node.js y Visual Studio Code son rápidos.</w:t>
       </w:r>
     </w:p>
     <w:p>
@@ -807,7 +934,7 @@
         <w:rPr>
           <w:b w:val="0"/>
         </w:rPr>
-        <w:t xml:space="preserve">Los instaladores de Java, Git, IntelliJ y Chrome piden permiso de administrador. Cuando Windows muestre la ventana "¿Quieres permitir que esta aplicación haga cambios en el dispositivo?", dale clic en </w:t>
+        <w:t xml:space="preserve">Los instaladores de Java, Git, IntelliJ, Node.js y Chrome piden permiso de administrador. Cuando Windows muestre la ventana "¿Quieres permitir que esta aplicación haga cambios en el dispositivo?", dale clic en </w:t>
       </w:r>
       <w:r>
         <w:rPr>
@@ -863,7 +990,7 @@
               <w:rPr>
                 <w:b w:val="0"/>
               </w:rPr>
-              <w:t>Si tu computador es de la empresa y no te deja instalar (te pide un usuario y contraseña de administrador que no tienes), no intentes saltarte el bloqueo. Abre un caso con soporte técnico, pásales esta guía y pídeles que instalen Java 21, Git, IntelliJ IDEA y Chrome, y que te ayuden con Gradle y la variable Path. Hazlo con varios días de anticipación porque esos casos pueden demorar.</w:t>
+              <w:t>Si tu computador es de la empresa y no te deja instalar (te pide un usuario y contraseña de administrador que no tienes), no intentes saltarte el bloqueo. Abre un caso con soporte técnico, pásales esta guía y pídeles que instalen Java 21, Git, IntelliJ IDEA, Node.js 24, Visual Studio Code y Chrome, y que te ayuden con Gradle y la variable Path. Hazlo con varios días de anticipación porque esos casos pueden demorar.</w:t>
             </w:r>
           </w:p>
         </w:tc>
@@ -1031,9 +1158,6 @@
       </w:r>
     </w:p>
     <w:p>
-      <w:pPr>
-        <w:keepNext/>
-      </w:pPr>
       <w:r>
         <w:rPr>
           <w:b w:val="0"/>
@@ -1145,7 +1269,7 @@
       <w:r>
         <w:drawing>
           <wp:inline xmlns:a="http://schemas.openxmlformats.org/drawingml/2006/main" xmlns:pic="http://schemas.openxmlformats.org/drawingml/2006/picture">
-            <wp:extent cx="5580000" cy="3104539"/>
+            <wp:extent cx="3420000" cy="1902782"/>
             <wp:docPr id="1" name="Picture 1"/>
             <wp:cNvGraphicFramePr>
               <a:graphicFrameLocks noChangeAspect="1"/>
@@ -1166,7 +1290,7 @@
                   <pic:spPr>
                     <a:xfrm>
                       <a:off x="0" y="0"/>
-                      <a:ext cx="5580000" cy="3104539"/>
+                      <a:ext cx="3420000" cy="1902782"/>
                     </a:xfrm>
                     <a:prstGeom prst="rect"/>
                   </pic:spPr>
@@ -1848,9 +1972,6 @@
       </w:r>
     </w:p>
     <w:p>
-      <w:pPr>
-        <w:keepNext/>
-      </w:pPr>
       <w:r>
         <w:rPr>
           <w:b w:val="0"/>
@@ -1964,7 +2085,7 @@
       <w:r>
         <w:drawing>
           <wp:inline xmlns:a="http://schemas.openxmlformats.org/drawingml/2006/main" xmlns:pic="http://schemas.openxmlformats.org/drawingml/2006/picture">
-            <wp:extent cx="3960000" cy="1897500"/>
+            <wp:extent cx="2880000" cy="1380000"/>
             <wp:docPr id="2" name="Picture 2"/>
             <wp:cNvGraphicFramePr>
               <a:graphicFrameLocks noChangeAspect="1"/>
@@ -1985,7 +2106,7 @@
                   <pic:spPr>
                     <a:xfrm>
                       <a:off x="0" y="0"/>
-                      <a:ext cx="3960000" cy="1897500"/>
+                      <a:ext cx="2880000" cy="1380000"/>
                     </a:xfrm>
                     <a:prstGeom prst="rect"/>
                   </pic:spPr>
@@ -2982,9 +3103,6 @@
       </w:r>
     </w:p>
     <w:p>
-      <w:pPr>
-        <w:keepNext/>
-      </w:pPr>
       <w:r>
         <w:rPr>
           <w:b w:val="0"/>
@@ -3061,7 +3179,7 @@
       <w:r>
         <w:drawing>
           <wp:inline xmlns:a="http://schemas.openxmlformats.org/drawingml/2006/main" xmlns:pic="http://schemas.openxmlformats.org/drawingml/2006/picture">
-            <wp:extent cx="5040000" cy="2571429"/>
+            <wp:extent cx="3780000" cy="1928571"/>
             <wp:docPr id="3" name="Picture 3"/>
             <wp:cNvGraphicFramePr>
               <a:graphicFrameLocks noChangeAspect="1"/>
@@ -3082,7 +3200,7 @@
                   <pic:spPr>
                     <a:xfrm>
                       <a:off x="0" y="0"/>
-                      <a:ext cx="5040000" cy="2571429"/>
+                      <a:ext cx="3780000" cy="1928571"/>
                     </a:xfrm>
                     <a:prstGeom prst="rect"/>
                   </pic:spPr>
@@ -3631,14 +3749,11 @@
       </w:r>
     </w:p>
     <w:p>
-      <w:pPr>
-        <w:keepNext/>
-      </w:pPr>
-      <w:r>
-        <w:rPr>
-          <w:b w:val="0"/>
-        </w:rPr>
-        <w:t xml:space="preserve">IntelliJ IDEA es el editor que usamos para leer, escribir y ejecutar el código Java. Antes existían dos ediciones, Community (gratis) y Ultimate (paga). Desde la versión 2025.3 JetBrains las unió en </w:t>
+      <w:r>
+        <w:rPr>
+          <w:b w:val="0"/>
+        </w:rPr>
+        <w:t xml:space="preserve">IntelliJ IDEA es el editor que usamos en las clases 1 a 3 para leer, escribir y ejecutar el código Java. Antes existían dos ediciones, Community (gratis) y Ultimate (paga). Desde la versión 2025.3 JetBrains las unió en </w:t>
       </w:r>
       <w:r>
         <w:rPr>
@@ -3734,7 +3849,7 @@
       <w:r>
         <w:drawing>
           <wp:inline xmlns:a="http://schemas.openxmlformats.org/drawingml/2006/main" xmlns:pic="http://schemas.openxmlformats.org/drawingml/2006/picture">
-            <wp:extent cx="5580000" cy="2595349"/>
+            <wp:extent cx="4140000" cy="1925581"/>
             <wp:docPr id="4" name="Picture 4"/>
             <wp:cNvGraphicFramePr>
               <a:graphicFrameLocks noChangeAspect="1"/>
@@ -3755,7 +3870,7 @@
                   <pic:spPr>
                     <a:xfrm>
                       <a:off x="0" y="0"/>
-                      <a:ext cx="5580000" cy="2595349"/>
+                      <a:ext cx="4140000" cy="1925581"/>
                     </a:xfrm>
                     <a:prstGeom prst="rect"/>
                   </pic:spPr>
@@ -4227,7 +4342,7 @@
         <w:rPr>
           <w:b w:val="0"/>
         </w:rPr>
-        <w:t>Esto lo haces después de clonar el repositorio (paso 6). Lo dejo aquí para que tengas todo lo de IntelliJ junto.</w:t>
+        <w:t>Esto lo haces después de clonar el repositorio (paso 8). Lo dejo aquí para que tengas todo lo de IntelliJ junto.</w:t>
       </w:r>
     </w:p>
     <w:p>
@@ -4697,7 +4812,479 @@
           <w:color w:val="003D7A"/>
           <w:sz w:val="36"/>
         </w:rPr>
-        <w:t>Paso 5. Google Chrome</w:t>
+        <w:t>Paso 5. Node.js 24 LTS (clase 4)</w:t>
+      </w:r>
+    </w:p>
+    <w:p>
+      <w:r>
+        <w:rPr>
+          <w:b w:val="0"/>
+        </w:rPr>
+        <w:t xml:space="preserve">La clase 4 no es en Java: usamos </w:t>
+      </w:r>
+      <w:r>
+        <w:rPr>
+          <w:b/>
+        </w:rPr>
+        <w:t>Playwright con TypeScript</w:t>
+      </w:r>
+      <w:r>
+        <w:rPr>
+          <w:b w:val="0"/>
+        </w:rPr>
+        <w:t xml:space="preserve">. Para eso necesitas Node.js, que ejecuta ese código, y </w:t>
+      </w:r>
+      <w:r>
+        <w:rPr>
+          <w:rFonts w:ascii="Consolas" w:hAnsi="Consolas" w:eastAsia="Consolas"/>
+          <w:color w:val="003D7A"/>
+        </w:rPr>
+        <w:t>npm</w:t>
+      </w:r>
+      <w:r>
+        <w:rPr>
+          <w:b w:val="0"/>
+        </w:rPr>
+        <w:t xml:space="preserve">, que viene incluido y descarga las librerías del proyecto. Instalamos la versión </w:t>
+      </w:r>
+      <w:r>
+        <w:rPr>
+          <w:b/>
+        </w:rPr>
+        <w:t>24 LTS</w:t>
+      </w:r>
+      <w:r>
+        <w:rPr>
+          <w:b w:val="0"/>
+        </w:rPr>
+        <w:t xml:space="preserve"> (la de soporte de largo plazo).</w:t>
+      </w:r>
+    </w:p>
+    <w:p>
+      <w:pPr>
+        <w:keepNext/>
+        <w:spacing w:before="200" w:after="80"/>
+      </w:pPr>
+      <w:r>
+        <w:rPr>
+          <w:b/>
+          <w:color w:val="0072BC"/>
+          <w:sz w:val="28"/>
+        </w:rPr>
+        <w:t>Descarga</w:t>
+      </w:r>
+    </w:p>
+    <w:tbl>
+      <w:tblPr>
+        <w:tblW w:type="auto" w:w="0"/>
+        <w:jc w:val="center"/>
+        <w:tblLook w:firstColumn="1" w:firstRow="1" w:lastColumn="0" w:lastRow="0" w:noHBand="0" w:noVBand="1" w:val="04A0"/>
+      </w:tblPr>
+      <w:tblGrid>
+        <w:gridCol w:w="9632"/>
+      </w:tblGrid>
+      <w:tr>
+        <w:trPr>
+          <w:cantSplit/>
+        </w:trPr>
+        <w:tc>
+          <w:tcPr>
+            <w:tcW w:type="dxa" w:w="9632"/>
+            <w:shd w:val="clear" w:color="auto" w:fill="F2F5F9"/>
+            <w:tcBorders>
+              <w:top w:val="nil"/>
+              <w:left w:val="single" w:sz="18" w:color="0072BC"/>
+              <w:bottom w:val="nil"/>
+              <w:right w:val="nil"/>
+            </w:tcBorders>
+          </w:tcPr>
+          <w:p>
+            <w:pPr>
+              <w:keepNext/>
+              <w:spacing w:after="0" w:line="240" w:lineRule="auto"/>
+            </w:pPr>
+            <w:r/>
+            <w:r>
+              <w:rPr>
+                <w:rFonts w:ascii="Consolas" w:hAnsi="Consolas" w:eastAsia="Consolas"/>
+                <w:color w:val="1F2933"/>
+                <w:sz w:val="19"/>
+              </w:rPr>
+              <w:t>https://nodejs.org/es/download</w:t>
+            </w:r>
+          </w:p>
+        </w:tc>
+      </w:tr>
+    </w:tbl>
+    <w:p>
+      <w:pPr>
+        <w:spacing w:after="40"/>
+      </w:pPr>
+    </w:p>
+    <w:p>
+      <w:pPr>
+        <w:keepNext/>
+        <w:jc w:val="center"/>
+      </w:pPr>
+      <w:r>
+        <w:drawing>
+          <wp:inline xmlns:a="http://schemas.openxmlformats.org/drawingml/2006/main" xmlns:pic="http://schemas.openxmlformats.org/drawingml/2006/picture">
+            <wp:extent cx="3780000" cy="2340826"/>
+            <wp:docPr id="5" name="Picture 5"/>
+            <wp:cNvGraphicFramePr>
+              <a:graphicFrameLocks noChangeAspect="1"/>
+            </wp:cNvGraphicFramePr>
+            <a:graphic>
+              <a:graphicData uri="http://schemas.openxmlformats.org/drawingml/2006/picture">
+                <pic:pic>
+                  <pic:nvPicPr>
+                    <pic:cNvPr id="0" name="nodejs.png"/>
+                    <pic:cNvPicPr/>
+                  </pic:nvPicPr>
+                  <pic:blipFill>
+                    <a:blip r:embed="rId14"/>
+                    <a:stretch>
+                      <a:fillRect/>
+                    </a:stretch>
+                  </pic:blipFill>
+                  <pic:spPr>
+                    <a:xfrm>
+                      <a:off x="0" y="0"/>
+                      <a:ext cx="3780000" cy="2340826"/>
+                    </a:xfrm>
+                    <a:prstGeom prst="rect"/>
+                  </pic:spPr>
+                </pic:pic>
+              </a:graphicData>
+            </a:graphic>
+          </wp:inline>
+        </w:drawing>
+      </w:r>
+    </w:p>
+    <w:p>
+      <w:pPr>
+        <w:jc w:val="center"/>
+      </w:pPr>
+      <w:r>
+        <w:rPr>
+          <w:b w:val="0"/>
+          <w:color w:val="52606D"/>
+          <w:sz w:val="18"/>
+        </w:rPr>
+        <w:t>Página de descarga de Node.js. Revisa que diga v24.21.0 LTS, Windows y x64, y descarga el instalador .msi.</w:t>
+      </w:r>
+    </w:p>
+    <w:p>
+      <w:r>
+        <w:rPr>
+          <w:b w:val="0"/>
+        </w:rPr>
+        <w:t xml:space="preserve">Revisa que arriba diga </w:t>
+      </w:r>
+      <w:r>
+        <w:rPr>
+          <w:b/>
+        </w:rPr>
+        <w:t>v24.21.0 LTS</w:t>
+      </w:r>
+      <w:r>
+        <w:rPr>
+          <w:b w:val="0"/>
+        </w:rPr>
+        <w:t xml:space="preserve"> y abajo </w:t>
+      </w:r>
+      <w:r>
+        <w:rPr>
+          <w:b/>
+        </w:rPr>
+        <w:t>Windows</w:t>
+      </w:r>
+      <w:r>
+        <w:rPr>
+          <w:b w:val="0"/>
+        </w:rPr>
+        <w:t xml:space="preserve"> y </w:t>
+      </w:r>
+      <w:r>
+        <w:rPr>
+          <w:b/>
+        </w:rPr>
+        <w:t>x64</w:t>
+      </w:r>
+      <w:r>
+        <w:rPr>
+          <w:b w:val="0"/>
+        </w:rPr>
+        <w:t xml:space="preserve">. Dale clic en </w:t>
+      </w:r>
+      <w:r>
+        <w:rPr>
+          <w:b/>
+        </w:rPr>
+        <w:t>Windows Installer (.msi)</w:t>
+      </w:r>
+      <w:r>
+        <w:rPr>
+          <w:b w:val="0"/>
+        </w:rPr>
+        <w:t xml:space="preserve">. Se descarga </w:t>
+      </w:r>
+      <w:r>
+        <w:rPr>
+          <w:rFonts w:ascii="Consolas" w:hAnsi="Consolas" w:eastAsia="Consolas"/>
+          <w:color w:val="003D7A"/>
+        </w:rPr>
+        <w:t>node-v24.21.0-x64.msi</w:t>
+      </w:r>
+      <w:r>
+        <w:rPr>
+          <w:b w:val="0"/>
+        </w:rPr>
+        <w:t>, de unos 32 MB. Si cuando entres ya salió otra 24 más nueva (por ejemplo 24.22), sirve igual, siempre que sea 24 y diga LTS.</w:t>
+      </w:r>
+    </w:p>
+    <w:p>
+      <w:pPr>
+        <w:keepNext/>
+        <w:spacing w:before="200" w:after="80"/>
+      </w:pPr>
+      <w:r>
+        <w:rPr>
+          <w:b/>
+          <w:color w:val="0072BC"/>
+          <w:sz w:val="28"/>
+        </w:rPr>
+        <w:t>Instalación</w:t>
+      </w:r>
+    </w:p>
+    <w:p>
+      <w:pPr>
+        <w:pStyle w:val="ListNumber"/>
+        <w:spacing w:after="60"/>
+        <w:numPr>
+          <w:ilvl w:val="0"/>
+          <w:numId w:val="17"/>
+        </w:numPr>
+      </w:pPr>
+      <w:r>
+        <w:rPr>
+          <w:b w:val="0"/>
+        </w:rPr>
+        <w:t xml:space="preserve">Abre el </w:t>
+      </w:r>
+      <w:r>
+        <w:rPr>
+          <w:rFonts w:ascii="Consolas" w:hAnsi="Consolas" w:eastAsia="Consolas"/>
+          <w:color w:val="003D7A"/>
+        </w:rPr>
+        <w:t>.msi</w:t>
+      </w:r>
+      <w:r>
+        <w:rPr>
+          <w:b w:val="0"/>
+        </w:rPr>
+        <w:t xml:space="preserve">, dale </w:t>
+      </w:r>
+      <w:r>
+        <w:rPr>
+          <w:b/>
+        </w:rPr>
+        <w:t>Next</w:t>
+      </w:r>
+      <w:r>
+        <w:rPr>
+          <w:b w:val="0"/>
+        </w:rPr>
+        <w:t xml:space="preserve"> y acepta la licencia.</w:t>
+      </w:r>
+    </w:p>
+    <w:p>
+      <w:pPr>
+        <w:pStyle w:val="ListNumber"/>
+        <w:spacing w:after="60"/>
+        <w:numPr>
+          <w:ilvl w:val="0"/>
+          <w:numId w:val="17"/>
+        </w:numPr>
+      </w:pPr>
+      <w:r>
+        <w:rPr>
+          <w:b w:val="0"/>
+        </w:rPr>
+        <w:t>Deja la carpeta que propone (</w:t>
+      </w:r>
+      <w:r>
+        <w:rPr>
+          <w:rFonts w:ascii="Consolas" w:hAnsi="Consolas" w:eastAsia="Consolas"/>
+          <w:color w:val="003D7A"/>
+        </w:rPr>
+        <w:t>C:\Program Files\nodejs\</w:t>
+      </w:r>
+      <w:r>
+        <w:rPr>
+          <w:b w:val="0"/>
+        </w:rPr>
+        <w:t>).</w:t>
+      </w:r>
+    </w:p>
+    <w:p>
+      <w:pPr>
+        <w:pStyle w:val="ListNumber"/>
+        <w:spacing w:after="60"/>
+        <w:numPr>
+          <w:ilvl w:val="0"/>
+          <w:numId w:val="17"/>
+        </w:numPr>
+      </w:pPr>
+      <w:r>
+        <w:rPr>
+          <w:b w:val="0"/>
+        </w:rPr>
+        <w:t xml:space="preserve">En </w:t>
+      </w:r>
+      <w:r>
+        <w:rPr>
+          <w:b/>
+        </w:rPr>
+        <w:t>Custom Setup</w:t>
+      </w:r>
+      <w:r>
+        <w:rPr>
+          <w:b w:val="0"/>
+        </w:rPr>
+        <w:t xml:space="preserve"> deja todo como viene. Ahí está </w:t>
+      </w:r>
+      <w:r>
+        <w:rPr>
+          <w:b/>
+        </w:rPr>
+        <w:t>Add to PATH</w:t>
+      </w:r>
+      <w:r>
+        <w:rPr>
+          <w:b w:val="0"/>
+        </w:rPr>
+        <w:t xml:space="preserve">, que es lo que permite usar </w:t>
+      </w:r>
+      <w:r>
+        <w:rPr>
+          <w:rFonts w:ascii="Consolas" w:hAnsi="Consolas" w:eastAsia="Consolas"/>
+          <w:color w:val="003D7A"/>
+        </w:rPr>
+        <w:t>node</w:t>
+      </w:r>
+      <w:r>
+        <w:rPr>
+          <w:b w:val="0"/>
+        </w:rPr>
+        <w:t xml:space="preserve"> y </w:t>
+      </w:r>
+      <w:r>
+        <w:rPr>
+          <w:rFonts w:ascii="Consolas" w:hAnsi="Consolas" w:eastAsia="Consolas"/>
+          <w:color w:val="003D7A"/>
+        </w:rPr>
+        <w:t>npm</w:t>
+      </w:r>
+      <w:r>
+        <w:rPr>
+          <w:b w:val="0"/>
+        </w:rPr>
+        <w:t xml:space="preserve"> desde PowerShell.</w:t>
+      </w:r>
+    </w:p>
+    <w:p>
+      <w:pPr>
+        <w:pStyle w:val="ListNumber"/>
+        <w:spacing w:after="60"/>
+        <w:numPr>
+          <w:ilvl w:val="0"/>
+          <w:numId w:val="17"/>
+        </w:numPr>
+      </w:pPr>
+      <w:r>
+        <w:rPr>
+          <w:b w:val="0"/>
+        </w:rPr>
+        <w:t xml:space="preserve">En </w:t>
+      </w:r>
+      <w:r>
+        <w:rPr>
+          <w:b/>
+        </w:rPr>
+        <w:t>Tools for Native Modules</w:t>
+      </w:r>
+      <w:r>
+        <w:rPr>
+          <w:b w:val="0"/>
+        </w:rPr>
+        <w:t xml:space="preserve"> deja </w:t>
+      </w:r>
+      <w:r>
+        <w:rPr>
+          <w:b/>
+        </w:rPr>
+        <w:t>sin marcar</w:t>
+      </w:r>
+      <w:r>
+        <w:rPr>
+          <w:b w:val="0"/>
+        </w:rPr>
+        <w:t xml:space="preserve"> la casilla que instala herramientas adicionales (Python, Visual Studio Build Tools y Chocolatey). No las necesitamos y tardan mucho.</w:t>
+      </w:r>
+    </w:p>
+    <w:p>
+      <w:pPr>
+        <w:pStyle w:val="ListNumber"/>
+        <w:spacing w:after="60"/>
+        <w:numPr>
+          <w:ilvl w:val="0"/>
+          <w:numId w:val="17"/>
+        </w:numPr>
+      </w:pPr>
+      <w:r>
+        <w:rPr>
+          <w:b w:val="0"/>
+        </w:rPr>
+        <w:t xml:space="preserve">Dale </w:t>
+      </w:r>
+      <w:r>
+        <w:rPr>
+          <w:b/>
+        </w:rPr>
+        <w:t>Install</w:t>
+      </w:r>
+      <w:r>
+        <w:rPr>
+          <w:b w:val="0"/>
+        </w:rPr>
+        <w:t xml:space="preserve">, acepta el permiso de administrador y al final </w:t>
+      </w:r>
+      <w:r>
+        <w:rPr>
+          <w:b/>
+        </w:rPr>
+        <w:t>Finish</w:t>
+      </w:r>
+      <w:r>
+        <w:rPr>
+          <w:b w:val="0"/>
+        </w:rPr>
+        <w:t>.</w:t>
+      </w:r>
+    </w:p>
+    <w:p>
+      <w:pPr>
+        <w:keepNext/>
+        <w:spacing w:before="200" w:after="80"/>
+      </w:pPr>
+      <w:r>
+        <w:rPr>
+          <w:b/>
+          <w:color w:val="0072BC"/>
+          <w:sz w:val="28"/>
+        </w:rPr>
+        <w:t>Comprobar</w:t>
       </w:r>
     </w:p>
     <w:p>
@@ -4708,19 +5295,765 @@
         <w:rPr>
           <w:b w:val="0"/>
         </w:rPr>
-        <w:t xml:space="preserve">En la clase 2 (Serenity con Selenium) y en la clase 4 (Playwright) las pruebas abren un navegador y lo manejan solas. Usamos Chrome. Si ya lo tienes instalado, solo actualízalo desde el menú de los tres puntos, </w:t>
+        <w:t>Abre un PowerShell nuevo y escribe:</w:t>
+      </w:r>
+    </w:p>
+    <w:tbl>
+      <w:tblPr>
+        <w:tblW w:type="auto" w:w="0"/>
+        <w:jc w:val="center"/>
+        <w:tblLook w:firstColumn="1" w:firstRow="1" w:lastColumn="0" w:lastRow="0" w:noHBand="0" w:noVBand="1" w:val="04A0"/>
+      </w:tblPr>
+      <w:tblGrid>
+        <w:gridCol w:w="9632"/>
+      </w:tblGrid>
+      <w:tr>
+        <w:trPr>
+          <w:cantSplit/>
+        </w:trPr>
+        <w:tc>
+          <w:tcPr>
+            <w:tcW w:type="dxa" w:w="9632"/>
+            <w:shd w:val="clear" w:color="auto" w:fill="F2F5F9"/>
+            <w:tcBorders>
+              <w:top w:val="nil"/>
+              <w:left w:val="single" w:sz="18" w:color="0072BC"/>
+              <w:bottom w:val="nil"/>
+              <w:right w:val="nil"/>
+            </w:tcBorders>
+          </w:tcPr>
+          <w:p>
+            <w:pPr>
+              <w:keepNext/>
+              <w:spacing w:after="0" w:line="240" w:lineRule="auto"/>
+            </w:pPr>
+            <w:r/>
+            <w:r>
+              <w:rPr>
+                <w:rFonts w:ascii="Consolas" w:hAnsi="Consolas" w:eastAsia="Consolas"/>
+                <w:color w:val="1F2933"/>
+                <w:sz w:val="19"/>
+              </w:rPr>
+              <w:t>node -v</w:t>
+            </w:r>
+          </w:p>
+          <w:p>
+            <w:pPr>
+              <w:keepNext/>
+              <w:spacing w:after="0" w:line="240" w:lineRule="auto"/>
+            </w:pPr>
+            <w:r>
+              <w:rPr>
+                <w:rFonts w:ascii="Consolas" w:hAnsi="Consolas" w:eastAsia="Consolas"/>
+                <w:color w:val="1F2933"/>
+                <w:sz w:val="19"/>
+              </w:rPr>
+              <w:t>npm -v</w:t>
+            </w:r>
+          </w:p>
+        </w:tc>
+      </w:tr>
+    </w:tbl>
+    <w:p>
+      <w:pPr>
+        <w:keepNext/>
+        <w:spacing w:after="40"/>
+      </w:pPr>
+    </w:p>
+    <w:tbl>
+      <w:tblPr>
+        <w:tblW w:type="auto" w:w="0"/>
+        <w:jc w:val="center"/>
+        <w:tblLook w:firstColumn="1" w:firstRow="1" w:lastColumn="0" w:lastRow="0" w:noHBand="0" w:noVBand="1" w:val="04A0"/>
+      </w:tblPr>
+      <w:tblGrid>
+        <w:gridCol w:w="9632"/>
+      </w:tblGrid>
+      <w:tr>
+        <w:trPr>
+          <w:cantSplit/>
+        </w:trPr>
+        <w:tc>
+          <w:tcPr>
+            <w:tcW w:type="dxa" w:w="9632"/>
+            <w:shd w:val="clear" w:color="auto" w:fill="F2F5F9"/>
+            <w:tcBorders>
+              <w:top w:val="nil"/>
+              <w:left w:val="single" w:sz="18" w:color="0072BC"/>
+              <w:bottom w:val="nil"/>
+              <w:right w:val="nil"/>
+            </w:tcBorders>
+          </w:tcPr>
+          <w:p>
+            <w:r/>
+            <w:r>
+              <w:rPr>
+                <w:b/>
+                <w:color w:val="52606D"/>
+                <w:sz w:val="18"/>
+              </w:rPr>
+              <w:t>Debe salir algo parecido a esto</w:t>
+            </w:r>
+          </w:p>
+          <w:p>
+            <w:pPr>
+              <w:keepNext/>
+              <w:spacing w:after="0" w:line="240" w:lineRule="auto"/>
+            </w:pPr>
+            <w:r>
+              <w:rPr>
+                <w:rFonts w:ascii="Consolas" w:hAnsi="Consolas" w:eastAsia="Consolas"/>
+                <w:color w:val="1F2933"/>
+                <w:sz w:val="19"/>
+              </w:rPr>
+              <w:t>v24.21.0</w:t>
+            </w:r>
+          </w:p>
+          <w:p>
+            <w:pPr>
+              <w:keepNext/>
+              <w:spacing w:after="0" w:line="240" w:lineRule="auto"/>
+            </w:pPr>
+            <w:r>
+              <w:rPr>
+                <w:rFonts w:ascii="Consolas" w:hAnsi="Consolas" w:eastAsia="Consolas"/>
+                <w:color w:val="1F2933"/>
+                <w:sz w:val="19"/>
+              </w:rPr>
+              <w:t>11.19.0</w:t>
+            </w:r>
+          </w:p>
+        </w:tc>
+      </w:tr>
+    </w:tbl>
+    <w:p>
+      <w:pPr>
+        <w:spacing w:after="40"/>
+      </w:pPr>
+    </w:p>
+    <w:p>
+      <w:r>
+        <w:rPr>
+          <w:b w:val="0"/>
+        </w:rPr>
+        <w:t xml:space="preserve">Si </w:t>
+      </w:r>
+      <w:r>
+        <w:rPr>
+          <w:rFonts w:ascii="Consolas" w:hAnsi="Consolas" w:eastAsia="Consolas"/>
+          <w:color w:val="003D7A"/>
+        </w:rPr>
+        <w:t>npm -v</w:t>
+      </w:r>
+      <w:r>
+        <w:rPr>
+          <w:b w:val="0"/>
+        </w:rPr>
+        <w:t xml:space="preserve"> responde con un error rojo que dice que </w:t>
       </w:r>
       <w:r>
         <w:rPr>
           <w:b/>
         </w:rPr>
+        <w:t>no se puede cargar el archivo npm.ps1 porque la ejecución de scripts está deshabilitada</w:t>
+      </w:r>
+      <w:r>
+        <w:rPr>
+          <w:b w:val="0"/>
+        </w:rPr>
+        <w:t xml:space="preserve">, es normal en Windows: PowerShell bloquea los scripts por defecto. Se arregla una sola vez con el comando del problema "La ejecución de scripts está deshabilitada", al final de la guía. Si </w:t>
+      </w:r>
+      <w:r>
+        <w:rPr>
+          <w:rFonts w:ascii="Consolas" w:hAnsi="Consolas" w:eastAsia="Consolas"/>
+          <w:color w:val="003D7A"/>
+        </w:rPr>
+        <w:t>node</w:t>
+      </w:r>
+      <w:r>
+        <w:rPr>
+          <w:b w:val="0"/>
+        </w:rPr>
+        <w:t xml:space="preserve"> o </w:t>
+      </w:r>
+      <w:r>
+        <w:rPr>
+          <w:rFonts w:ascii="Consolas" w:hAnsi="Consolas" w:eastAsia="Consolas"/>
+          <w:color w:val="003D7A"/>
+        </w:rPr>
+        <w:t>npm</w:t>
+      </w:r>
+      <w:r>
+        <w:rPr>
+          <w:b w:val="0"/>
+        </w:rPr>
+        <w:t xml:space="preserve"> no se reconocen, cierra y abre PowerShell.</w:t>
+      </w:r>
+    </w:p>
+    <w:p>
+      <w:pPr>
+        <w:keepNext/>
+        <w:spacing w:before="240" w:after="160"/>
+        <w:pBdr>
+          <w:bottom w:val="single" w:sz="8" w:space="4" w:color="003D7A"/>
+        </w:pBdr>
+      </w:pPr>
+      <w:r>
+        <w:rPr>
+          <w:b/>
+          <w:color w:val="003D7A"/>
+          <w:sz w:val="36"/>
+        </w:rPr>
+        <w:t>Paso 6. Visual Studio Code y la extensión de Playwright (clase 4)</w:t>
+      </w:r>
+    </w:p>
+    <w:p>
+      <w:r>
+        <w:rPr>
+          <w:b w:val="0"/>
+        </w:rPr>
+        <w:t xml:space="preserve">Visual Studio Code es el editor que usamos en la clase 4. Es gratuito y liviano. Le agregamos la extensión oficial de Microsoft </w:t>
+      </w:r>
+      <w:r>
+        <w:rPr>
+          <w:b/>
+        </w:rPr>
+        <w:t>Playwright Test for VSCode</w:t>
+      </w:r>
+      <w:r>
+        <w:rPr>
+          <w:b w:val="0"/>
+        </w:rPr>
+        <w:t>, que muestra las pruebas en una lista y las corre con un clic.</w:t>
+      </w:r>
+    </w:p>
+    <w:p>
+      <w:pPr>
+        <w:keepNext/>
+        <w:spacing w:before="200" w:after="80"/>
+      </w:pPr>
+      <w:r>
+        <w:rPr>
+          <w:b/>
+          <w:color w:val="0072BC"/>
+          <w:sz w:val="28"/>
+        </w:rPr>
+        <w:t>Descarga</w:t>
+      </w:r>
+    </w:p>
+    <w:tbl>
+      <w:tblPr>
+        <w:tblW w:type="auto" w:w="0"/>
+        <w:jc w:val="center"/>
+        <w:tblLook w:firstColumn="1" w:firstRow="1" w:lastColumn="0" w:lastRow="0" w:noHBand="0" w:noVBand="1" w:val="04A0"/>
+      </w:tblPr>
+      <w:tblGrid>
+        <w:gridCol w:w="9632"/>
+      </w:tblGrid>
+      <w:tr>
+        <w:trPr>
+          <w:cantSplit/>
+        </w:trPr>
+        <w:tc>
+          <w:tcPr>
+            <w:tcW w:type="dxa" w:w="9632"/>
+            <w:shd w:val="clear" w:color="auto" w:fill="F2F5F9"/>
+            <w:tcBorders>
+              <w:top w:val="nil"/>
+              <w:left w:val="single" w:sz="18" w:color="0072BC"/>
+              <w:bottom w:val="nil"/>
+              <w:right w:val="nil"/>
+            </w:tcBorders>
+          </w:tcPr>
+          <w:p>
+            <w:pPr>
+              <w:keepNext/>
+              <w:spacing w:after="0" w:line="240" w:lineRule="auto"/>
+            </w:pPr>
+            <w:r/>
+            <w:r>
+              <w:rPr>
+                <w:rFonts w:ascii="Consolas" w:hAnsi="Consolas" w:eastAsia="Consolas"/>
+                <w:color w:val="1F2933"/>
+                <w:sz w:val="19"/>
+              </w:rPr>
+              <w:t>https://code.visualstudio.com/download</w:t>
+            </w:r>
+          </w:p>
+        </w:tc>
+      </w:tr>
+    </w:tbl>
+    <w:p>
+      <w:pPr>
+        <w:spacing w:after="40"/>
+      </w:pPr>
+    </w:p>
+    <w:p>
+      <w:pPr>
+        <w:keepNext/>
+        <w:jc w:val="center"/>
+      </w:pPr>
+      <w:r>
+        <w:drawing>
+          <wp:inline xmlns:a="http://schemas.openxmlformats.org/drawingml/2006/main" xmlns:pic="http://schemas.openxmlformats.org/drawingml/2006/picture">
+            <wp:extent cx="3420000" cy="2067033"/>
+            <wp:docPr id="6" name="Picture 6"/>
+            <wp:cNvGraphicFramePr>
+              <a:graphicFrameLocks noChangeAspect="1"/>
+            </wp:cNvGraphicFramePr>
+            <a:graphic>
+              <a:graphicData uri="http://schemas.openxmlformats.org/drawingml/2006/picture">
+                <pic:pic>
+                  <pic:nvPicPr>
+                    <pic:cNvPr id="0" name="vscode.png"/>
+                    <pic:cNvPicPr/>
+                  </pic:nvPicPr>
+                  <pic:blipFill>
+                    <a:blip r:embed="rId15"/>
+                    <a:stretch>
+                      <a:fillRect/>
+                    </a:stretch>
+                  </pic:blipFill>
+                  <pic:spPr>
+                    <a:xfrm>
+                      <a:off x="0" y="0"/>
+                      <a:ext cx="3420000" cy="2067033"/>
+                    </a:xfrm>
+                    <a:prstGeom prst="rect"/>
+                  </pic:spPr>
+                </pic:pic>
+              </a:graphicData>
+            </a:graphic>
+          </wp:inline>
+        </w:drawing>
+      </w:r>
+    </w:p>
+    <w:p>
+      <w:pPr>
+        <w:jc w:val="center"/>
+      </w:pPr>
+      <w:r>
+        <w:rPr>
+          <w:b w:val="0"/>
+          <w:color w:val="52606D"/>
+          <w:sz w:val="18"/>
+        </w:rPr>
+        <w:t>Página de descarga de Visual Studio Code. El botón Windows descarga el instalador de usuario de 64 bits.</w:t>
+      </w:r>
+    </w:p>
+    <w:p>
+      <w:r>
+        <w:rPr>
+          <w:b w:val="0"/>
+        </w:rPr>
+        <w:t xml:space="preserve">Dale clic en el botón </w:t>
+      </w:r>
+      <w:r>
+        <w:rPr>
+          <w:b/>
+        </w:rPr>
+        <w:t>Windows</w:t>
+      </w:r>
+      <w:r>
+        <w:rPr>
+          <w:b w:val="0"/>
+        </w:rPr>
+        <w:t xml:space="preserve"> (Windows 10, 11). Se descarga el instalador de usuario de 64 bits, que hoy es </w:t>
+      </w:r>
+      <w:r>
+        <w:rPr>
+          <w:rFonts w:ascii="Consolas" w:hAnsi="Consolas" w:eastAsia="Consolas"/>
+          <w:color w:val="003D7A"/>
+        </w:rPr>
+        <w:t>VSCodeUserSetup-x64-1.138.0.exe</w:t>
+      </w:r>
+      <w:r>
+        <w:rPr>
+          <w:b w:val="0"/>
+        </w:rPr>
+        <w:t xml:space="preserve"> (unos 225 MB). Este instalador no pide permiso de administrador.</w:t>
+      </w:r>
+    </w:p>
+    <w:p>
+      <w:pPr>
+        <w:keepNext/>
+        <w:spacing w:before="200" w:after="80"/>
+      </w:pPr>
+      <w:r>
+        <w:rPr>
+          <w:b/>
+          <w:color w:val="0072BC"/>
+          <w:sz w:val="28"/>
+        </w:rPr>
+        <w:t>Instalación</w:t>
+      </w:r>
+    </w:p>
+    <w:p>
+      <w:pPr>
+        <w:pStyle w:val="ListNumber"/>
+        <w:spacing w:after="60"/>
+        <w:numPr>
+          <w:ilvl w:val="0"/>
+          <w:numId w:val="18"/>
+        </w:numPr>
+      </w:pPr>
+      <w:r>
+        <w:rPr>
+          <w:b w:val="0"/>
+        </w:rPr>
+        <w:t xml:space="preserve">Abre el </w:t>
+      </w:r>
+      <w:r>
+        <w:rPr>
+          <w:rFonts w:ascii="Consolas" w:hAnsi="Consolas" w:eastAsia="Consolas"/>
+          <w:color w:val="003D7A"/>
+        </w:rPr>
+        <w:t>.exe</w:t>
+      </w:r>
+      <w:r>
+        <w:rPr>
+          <w:b w:val="0"/>
+        </w:rPr>
+        <w:t xml:space="preserve">, acepta el acuerdo de licencia y dale </w:t>
+      </w:r>
+      <w:r>
+        <w:rPr>
+          <w:b/>
+        </w:rPr>
+        <w:t>Siguiente</w:t>
+      </w:r>
+      <w:r>
+        <w:rPr>
+          <w:b w:val="0"/>
+        </w:rPr>
+        <w:t xml:space="preserve"> (o Next).</w:t>
+      </w:r>
+    </w:p>
+    <w:p>
+      <w:pPr>
+        <w:pStyle w:val="ListNumber"/>
+        <w:spacing w:after="60"/>
+        <w:numPr>
+          <w:ilvl w:val="0"/>
+          <w:numId w:val="18"/>
+        </w:numPr>
+      </w:pPr>
+      <w:r>
+        <w:rPr>
+          <w:b w:val="0"/>
+        </w:rPr>
+        <w:t>Deja la carpeta que propone.</w:t>
+      </w:r>
+    </w:p>
+    <w:p>
+      <w:pPr>
+        <w:pStyle w:val="ListNumber"/>
+        <w:spacing w:after="60"/>
+        <w:numPr>
+          <w:ilvl w:val="0"/>
+          <w:numId w:val="18"/>
+        </w:numPr>
+      </w:pPr>
+      <w:r>
+        <w:rPr>
+          <w:b w:val="0"/>
+        </w:rPr>
+        <w:t xml:space="preserve">En </w:t>
+      </w:r>
+      <w:r>
+        <w:rPr>
+          <w:b/>
+        </w:rPr>
+        <w:t>Seleccione las tareas adicionales</w:t>
+      </w:r>
+      <w:r>
+        <w:rPr>
+          <w:b w:val="0"/>
+        </w:rPr>
+        <w:t xml:space="preserve"> revisa que quede marcado </w:t>
+      </w:r>
+      <w:r>
+        <w:rPr>
+          <w:b/>
+        </w:rPr>
+        <w:t>Agregar a PATH</w:t>
+      </w:r>
+      <w:r>
+        <w:rPr>
+          <w:b w:val="0"/>
+        </w:rPr>
+        <w:t xml:space="preserve"> (en inglés, Add to PATH). Te recomiendo marcar también las dos opciones de </w:t>
+      </w:r>
+      <w:r>
+        <w:rPr>
+          <w:b/>
+        </w:rPr>
+        <w:t>Agregar la acción "Abrir con Code"</w:t>
+      </w:r>
+      <w:r>
+        <w:rPr>
+          <w:b w:val="0"/>
+        </w:rPr>
+        <w:t xml:space="preserve"> al menú contextual del Explorador, para abrir una carpeta con clic derecho.</w:t>
+      </w:r>
+    </w:p>
+    <w:p>
+      <w:pPr>
+        <w:pStyle w:val="ListNumber"/>
+        <w:spacing w:after="60"/>
+        <w:numPr>
+          <w:ilvl w:val="0"/>
+          <w:numId w:val="18"/>
+        </w:numPr>
+      </w:pPr>
+      <w:r>
+        <w:rPr>
+          <w:b w:val="0"/>
+        </w:rPr>
+        <w:t xml:space="preserve">Dale </w:t>
+      </w:r>
+      <w:r>
+        <w:rPr>
+          <w:b/>
+        </w:rPr>
+        <w:t>Instalar</w:t>
+      </w:r>
+      <w:r>
+        <w:rPr>
+          <w:b w:val="0"/>
+        </w:rPr>
+        <w:t xml:space="preserve"> y al final </w:t>
+      </w:r>
+      <w:r>
+        <w:rPr>
+          <w:b/>
+        </w:rPr>
+        <w:t>Finalizar</w:t>
+      </w:r>
+      <w:r>
+        <w:rPr>
+          <w:b w:val="0"/>
+        </w:rPr>
+        <w:t>.</w:t>
+      </w:r>
+    </w:p>
+    <w:p>
+      <w:pPr>
+        <w:keepNext/>
+        <w:spacing w:before="200" w:after="80"/>
+      </w:pPr>
+      <w:r>
+        <w:rPr>
+          <w:b/>
+          <w:color w:val="0072BC"/>
+          <w:sz w:val="28"/>
+        </w:rPr>
+        <w:t>Instalar la extensión y comprobar</w:t>
+      </w:r>
+    </w:p>
+    <w:p>
+      <w:pPr>
+        <w:pStyle w:val="ListNumber"/>
+        <w:spacing w:after="60"/>
+        <w:numPr>
+          <w:ilvl w:val="0"/>
+          <w:numId w:val="19"/>
+        </w:numPr>
+      </w:pPr>
+      <w:r>
+        <w:rPr>
+          <w:b w:val="0"/>
+        </w:rPr>
+        <w:t xml:space="preserve">Abre Visual Studio Code y dale clic al ícono de </w:t>
+      </w:r>
+      <w:r>
+        <w:rPr>
+          <w:b/>
+        </w:rPr>
+        <w:t>Extensiones</w:t>
+      </w:r>
+      <w:r>
+        <w:rPr>
+          <w:b w:val="0"/>
+        </w:rPr>
+        <w:t xml:space="preserve"> en la barra de la izquierda (los cuatro cuadritos) o presiona Ctrl+Shift+X.</w:t>
+      </w:r>
+    </w:p>
+    <w:p>
+      <w:pPr>
+        <w:pStyle w:val="ListNumber"/>
+        <w:spacing w:after="60"/>
+        <w:numPr>
+          <w:ilvl w:val="0"/>
+          <w:numId w:val="19"/>
+        </w:numPr>
+      </w:pPr>
+      <w:r>
+        <w:rPr>
+          <w:b w:val="0"/>
+        </w:rPr>
+        <w:t xml:space="preserve">Busca </w:t>
+      </w:r>
+      <w:r>
+        <w:rPr>
+          <w:rFonts w:ascii="Consolas" w:hAnsi="Consolas" w:eastAsia="Consolas"/>
+          <w:color w:val="003D7A"/>
+        </w:rPr>
+        <w:t>Playwright Test for VSCode</w:t>
+      </w:r>
+      <w:r>
+        <w:rPr>
+          <w:b w:val="0"/>
+        </w:rPr>
+        <w:t xml:space="preserve">. Debe decir que es de </w:t>
+      </w:r>
+      <w:r>
+        <w:rPr>
+          <w:b/>
+        </w:rPr>
+        <w:t>Microsoft</w:t>
+      </w:r>
+      <w:r>
+        <w:rPr>
+          <w:b w:val="0"/>
+        </w:rPr>
+        <w:t xml:space="preserve"> (su identificador es </w:t>
+      </w:r>
+      <w:r>
+        <w:rPr>
+          <w:rFonts w:ascii="Consolas" w:hAnsi="Consolas" w:eastAsia="Consolas"/>
+          <w:color w:val="003D7A"/>
+        </w:rPr>
+        <w:t>ms-playwright.playwright</w:t>
+      </w:r>
+      <w:r>
+        <w:rPr>
+          <w:b w:val="0"/>
+        </w:rPr>
+        <w:t xml:space="preserve">). Dale </w:t>
+      </w:r>
+      <w:r>
+        <w:rPr>
+          <w:b/>
+        </w:rPr>
+        <w:t>Install</w:t>
+      </w:r>
+      <w:r>
+        <w:rPr>
+          <w:b w:val="0"/>
+        </w:rPr>
+        <w:t>.</w:t>
+      </w:r>
+    </w:p>
+    <w:p>
+      <w:pPr>
+        <w:pStyle w:val="ListNumber"/>
+        <w:spacing w:after="60"/>
+        <w:numPr>
+          <w:ilvl w:val="0"/>
+          <w:numId w:val="19"/>
+        </w:numPr>
+      </w:pPr>
+      <w:r>
+        <w:rPr>
+          <w:b w:val="0"/>
+        </w:rPr>
+        <w:t xml:space="preserve">En la barra de la izquierda aparece la pestaña </w:t>
+      </w:r>
+      <w:r>
+        <w:rPr>
+          <w:b/>
+        </w:rPr>
+        <w:t>Testing</w:t>
+      </w:r>
+      <w:r>
+        <w:rPr>
+          <w:b w:val="0"/>
+        </w:rPr>
+        <w:t xml:space="preserve"> (</w:t>
+      </w:r>
+      <w:r>
+        <w:rPr>
+          <w:b/>
+        </w:rPr>
+        <w:t>Pruebas</w:t>
+      </w:r>
+      <w:r>
+        <w:rPr>
+          <w:b w:val="0"/>
+        </w:rPr>
+        <w:t xml:space="preserve"> si tienes el editor en español), con el ícono de un matraz. Cuando abras la carpeta del proyecto de la clase 4, ahí vas a ver sus pruebas.</w:t>
+      </w:r>
+    </w:p>
+    <w:p>
+      <w:r>
+        <w:rPr>
+          <w:b w:val="0"/>
+        </w:rPr>
+        <w:t xml:space="preserve">Para comprobar desde PowerShell, abre una ventana nueva y escribe </w:t>
+      </w:r>
+      <w:r>
+        <w:rPr>
+          <w:rFonts w:ascii="Consolas" w:hAnsi="Consolas" w:eastAsia="Consolas"/>
+          <w:color w:val="003D7A"/>
+        </w:rPr>
+        <w:t>code --version</w:t>
+      </w:r>
+      <w:r>
+        <w:rPr>
+          <w:b w:val="0"/>
+        </w:rPr>
+        <w:t xml:space="preserve">. Deben salir tres líneas: la versión (por ejemplo 1.138.0), un código largo y </w:t>
+      </w:r>
+      <w:r>
+        <w:rPr>
+          <w:rFonts w:ascii="Consolas" w:hAnsi="Consolas" w:eastAsia="Consolas"/>
+          <w:color w:val="003D7A"/>
+        </w:rPr>
+        <w:t>x64</w:t>
+      </w:r>
+      <w:r>
+        <w:rPr>
+          <w:b w:val="0"/>
+        </w:rPr>
+        <w:t>.</w:t>
+      </w:r>
+    </w:p>
+    <w:p>
+      <w:pPr>
+        <w:keepNext/>
+        <w:spacing w:before="240" w:after="160"/>
+        <w:pBdr>
+          <w:bottom w:val="single" w:sz="8" w:space="4" w:color="003D7A"/>
+        </w:pBdr>
+      </w:pPr>
+      <w:r>
+        <w:rPr>
+          <w:b/>
+          <w:color w:val="003D7A"/>
+          <w:sz w:val="36"/>
+        </w:rPr>
+        <w:t>Paso 7. Google Chrome</w:t>
+      </w:r>
+    </w:p>
+    <w:p>
+      <w:r>
+        <w:rPr>
+          <w:b w:val="0"/>
+        </w:rPr>
+        <w:t xml:space="preserve">En la clase 2 (Serenity con Selenium) las pruebas abren Chrome y lo manejan solas. Si ya lo tienes instalado, solo actualízalo desde el menú de los tres puntos, </w:t>
+      </w:r>
+      <w:r>
+        <w:rPr>
+          <w:b/>
+        </w:rPr>
         <w:t>Ayuda &gt; Información de Google Chrome</w:t>
       </w:r>
       <w:r>
         <w:rPr>
           <w:b w:val="0"/>
         </w:rPr>
-        <w:t>, y sigue al paso 6.</w:t>
+        <w:t>, y sigue al paso 8.</w:t>
       </w:r>
     </w:p>
     <w:tbl>
@@ -4778,8 +6111,8 @@
       <w:r>
         <w:drawing>
           <wp:inline xmlns:a="http://schemas.openxmlformats.org/drawingml/2006/main" xmlns:pic="http://schemas.openxmlformats.org/drawingml/2006/picture">
-            <wp:extent cx="5040000" cy="2805567"/>
-            <wp:docPr id="5" name="Picture 5"/>
+            <wp:extent cx="3420000" cy="1903777"/>
+            <wp:docPr id="7" name="Picture 7"/>
             <wp:cNvGraphicFramePr>
               <a:graphicFrameLocks noChangeAspect="1"/>
             </wp:cNvGraphicFramePr>
@@ -4791,7 +6124,7 @@
                     <pic:cNvPicPr/>
                   </pic:nvPicPr>
                   <pic:blipFill>
-                    <a:blip r:embed="rId14"/>
+                    <a:blip r:embed="rId16"/>
                     <a:stretch>
                       <a:fillRect/>
                     </a:stretch>
@@ -4799,7 +6132,7 @@
                   <pic:spPr>
                     <a:xfrm>
                       <a:off x="0" y="0"/>
-                      <a:ext cx="5040000" cy="2805567"/>
+                      <a:ext cx="3420000" cy="1903777"/>
                     </a:xfrm>
                     <a:prstGeom prst="rect"/>
                   </pic:spPr>
@@ -4829,7 +6162,7 @@
         <w:spacing w:after="60"/>
         <w:numPr>
           <w:ilvl w:val="0"/>
-          <w:numId w:val="17"/>
+          <w:numId w:val="20"/>
         </w:numPr>
       </w:pPr>
       <w:r>
@@ -4869,7 +6202,7 @@
         <w:spacing w:after="60"/>
         <w:numPr>
           <w:ilvl w:val="0"/>
-          <w:numId w:val="17"/>
+          <w:numId w:val="20"/>
         </w:numPr>
       </w:pPr>
       <w:r>
@@ -4898,7 +6231,7 @@
         <w:spacing w:after="60"/>
         <w:numPr>
           <w:ilvl w:val="0"/>
-          <w:numId w:val="17"/>
+          <w:numId w:val="20"/>
         </w:numPr>
       </w:pPr>
       <w:r>
@@ -4934,7 +6267,7 @@
           <w:color w:val="003D7A"/>
           <w:sz w:val="36"/>
         </w:rPr>
-        <w:t>Paso 6. Clonar el repositorio y cambiar de rama</w:t>
+        <w:t>Paso 8. Clonar el repositorio y cambiar de rama</w:t>
       </w:r>
     </w:p>
     <w:p>
@@ -5362,7 +6695,98 @@
         <w:rPr>
           <w:b w:val="0"/>
         </w:rPr>
-        <w:t>. Para cada clase haces lo mismo con el nombre de su rama.</w:t>
+        <w:t xml:space="preserve">. Para cada clase haces lo mismo con el nombre de su rama. La rama 04 es distinta porque es TypeScript: en vez de </w:t>
+      </w:r>
+      <w:r>
+        <w:rPr>
+          <w:rFonts w:ascii="Consolas" w:hAnsi="Consolas" w:eastAsia="Consolas"/>
+          <w:color w:val="003D7A"/>
+        </w:rPr>
+        <w:t>build.gradle</w:t>
+      </w:r>
+      <w:r>
+        <w:rPr>
+          <w:b w:val="0"/>
+        </w:rPr>
+        <w:t xml:space="preserve"> y </w:t>
+      </w:r>
+      <w:r>
+        <w:rPr>
+          <w:rFonts w:ascii="Consolas" w:hAnsi="Consolas" w:eastAsia="Consolas"/>
+          <w:color w:val="003D7A"/>
+        </w:rPr>
+        <w:t>src</w:t>
+      </w:r>
+      <w:r>
+        <w:rPr>
+          <w:b w:val="0"/>
+        </w:rPr>
+        <w:t xml:space="preserve"> tiene </w:t>
+      </w:r>
+      <w:r>
+        <w:rPr>
+          <w:rFonts w:ascii="Consolas" w:hAnsi="Consolas" w:eastAsia="Consolas"/>
+          <w:color w:val="003D7A"/>
+        </w:rPr>
+        <w:t>package.json</w:t>
+      </w:r>
+      <w:r>
+        <w:rPr>
+          <w:b w:val="0"/>
+        </w:rPr>
+        <w:t xml:space="preserve">, </w:t>
+      </w:r>
+      <w:r>
+        <w:rPr>
+          <w:rFonts w:ascii="Consolas" w:hAnsi="Consolas" w:eastAsia="Consolas"/>
+          <w:color w:val="003D7A"/>
+        </w:rPr>
+        <w:t>playwright.config.ts</w:t>
+      </w:r>
+      <w:r>
+        <w:rPr>
+          <w:b w:val="0"/>
+        </w:rPr>
+        <w:t xml:space="preserve"> y las carpetas </w:t>
+      </w:r>
+      <w:r>
+        <w:rPr>
+          <w:rFonts w:ascii="Consolas" w:hAnsi="Consolas" w:eastAsia="Consolas"/>
+          <w:color w:val="003D7A"/>
+        </w:rPr>
+        <w:t>pages</w:t>
+      </w:r>
+      <w:r>
+        <w:rPr>
+          <w:b w:val="0"/>
+        </w:rPr>
+        <w:t xml:space="preserve">, </w:t>
+      </w:r>
+      <w:r>
+        <w:rPr>
+          <w:rFonts w:ascii="Consolas" w:hAnsi="Consolas" w:eastAsia="Consolas"/>
+          <w:color w:val="003D7A"/>
+        </w:rPr>
+        <w:t>data</w:t>
+      </w:r>
+      <w:r>
+        <w:rPr>
+          <w:b w:val="0"/>
+        </w:rPr>
+        <w:t xml:space="preserve"> y </w:t>
+      </w:r>
+      <w:r>
+        <w:rPr>
+          <w:rFonts w:ascii="Consolas" w:hAnsi="Consolas" w:eastAsia="Consolas"/>
+          <w:color w:val="003D7A"/>
+        </w:rPr>
+        <w:t>tests</w:t>
+      </w:r>
+      <w:r>
+        <w:rPr>
+          <w:b w:val="0"/>
+        </w:rPr>
+        <w:t>.</w:t>
       </w:r>
     </w:p>
     <w:p>
@@ -5400,7 +6824,7 @@
           <w:color w:val="003D7A"/>
           <w:sz w:val="36"/>
         </w:rPr>
-        <w:t>Paso 7. Navegador de Playwright (clase 4)</w:t>
+        <w:t>Paso 9. Librerías y navegador de Playwright (clase 4)</w:t>
       </w:r>
     </w:p>
     <w:p>
@@ -5411,7 +6835,7 @@
         <w:rPr>
           <w:b w:val="0"/>
         </w:rPr>
-        <w:t>Playwright no usa el Chrome que instalaste: trae su propio navegador, Chromium, y hay que descargarlo una vez por equipo. El proyecto de la clase 4 tiene una tarea de Gradle que lo hace por ti. Puedes dejar este paso para antes de la clase 4, pero mejor hazlo ahora, porque ocupa cerca de 560 MB en disco:</w:t>
+        <w:t>Playwright no usa el Chrome que instalaste: trae su propio navegador, Chromium, y hay que descargarlo una vez por equipo. Puedes dejar este paso para antes de la clase 4, pero mejor hazlo con tiempo porque son descargas grandes. En un PowerShell nuevo:</w:t>
       </w:r>
     </w:p>
     <w:tbl>
@@ -5478,7 +6902,21 @@
                 <w:color w:val="1F2933"/>
                 <w:sz w:val="19"/>
               </w:rPr>
-              <w:t>gradle instalarNavegadores</w:t>
+              <w:t>npm ci</w:t>
+            </w:r>
+          </w:p>
+          <w:p>
+            <w:pPr>
+              <w:keepNext/>
+              <w:spacing w:after="0" w:line="240" w:lineRule="auto"/>
+            </w:pPr>
+            <w:r>
+              <w:rPr>
+                <w:rFonts w:ascii="Consolas" w:hAnsi="Consolas" w:eastAsia="Consolas"/>
+                <w:color w:val="1F2933"/>
+                <w:sz w:val="19"/>
+              </w:rPr>
+              <w:t>npm run instalar:navegador</w:t>
             </w:r>
           </w:p>
         </w:tc>
@@ -5492,21 +6930,67 @@
     <w:p>
       <w:r>
         <w:rPr>
-          <w:b w:val="0"/>
-        </w:rPr>
-        <w:t xml:space="preserve">Al final debe decir </w:t>
+          <w:rFonts w:ascii="Consolas" w:hAnsi="Consolas" w:eastAsia="Consolas"/>
+          <w:color w:val="003D7A"/>
+        </w:rPr>
+        <w:t>npm ci</w:t>
+      </w:r>
+      <w:r>
+        <w:rPr>
+          <w:b w:val="0"/>
+        </w:rPr>
+        <w:t xml:space="preserve"> descarga exactamente las librerías que dice el archivo </w:t>
+      </w:r>
+      <w:r>
+        <w:rPr>
+          <w:rFonts w:ascii="Consolas" w:hAnsi="Consolas" w:eastAsia="Consolas"/>
+          <w:color w:val="003D7A"/>
+        </w:rPr>
+        <w:t>package-lock.json</w:t>
+      </w:r>
+      <w:r>
+        <w:rPr>
+          <w:b w:val="0"/>
+        </w:rPr>
+        <w:t xml:space="preserve"> del proyecto y las deja en la carpeta </w:t>
+      </w:r>
+      <w:r>
+        <w:rPr>
+          <w:rFonts w:ascii="Consolas" w:hAnsi="Consolas" w:eastAsia="Consolas"/>
+          <w:color w:val="003D7A"/>
+        </w:rPr>
+        <w:t>node_modules</w:t>
+      </w:r>
+      <w:r>
+        <w:rPr>
+          <w:b w:val="0"/>
+        </w:rPr>
+        <w:t xml:space="preserve">. </w:t>
+      </w:r>
+      <w:r>
+        <w:rPr>
+          <w:rFonts w:ascii="Consolas" w:hAnsi="Consolas" w:eastAsia="Consolas"/>
+          <w:color w:val="003D7A"/>
+        </w:rPr>
+        <w:t>npm run instalar:navegador</w:t>
+      </w:r>
+      <w:r>
+        <w:rPr>
+          <w:b w:val="0"/>
+        </w:rPr>
+        <w:t xml:space="preserve"> descarga el navegador (solo lo corres una vez); en nuestra prueba ocupó cerca de </w:t>
       </w:r>
       <w:r>
         <w:rPr>
           <w:b/>
         </w:rPr>
-        <w:t>BUILD SUCCESSFUL</w:t>
-      </w:r>
-      <w:r>
-        <w:rPr>
-          <w:b w:val="0"/>
-        </w:rPr>
-        <w:t>. La tarea ya viene preparada para redes de empresa con proxy: le dice a Playwright que use los certificados de Windows, así que no tienes que configurar nada más.</w:t>
+        <w:t>560 MB</w:t>
+      </w:r>
+      <w:r>
+        <w:rPr>
+          <w:b w:val="0"/>
+        </w:rPr>
+        <w:t xml:space="preserve"> (Chromium, su versión sin ventana y FFmpeg). Al final no debe salir ningún error en rojo.</w:t>
       </w:r>
     </w:p>
     <w:p>
@@ -5514,33 +6998,67 @@
         <w:rPr>
           <w:b w:val="0"/>
         </w:rPr>
-        <w:t xml:space="preserve">Si alguna vez una prueba te dice que falta el navegador y te sugiere un comando que empieza por </w:t>
+        <w:t xml:space="preserve">No tienes que configurar nada para la red de la empresa: el comando </w:t>
       </w:r>
       <w:r>
         <w:rPr>
           <w:rFonts w:ascii="Consolas" w:hAnsi="Consolas" w:eastAsia="Consolas"/>
           <w:color w:val="003D7A"/>
         </w:rPr>
-        <w:t>mvn</w:t>
-      </w:r>
-      <w:r>
-        <w:rPr>
-          <w:b w:val="0"/>
-        </w:rPr>
-        <w:t xml:space="preserve">, ignóralo: en el semillero no usamos Maven. Corre </w:t>
+        <w:t>instalar:navegador</w:t>
+      </w:r>
+      <w:r>
+        <w:rPr>
+          <w:b w:val="0"/>
+        </w:rPr>
+        <w:t xml:space="preserve"> ya le dice a Node.js que use los certificados que tiene instalados el equipo. En nuestra prueba detrás del proxy de la empresa, los dos comandos terminaron bien sin configurar nada más. Si aun así falla, toma una captura del error y envíamela antes de la clase 4.</w:t>
+      </w:r>
+    </w:p>
+    <w:p>
+      <w:r>
+        <w:rPr>
+          <w:b w:val="0"/>
+        </w:rPr>
+        <w:t xml:space="preserve">Con eso la rama queda lista. En clase vamos a usar </w:t>
       </w:r>
       <w:r>
         <w:rPr>
           <w:rFonts w:ascii="Consolas" w:hAnsi="Consolas" w:eastAsia="Consolas"/>
           <w:color w:val="003D7A"/>
         </w:rPr>
-        <w:t>gradle instalarNavegadores</w:t>
-      </w:r>
-      <w:r>
-        <w:rPr>
-          <w:b w:val="0"/>
-        </w:rPr>
-        <w:t xml:space="preserve"> dentro de la rama 04. Si la descarga falla por certificados, toma una captura del error y envíamela antes de la clase 4.</w:t>
+        <w:t>npm test</w:t>
+      </w:r>
+      <w:r>
+        <w:rPr>
+          <w:b w:val="0"/>
+        </w:rPr>
+        <w:t xml:space="preserve"> para correr las pruebas, </w:t>
+      </w:r>
+      <w:r>
+        <w:rPr>
+          <w:rFonts w:ascii="Consolas" w:hAnsi="Consolas" w:eastAsia="Consolas"/>
+          <w:color w:val="003D7A"/>
+        </w:rPr>
+        <w:t>npm run test:visible</w:t>
+      </w:r>
+      <w:r>
+        <w:rPr>
+          <w:b w:val="0"/>
+        </w:rPr>
+        <w:t xml:space="preserve"> para verlas en el navegador y </w:t>
+      </w:r>
+      <w:r>
+        <w:rPr>
+          <w:rFonts w:ascii="Consolas" w:hAnsi="Consolas" w:eastAsia="Consolas"/>
+          <w:color w:val="003D7A"/>
+        </w:rPr>
+        <w:t>npm run reporte</w:t>
+      </w:r>
+      <w:r>
+        <w:rPr>
+          <w:b w:val="0"/>
+        </w:rPr>
+        <w:t xml:space="preserve"> para abrir el reporte.</w:t>
       </w:r>
     </w:p>
     <w:p>
@@ -5872,7 +7390,7 @@
                 <w:color w:val="003D7A"/>
                 <w:sz w:val="20"/>
               </w:rPr>
-              <w:t>git config --global user.name</w:t>
+              <w:t>node -v</w:t>
             </w:r>
           </w:p>
         </w:tc>
@@ -5895,7 +7413,7 @@
                 <w:b w:val="0"/>
                 <w:sz w:val="20"/>
               </w:rPr>
-              <w:t>Tu nombre</w:t>
+              <w:t>v24 seguido de números (por ejemplo v24.21.0)</w:t>
             </w:r>
           </w:p>
         </w:tc>
@@ -5925,6 +7443,165 @@
                 <w:color w:val="003D7A"/>
                 <w:sz w:val="20"/>
               </w:rPr>
+              <w:t>npm -v</w:t>
+            </w:r>
+          </w:p>
+        </w:tc>
+        <w:tc>
+          <w:tcPr>
+            <w:tcW w:type="dxa" w:w="5669"/>
+            <w:shd w:val="clear" w:color="auto" w:fill="F2F5F9"/>
+            <w:tcBorders>
+              <w:top w:val="single" w:sz="6" w:color="D0D7DE"/>
+              <w:left w:val="single" w:sz="6" w:color="D0D7DE"/>
+              <w:bottom w:val="single" w:sz="6" w:color="D0D7DE"/>
+              <w:right w:val="single" w:sz="6" w:color="D0D7DE"/>
+            </w:tcBorders>
+          </w:tcPr>
+          <w:p>
+            <w:pPr>
+              <w:keepNext/>
+            </w:pPr>
+            <w:r>
+              <w:rPr>
+                <w:b w:val="0"/>
+                <w:sz w:val="20"/>
+              </w:rPr>
+              <w:t>Un número de versión (por ejemplo 11.19.0), sin error rojo</w:t>
+            </w:r>
+          </w:p>
+        </w:tc>
+      </w:tr>
+      <w:tr>
+        <w:trPr>
+          <w:cantSplit/>
+        </w:trPr>
+        <w:tc>
+          <w:tcPr>
+            <w:tcW w:type="dxa" w:w="3969"/>
+            <w:tcBorders>
+              <w:top w:val="single" w:sz="6" w:color="D0D7DE"/>
+              <w:left w:val="single" w:sz="6" w:color="D0D7DE"/>
+              <w:bottom w:val="single" w:sz="6" w:color="D0D7DE"/>
+              <w:right w:val="single" w:sz="6" w:color="D0D7DE"/>
+            </w:tcBorders>
+          </w:tcPr>
+          <w:p>
+            <w:pPr>
+              <w:keepNext/>
+            </w:pPr>
+            <w:r>
+              <w:rPr>
+                <w:rFonts w:ascii="Consolas" w:hAnsi="Consolas" w:eastAsia="Consolas"/>
+                <w:color w:val="003D7A"/>
+                <w:sz w:val="20"/>
+              </w:rPr>
+              <w:t>code --version</w:t>
+            </w:r>
+          </w:p>
+        </w:tc>
+        <w:tc>
+          <w:tcPr>
+            <w:tcW w:type="dxa" w:w="5669"/>
+            <w:tcBorders>
+              <w:top w:val="single" w:sz="6" w:color="D0D7DE"/>
+              <w:left w:val="single" w:sz="6" w:color="D0D7DE"/>
+              <w:bottom w:val="single" w:sz="6" w:color="D0D7DE"/>
+              <w:right w:val="single" w:sz="6" w:color="D0D7DE"/>
+            </w:tcBorders>
+          </w:tcPr>
+          <w:p>
+            <w:pPr>
+              <w:keepNext/>
+            </w:pPr>
+            <w:r>
+              <w:rPr>
+                <w:b w:val="0"/>
+                <w:sz w:val="20"/>
+              </w:rPr>
+              <w:t>La versión de Visual Studio Code, un código largo y x64</w:t>
+            </w:r>
+          </w:p>
+        </w:tc>
+      </w:tr>
+      <w:tr>
+        <w:trPr>
+          <w:cantSplit/>
+        </w:trPr>
+        <w:tc>
+          <w:tcPr>
+            <w:tcW w:type="dxa" w:w="3969"/>
+            <w:shd w:val="clear" w:color="auto" w:fill="F2F5F9"/>
+            <w:tcBorders>
+              <w:top w:val="single" w:sz="6" w:color="D0D7DE"/>
+              <w:left w:val="single" w:sz="6" w:color="D0D7DE"/>
+              <w:bottom w:val="single" w:sz="6" w:color="D0D7DE"/>
+              <w:right w:val="single" w:sz="6" w:color="D0D7DE"/>
+            </w:tcBorders>
+          </w:tcPr>
+          <w:p>
+            <w:pPr>
+              <w:keepNext/>
+            </w:pPr>
+            <w:r>
+              <w:rPr>
+                <w:rFonts w:ascii="Consolas" w:hAnsi="Consolas" w:eastAsia="Consolas"/>
+                <w:color w:val="003D7A"/>
+                <w:sz w:val="20"/>
+              </w:rPr>
+              <w:t>git config --global user.name</w:t>
+            </w:r>
+          </w:p>
+        </w:tc>
+        <w:tc>
+          <w:tcPr>
+            <w:tcW w:type="dxa" w:w="5669"/>
+            <w:shd w:val="clear" w:color="auto" w:fill="F2F5F9"/>
+            <w:tcBorders>
+              <w:top w:val="single" w:sz="6" w:color="D0D7DE"/>
+              <w:left w:val="single" w:sz="6" w:color="D0D7DE"/>
+              <w:bottom w:val="single" w:sz="6" w:color="D0D7DE"/>
+              <w:right w:val="single" w:sz="6" w:color="D0D7DE"/>
+            </w:tcBorders>
+          </w:tcPr>
+          <w:p>
+            <w:pPr>
+              <w:keepNext/>
+            </w:pPr>
+            <w:r>
+              <w:rPr>
+                <w:b w:val="0"/>
+                <w:sz w:val="20"/>
+              </w:rPr>
+              <w:t>Tu nombre</w:t>
+            </w:r>
+          </w:p>
+        </w:tc>
+      </w:tr>
+      <w:tr>
+        <w:trPr>
+          <w:cantSplit/>
+        </w:trPr>
+        <w:tc>
+          <w:tcPr>
+            <w:tcW w:type="dxa" w:w="3969"/>
+            <w:tcBorders>
+              <w:top w:val="single" w:sz="6" w:color="D0D7DE"/>
+              <w:left w:val="single" w:sz="6" w:color="D0D7DE"/>
+              <w:bottom w:val="single" w:sz="6" w:color="D0D7DE"/>
+              <w:right w:val="single" w:sz="6" w:color="D0D7DE"/>
+            </w:tcBorders>
+          </w:tcPr>
+          <w:p>
+            <w:pPr>
+              <w:keepNext/>
+            </w:pPr>
+            <w:r>
+              <w:rPr>
+                <w:rFonts w:ascii="Consolas" w:hAnsi="Consolas" w:eastAsia="Consolas"/>
+                <w:color w:val="003D7A"/>
+                <w:sz w:val="20"/>
+              </w:rPr>
               <w:t>cd C:\semillero\semillero2026</w:t>
             </w:r>
           </w:p>
@@ -5932,7 +7609,6 @@
         <w:tc>
           <w:tcPr>
             <w:tcW w:type="dxa" w:w="5669"/>
-            <w:shd w:val="clear" w:color="auto" w:fill="F2F5F9"/>
             <w:tcBorders>
               <w:top w:val="single" w:sz="6" w:color="D0D7DE"/>
               <w:left w:val="single" w:sz="6" w:color="D0D7DE"/>
@@ -5961,6 +7637,7 @@
         <w:tc>
           <w:tcPr>
             <w:tcW w:type="dxa" w:w="3969"/>
+            <w:shd w:val="clear" w:color="auto" w:fill="F2F5F9"/>
             <w:tcBorders>
               <w:top w:val="single" w:sz="6" w:color="D0D7DE"/>
               <w:left w:val="single" w:sz="6" w:color="D0D7DE"/>
@@ -5985,6 +7662,7 @@
         <w:tc>
           <w:tcPr>
             <w:tcW w:type="dxa" w:w="5669"/>
+            <w:shd w:val="clear" w:color="auto" w:fill="F2F5F9"/>
             <w:tcBorders>
               <w:top w:val="single" w:sz="6" w:color="D0D7DE"/>
               <w:left w:val="single" w:sz="6" w:color="D0D7DE"/>
@@ -6013,7 +7691,6 @@
         <w:tc>
           <w:tcPr>
             <w:tcW w:type="dxa" w:w="3969"/>
-            <w:shd w:val="clear" w:color="auto" w:fill="F2F5F9"/>
             <w:tcBorders>
               <w:top w:val="single" w:sz="6" w:color="D0D7DE"/>
               <w:left w:val="single" w:sz="6" w:color="D0D7DE"/>
@@ -6035,7 +7712,6 @@
         <w:tc>
           <w:tcPr>
             <w:tcW w:type="dxa" w:w="5669"/>
-            <w:shd w:val="clear" w:color="auto" w:fill="F2F5F9"/>
             <w:tcBorders>
               <w:top w:val="single" w:sz="6" w:color="D0D7DE"/>
               <w:left w:val="single" w:sz="6" w:color="D0D7DE"/>
@@ -6476,6 +8152,79 @@
           <w:color w:val="0072BC"/>
           <w:sz w:val="28"/>
         </w:rPr>
+        <w:t>node o npm no se reconocen</w:t>
+      </w:r>
+    </w:p>
+    <w:p>
+      <w:r>
+        <w:rPr>
+          <w:b w:val="0"/>
+        </w:rPr>
+        <w:t xml:space="preserve">Si PowerShell dice que </w:t>
+      </w:r>
+      <w:r>
+        <w:rPr>
+          <w:rFonts w:ascii="Consolas" w:hAnsi="Consolas" w:eastAsia="Consolas"/>
+          <w:color w:val="003D7A"/>
+        </w:rPr>
+        <w:t>node</w:t>
+      </w:r>
+      <w:r>
+        <w:rPr>
+          <w:b w:val="0"/>
+        </w:rPr>
+        <w:t xml:space="preserve"> o </w:t>
+      </w:r>
+      <w:r>
+        <w:rPr>
+          <w:rFonts w:ascii="Consolas" w:hAnsi="Consolas" w:eastAsia="Consolas"/>
+          <w:color w:val="003D7A"/>
+        </w:rPr>
+        <w:t>npm</w:t>
+      </w:r>
+      <w:r>
+        <w:rPr>
+          <w:b w:val="0"/>
+        </w:rPr>
+        <w:t xml:space="preserve"> no se reconocen como nombre de un cmdlet, casi siempre es una ventana que estaba abierta antes de instalar Node.js. Cierra todas las de PowerShell (y Visual Studio Code, si lo tenías abierto) y abre una nueva. Si sigue igual, revisa con </w:t>
+      </w:r>
+      <w:r>
+        <w:rPr>
+          <w:rFonts w:ascii="Consolas" w:hAnsi="Consolas" w:eastAsia="Consolas"/>
+          <w:color w:val="003D7A"/>
+        </w:rPr>
+        <w:t>Test-Path "C:\Program Files\nodejs\node.exe"</w:t>
+      </w:r>
+      <w:r>
+        <w:rPr>
+          <w:b w:val="0"/>
+        </w:rPr>
+        <w:t xml:space="preserve">: si dice False, vuelve a instalar Node.js; si dice True, abre el instalador, elige </w:t>
+      </w:r>
+      <w:r>
+        <w:rPr>
+          <w:b/>
+        </w:rPr>
+        <w:t>Repair</w:t>
+      </w:r>
+      <w:r>
+        <w:rPr>
+          <w:b w:val="0"/>
+        </w:rPr>
+        <w:t xml:space="preserve"> y reinicia el equipo.</w:t>
+      </w:r>
+    </w:p>
+    <w:p>
+      <w:pPr>
+        <w:keepNext/>
+        <w:spacing w:before="200" w:after="80"/>
+      </w:pPr>
+      <w:r>
+        <w:rPr>
+          <w:b/>
+          <w:color w:val="0072BC"/>
+          <w:sz w:val="28"/>
+        </w:rPr>
         <w:t>PowerShell abierto antes de cambiar el Path</w:t>
       </w:r>
     </w:p>
@@ -6878,33 +8627,46 @@
         <w:rPr>
           <w:b w:val="0"/>
         </w:rPr>
-        <w:t xml:space="preserve"> (clase 4): </w:t>
+        <w:t xml:space="preserve"> (clase 4): usa </w:t>
       </w:r>
       <w:r>
         <w:rPr>
           <w:rFonts w:ascii="Consolas" w:hAnsi="Consolas" w:eastAsia="Consolas"/>
           <w:color w:val="003D7A"/>
         </w:rPr>
-        <w:t>gradle instalarNavegadores</w:t>
-      </w:r>
-      <w:r>
-        <w:rPr>
-          <w:b w:val="0"/>
-        </w:rPr>
-        <w:t xml:space="preserve"> ya usa los certificados de Windows. Solo si instalas los navegadores por otro camino, escribe antes </w:t>
+        <w:t>npm run instalar:navegador</w:t>
+      </w:r>
+      <w:r>
+        <w:rPr>
+          <w:b w:val="0"/>
+        </w:rPr>
+        <w:t xml:space="preserve">, que ya confía en los certificados del equipo. Solo si instalas el navegador por otro camino (por ejemplo </w:t>
       </w:r>
       <w:r>
         <w:rPr>
           <w:rFonts w:ascii="Consolas" w:hAnsi="Consolas" w:eastAsia="Consolas"/>
           <w:color w:val="003D7A"/>
         </w:rPr>
+        <w:t>npx playwright install chromium</w:t>
+      </w:r>
+      <w:r>
+        <w:rPr>
+          <w:b w:val="0"/>
+        </w:rPr>
+        <w:t xml:space="preserve">), escribe antes </w:t>
+      </w:r>
+      <w:r>
+        <w:rPr>
+          <w:rFonts w:ascii="Consolas" w:hAnsi="Consolas" w:eastAsia="Consolas"/>
+          <w:color w:val="003D7A"/>
+        </w:rPr>
         <w:t>$env:NODE_OPTIONS="--use-system-ca"</w:t>
       </w:r>
       <w:r>
         <w:rPr>
           <w:b w:val="0"/>
         </w:rPr>
-        <w:t xml:space="preserve"> en la misma ventana de PowerShell (dura mientras la ventana esté abierta).</w:t>
+        <w:t xml:space="preserve"> en la misma ventana de PowerShell. El error típico sin eso es "unable to get local issuer certificate".</w:t>
       </w:r>
     </w:p>
     <w:p>
@@ -7213,33 +8975,59 @@
         <w:rPr>
           <w:b w:val="0"/>
         </w:rPr>
-        <w:t xml:space="preserve">Gradle se ejecuta con un archivo </w:t>
+        <w:t xml:space="preserve">Lo vas a ver casi seguro con </w:t>
       </w:r>
       <w:r>
         <w:rPr>
           <w:rFonts w:ascii="Consolas" w:hAnsi="Consolas" w:eastAsia="Consolas"/>
           <w:color w:val="003D7A"/>
         </w:rPr>
-        <w:t>.bat</w:t>
-      </w:r>
-      <w:r>
-        <w:rPr>
-          <w:b w:val="0"/>
-        </w:rPr>
-        <w:t xml:space="preserve">, así que normalmente no ves este error. Si aparece al correr algún comando o script </w:t>
+        <w:t>npm</w:t>
+      </w:r>
+      <w:r>
+        <w:rPr>
+          <w:b w:val="0"/>
+        </w:rPr>
+        <w:t xml:space="preserve"> o </w:t>
       </w:r>
       <w:r>
         <w:rPr>
           <w:rFonts w:ascii="Consolas" w:hAnsi="Consolas" w:eastAsia="Consolas"/>
           <w:color w:val="003D7A"/>
         </w:rPr>
-        <w:t>.ps1</w:t>
-      </w:r>
-      <w:r>
-        <w:rPr>
-          <w:b w:val="0"/>
-        </w:rPr>
-        <w:t>, permite los scripts solo para tu usuario:</w:t>
+        <w:t>npx</w:t>
+      </w:r>
+      <w:r>
+        <w:rPr>
+          <w:b w:val="0"/>
+        </w:rPr>
+        <w:t xml:space="preserve">: el mensaje dice que no se puede cargar el archivo </w:t>
+      </w:r>
+      <w:r>
+        <w:rPr>
+          <w:rFonts w:ascii="Consolas" w:hAnsi="Consolas" w:eastAsia="Consolas"/>
+          <w:color w:val="003D7A"/>
+        </w:rPr>
+        <w:t>C:\Program Files\nodejs\npm.ps1</w:t>
+      </w:r>
+      <w:r>
+        <w:rPr>
+          <w:b w:val="0"/>
+        </w:rPr>
+        <w:t xml:space="preserve"> porque la ejecución de scripts está deshabilitada en este sistema. Gradle se ejecuta con un archivo </w:t>
+      </w:r>
+      <w:r>
+        <w:rPr>
+          <w:rFonts w:ascii="Consolas" w:hAnsi="Consolas" w:eastAsia="Consolas"/>
+          <w:color w:val="003D7A"/>
+        </w:rPr>
+        <w:t>.bat</w:t>
+      </w:r>
+      <w:r>
+        <w:rPr>
+          <w:b w:val="0"/>
+        </w:rPr>
+        <w:t xml:space="preserve"> y no tiene este problema. Permite los scripts solo para tu usuario:</w:t>
       </w:r>
     </w:p>
     <w:tbl>
@@ -7320,7 +9108,46 @@
         <w:rPr>
           <w:b w:val="0"/>
         </w:rPr>
-        <w:t xml:space="preserve"> (o Y) cuando pregunte. Si dice que la directiva la controla la organización, es un bloqueo de la empresa: pide ayuda a soporte y avísame.</w:t>
+        <w:t xml:space="preserve"> (o Y) cuando pregunte, cierra PowerShell y vuelve a probar </w:t>
+      </w:r>
+      <w:r>
+        <w:rPr>
+          <w:rFonts w:ascii="Consolas" w:hAnsi="Consolas" w:eastAsia="Consolas"/>
+          <w:color w:val="003D7A"/>
+        </w:rPr>
+        <w:t>npm -v</w:t>
+      </w:r>
+      <w:r>
+        <w:rPr>
+          <w:b w:val="0"/>
+        </w:rPr>
+        <w:t xml:space="preserve">. Mientras tanto también funciona escribir </w:t>
+      </w:r>
+      <w:r>
+        <w:rPr>
+          <w:rFonts w:ascii="Consolas" w:hAnsi="Consolas" w:eastAsia="Consolas"/>
+          <w:color w:val="003D7A"/>
+        </w:rPr>
+        <w:t>npm.cmd</w:t>
+      </w:r>
+      <w:r>
+        <w:rPr>
+          <w:b w:val="0"/>
+        </w:rPr>
+        <w:t xml:space="preserve"> en lugar de </w:t>
+      </w:r>
+      <w:r>
+        <w:rPr>
+          <w:rFonts w:ascii="Consolas" w:hAnsi="Consolas" w:eastAsia="Consolas"/>
+          <w:color w:val="003D7A"/>
+        </w:rPr>
+        <w:t>npm</w:t>
+      </w:r>
+      <w:r>
+        <w:rPr>
+          <w:b w:val="0"/>
+        </w:rPr>
+        <w:t>. Si dice que la directiva la controla la organización, es un bloqueo de la empresa: pide ayuda a soporte y avísame.</w:t>
       </w:r>
     </w:p>
     <w:p>
@@ -7368,7 +9195,7 @@
         <w:rPr>
           <w:b w:val="0"/>
         </w:rPr>
-        <w:t xml:space="preserve"> y </w:t>
+        <w:t xml:space="preserve">, </w:t>
       </w:r>
       <w:r>
         <w:rPr>
@@ -7376,6 +9203,19 @@
           <w:color w:val="003D7A"/>
         </w:rPr>
         <w:t>git --version</w:t>
+      </w:r>
+      <w:r>
+        <w:rPr>
+          <w:b w:val="0"/>
+        </w:rPr>
+        <w:t xml:space="preserve"> y </w:t>
+      </w:r>
+      <w:r>
+        <w:rPr>
+          <w:rFonts w:ascii="Consolas" w:hAnsi="Consolas" w:eastAsia="Consolas"/>
+          <w:color w:val="003D7A"/>
+        </w:rPr>
+        <w:t>node -v</w:t>
       </w:r>
       <w:r>
         <w:rPr>
@@ -7666,6 +9506,24 @@
     </w:lvlOverride>
   </w:num>
   <w:num w:numId="17">
+    <w:abstractNumId w:val="7"/>
+    <w:lvlOverride w:ilvl="0">
+      <w:startOverride w:val="1"/>
+    </w:lvlOverride>
+  </w:num>
+  <w:num w:numId="18">
+    <w:abstractNumId w:val="7"/>
+    <w:lvlOverride w:ilvl="0">
+      <w:startOverride w:val="1"/>
+    </w:lvlOverride>
+  </w:num>
+  <w:num w:numId="19">
+    <w:abstractNumId w:val="7"/>
+    <w:lvlOverride w:ilvl="0">
+      <w:startOverride w:val="1"/>
+    </w:lvlOverride>
+  </w:num>
+  <w:num w:numId="20">
     <w:abstractNumId w:val="7"/>
     <w:lvlOverride w:ilvl="0">
       <w:startOverride w:val="1"/>

</xml_diff>

<commit_message>
Guía de prerrequisitos: salida de gradle run con la sección de sobrecarga
Co-Authored-By: Claude Opus 5 (1M context) <noreply@anthropic.com>
Claude-Session: https://claude.ai/code/session_01L2JuF1iG72koPJkmuRWSzm
</commit_message>
<xml_diff>
--- a/material-de-apoyo/Prerrequisitos_Instalacion_Entorno_Windows.docx
+++ b/material-de-apoyo/Prerrequisitos_Instalacion_Entorno_Windows.docx
@@ -7757,7 +7757,7 @@
         <w:rPr>
           <w:b w:val="0"/>
         </w:rPr>
-        <w:t xml:space="preserve"> compila el proyecto y muestra en pantalla los ejemplos de la clase, cada uno con un título entre signos igual (del 1. Variables y tipos de datos al 6. Herencia y polimorfismo). No descarga librerías, así que tarda pocos segundos. En nuestra prueba terminó así (recortada):</w:t>
+        <w:t xml:space="preserve"> compila el proyecto y muestra en pantalla los ejemplos de la clase, cada uno con un título entre signos igual (del 1. Variables y tipos de datos al 7. Polimorfismo: metodos sobrecargados). No descarga librerías, así que tarda pocos segundos. En nuestra prueba terminó así (recortada):</w:t>
       </w:r>
     </w:p>
     <w:tbl>
@@ -7852,7 +7852,7 @@
                 <w:color w:val="1F2933"/>
                 <w:sz w:val="19"/>
               </w:rPr>
-              <w:t>===== 6. Herencia y polimorfismo =====</w:t>
+              <w:t>===== 7. Polimorfismo: metodos sobrecargados =====</w:t>
             </w:r>
           </w:p>
           <w:p>
@@ -7866,7 +7866,7 @@
                 <w:color w:val="1F2933"/>
                 <w:sz w:val="19"/>
               </w:rPr>
-              <w:t>Firulais dice Guau</w:t>
+              <w:t>sumar(2, 3) = 5</w:t>
             </w:r>
           </w:p>
           <w:p>
@@ -7880,7 +7880,21 @@
                 <w:color w:val="1F2933"/>
                 <w:sz w:val="19"/>
               </w:rPr>
-              <w:t>Michi dice Miau</w:t>
+              <w:t>sumar(2, 3, 4) = 9</w:t>
+            </w:r>
+          </w:p>
+          <w:p>
+            <w:pPr>
+              <w:keepNext/>
+              <w:spacing w:after="0" w:line="240" w:lineRule="auto"/>
+            </w:pPr>
+            <w:r>
+              <w:rPr>
+                <w:rFonts w:ascii="Consolas" w:hAnsi="Consolas" w:eastAsia="Consolas"/>
+                <w:color w:val="1F2933"/>
+                <w:sz w:val="19"/>
+              </w:rPr>
+              <w:t>sumar(2.5, 1.5) = 4.0</w:t>
             </w:r>
           </w:p>
           <w:p>

</xml_diff>

<commit_message>
Guía de prerrequisitos: la salida de gradle run llega hasta la sección 8
Co-Authored-By: Claude Opus 5 (1M context) <noreply@anthropic.com>
Claude-Session: https://claude.ai/code/session_01L2JuF1iG72koPJkmuRWSzm
</commit_message>
<xml_diff>
--- a/material-de-apoyo/Prerrequisitos_Instalacion_Entorno_Windows.docx
+++ b/material-de-apoyo/Prerrequisitos_Instalacion_Entorno_Windows.docx
@@ -7757,7 +7757,7 @@
         <w:rPr>
           <w:b w:val="0"/>
         </w:rPr>
-        <w:t xml:space="preserve"> compila el proyecto y muestra en pantalla los ejemplos de la clase, cada uno con un título entre signos igual (del 1. Variables y tipos de datos al 7. Polimorfismo: metodos sobrecargados). No descarga librerías, así que tarda pocos segundos. En nuestra prueba terminó así (recortada):</w:t>
+        <w:t xml:space="preserve"> compila el proyecto y muestra en pantalla los ejemplos de la clase, cada uno con un título entre signos igual (del 1. Variables y tipos de datos al 8. Polimorfismo: metodos sobrecargados). No descarga librerías, así que tarda pocos segundos. En nuestra prueba terminó así (recortada):</w:t>
       </w:r>
     </w:p>
     <w:tbl>
@@ -7852,7 +7852,7 @@
                 <w:color w:val="1F2933"/>
                 <w:sz w:val="19"/>
               </w:rPr>
-              <w:t>===== 7. Polimorfismo: metodos sobrecargados =====</w:t>
+              <w:t>===== 8. Polimorfismo: metodos sobrecargados =====</w:t>
             </w:r>
           </w:p>
           <w:p>

</xml_diff>